<commit_message>
Refine terminology and manuscript presentation
</commit_message>
<xml_diff>
--- a/paper/manuscript-en.docx
+++ b/paper/manuscript-en.docx
@@ -2048,11 +2048,6 @@
       </w:pPr>
       <w:r>
         <w:t xml:space="preserve">For mobile work, the risk chain should include seven elements.</w:t>
-      </w:r>
-    </w:p>
-    <w:p>
-      <w:r>
-        <w:br w:type="page"/>
       </w:r>
     </w:p>
     <w:p>

</xml_diff>

<commit_message>
Refine AEV Safety roadmap and manuscript workflow table
</commit_message>
<xml_diff>
--- a/paper/manuscript-en.docx
+++ b/paper/manuscript-en.docx
@@ -2,7 +2,7 @@
 <file path=word/document.xml><?xml version="1.0" encoding="utf-8"?>
 <w:document xmlns:w="http://schemas.openxmlformats.org/wordprocessingml/2006/main" xmlns:m="http://schemas.openxmlformats.org/officeDocument/2006/math" xmlns:r="http://schemas.openxmlformats.org/officeDocument/2006/relationships" xmlns:o="urn:schemas-microsoft-com:office:office" xmlns:v="urn:schemas-microsoft-com:vml" xmlns:w10="urn:schemas-microsoft-com:office:word" xmlns:a="http://schemas.openxmlformats.org/drawingml/2006/main" xmlns:pic="http://schemas.openxmlformats.org/drawingml/2006/picture" xmlns:wp="http://schemas.openxmlformats.org/drawingml/2006/wordprocessingDrawing">
   <w:body>
-    <w:bookmarkStart w:id="69" w:name="Xaaf0f420b919168f931c536a2b35494060038c1"/>
+    <w:bookmarkStart w:id="66" w:name="Xaaf0f420b919168f931c536a2b35494060038c1"/>
     <w:p>
       <w:pPr>
         <w:pStyle w:val="Heading1"/>
@@ -151,7 +151,7 @@
         <w:pStyle w:val="FirstParagraph"/>
       </w:pPr>
       <w:r>
-        <w:t xml:space="preserve">Road-vehicle automation safety has developed mature methods for functional safety, Safety of the Intended Functionality, cybersecurity, AI safety, scenario-based testing and safety cases. Autonomous engineering vehicles are moving into batching plants, mines, construction sites, solar farms and other controlled worksites, but their safety assurance evidence remains fragmented across machinery safety, functional safety of control systems, autonomous mining guidance, collision warning standards, adjacent non-road machinery standards, company cases and project-specific operational rules. This paper develops a safety assurance framework for autonomous engineering vehicles as mobile working machine systems. We review road-vehicle safety methods as methodological donors, map existing earth-moving and mining-machine standards, and identify where direct transfer is misleading. We then introduce three concepts: mobile working machine system, worksite and task design conditions, and dynamic moving and working task. The framework links system boundaries, worksite and task conditions, function insufficiencies, trigger conditions, task consequences, testing, operational monitoring and safety cases. Representative wheel-loader, trenching, solar piling and autonomous haulage scenarios are used as structured templates rather than evidence of product maturity. The paper concludes by discussing how the framework extends to lunar and other extreme-environment mobile work.</w:t>
+        <w:t xml:space="preserve">Road-vehicle automation safety has developed mature methods for functional safety, Safety of the Intended Functionality (SOTIF), cybersecurity, AI safety, scenario-based testing and safety cases. Autonomous engineering vehicles are moving into batching plants, mines, construction sites, solar farms and other controlled worksites, but their safety assurance evidence remains fragmented across machinery safety, functional safety of control systems, autonomous mining guidance, collision warning standards, adjacent non-road machinery standards, company cases and project-specific operational rules. This paper develops a safety assurance framework for autonomous engineering vehicles as mobile working machine systems. We review road-vehicle safety methods as methodological donors, map existing earth-moving and mining-machine standards, and identify where direct transfer is misleading. We then introduce three concepts: mobile working machine system, worksite and task design conditions, and dynamic moving and working task. The framework links system boundaries, worksite and task conditions, function insufficiencies, trigger conditions, task consequences, testing, operational monitoring and safety cases. Representative wheel-loader, trenching, solar piling and autonomous haulage scenarios are used as structured templates rather than evidence of product maturity. The paper concludes by discussing how the framework extends to lunar and other extreme-environment mobile work.</w:t>
       </w:r>
     </w:p>
     <w:bookmarkEnd w:id="10"/>
@@ -397,7 +397,7 @@
     </w:p>
     <w:bookmarkEnd w:id="16"/>
     <w:bookmarkEnd w:id="17"/>
-    <w:bookmarkStart w:id="25" w:name="X8303b0af8b3112e11ff589f94f3dbea6659aad0"/>
+    <w:bookmarkStart w:id="22" w:name="X8303b0af8b3112e11ff589f94f3dbea6659aad0"/>
     <w:p>
       <w:pPr>
         <w:pStyle w:val="Heading2"/>
@@ -406,7 +406,7 @@
         <w:t xml:space="preserve">2. Review approach and evidence classification</w:t>
       </w:r>
     </w:p>
-    <w:bookmarkStart w:id="21" w:name="review-type"/>
+    <w:bookmarkStart w:id="18" w:name="review-type"/>
     <w:p>
       <w:pPr>
         <w:pStyle w:val="Heading3"/>
@@ -428,74 +428,315 @@
         <w:pStyle w:val="BodyText"/>
       </w:pPr>
       <w:r>
-        <w:t xml:space="preserve">The review workflow is shown in Figure 1. It begins with a protocol defining scope, topics, inclusion criteria and exclusion criteria. It then identifies sources from standards, databases, industry guidance and public cases. Candidate sources are verified through official pages, DOI records, institutional pages or source-status checks. Materials are screened for relevance, source quality and duplication. Eligibility is then assigned based on full text, official status or verified public pages. Evidence classes are assigned before coding each source by machine type, scenario, WTDC role, DMWT role and claim boundary. Sources are then routed into the main reference set, appendix evidence or background leads. The final synthesis links MWMS, WTDC, DMWT, SOTIF risk chains, testing, operational monitoring and safety cases.</w:t>
-      </w:r>
-    </w:p>
-    <w:p>
-      <w:pPr>
-        <w:pStyle w:val="CaptionedFigure"/>
-      </w:pPr>
-      <w:r>
-        <w:drawing>
-          <wp:inline>
-            <wp:extent cx="5334000" cy="3259666"/>
-            <wp:effectExtent b="0" l="0" r="0" t="0"/>
-            <wp:docPr descr="Figure 1. Review workflow and evidence classification for the systematized scoping review." title="" id="19" name="Picture"/>
-            <a:graphic>
-              <a:graphicData uri="http://schemas.openxmlformats.org/drawingml/2006/picture">
-                <pic:pic>
-                  <pic:nvPicPr>
-                    <pic:cNvPr descr="../figures/AEV-Safety-review-workflow.png" id="20" name="Picture"/>
-                    <pic:cNvPicPr>
-                      <a:picLocks noChangeArrowheads="1" noChangeAspect="1"/>
-                    </pic:cNvPicPr>
-                  </pic:nvPicPr>
-                  <pic:blipFill>
-                    <a:blip r:embed="rId18"/>
-                    <a:stretch>
-                      <a:fillRect/>
-                    </a:stretch>
-                  </pic:blipFill>
-                  <pic:spPr bwMode="auto">
-                    <a:xfrm>
-                      <a:off x="0" y="0"/>
-                      <a:ext cx="5334000" cy="3259666"/>
-                    </a:xfrm>
-                    <a:prstGeom prst="rect">
-                      <a:avLst/>
-                    </a:prstGeom>
-                    <a:noFill/>
-                    <a:ln w="9525">
-                      <a:noFill/>
-                      <a:headEnd/>
-                      <a:tailEnd/>
-                    </a:ln>
-                  </pic:spPr>
-                </pic:pic>
-              </a:graphicData>
-            </a:graphic>
-          </wp:inline>
-        </w:drawing>
-      </w:r>
-    </w:p>
-    <w:p>
-      <w:pPr>
-        <w:pStyle w:val="ImageCaption"/>
-      </w:pPr>
-      <w:r>
-        <w:t xml:space="preserve">Figure 1. Review workflow and evidence classification for the systematized scoping review.</w:t>
-      </w:r>
-    </w:p>
-    <w:p>
-      <w:pPr>
-        <w:pStyle w:val="BodyText"/>
-      </w:pPr>
-      <w:r>
-        <w:t xml:space="preserve">Figure 1. Review workflow and evidence classification for the systematized scoping review.</w:t>
-      </w:r>
-    </w:p>
-    <w:bookmarkEnd w:id="21"/>
-    <w:bookmarkStart w:id="22" w:name="search-and-source-scope"/>
+        <w:t xml:space="preserve">Table 1 summarizes the systematized scoping-review workflow used in this paper. The workflow begins with protocol definition and proceeds through source identification, source verification, screening and eligibility, evidence classification, framework coding and synthesis. Its purpose is not to create a decorative process figure. It is to make the evidence boundary explicit: which materials can support clause-level claims, which can only support standardization-status claims, which can anchor public scenarios, and which should remain future research leads.</w:t>
+      </w:r>
+    </w:p>
+    <w:p>
+      <w:pPr>
+        <w:pStyle w:val="BodyText"/>
+      </w:pPr>
+      <w:r>
+        <w:t xml:space="preserve">Table 1. Review workflow and evidence classification for the systematized scoping review.</w:t>
+      </w:r>
+    </w:p>
+    <w:tbl>
+      <w:tblPr>
+        <w:tblStyle w:val="Table"/>
+        <w:tblW w:type="pct" w:w="5000"/>
+        <w:tblLayout w:type="fixed"/>
+        <w:tblLook w:firstRow="1" w:lastRow="0" w:firstColumn="0" w:lastColumn="0" w:noHBand="0" w:noVBand="0" w:val="0020"/>
+      </w:tblPr>
+      <w:tblGrid>
+        <w:gridCol w:w="2640"/>
+        <w:gridCol w:w="2640"/>
+        <w:gridCol w:w="2640"/>
+      </w:tblGrid>
+      <w:tr>
+        <w:trPr>
+          <w:tblHeader w:val="on"/>
+        </w:trPr>
+        <w:tc>
+          <w:tcPr/>
+          <w:p>
+            <w:pPr>
+              <w:pStyle w:val="Compact"/>
+            </w:pPr>
+            <w:r>
+              <w:t xml:space="preserve">Stage</w:t>
+            </w:r>
+          </w:p>
+        </w:tc>
+        <w:tc>
+          <w:tcPr/>
+          <w:p>
+            <w:pPr>
+              <w:pStyle w:val="Compact"/>
+            </w:pPr>
+            <w:r>
+              <w:t xml:space="preserve">Main action</w:t>
+            </w:r>
+          </w:p>
+        </w:tc>
+        <w:tc>
+          <w:tcPr/>
+          <w:p>
+            <w:pPr>
+              <w:pStyle w:val="Compact"/>
+            </w:pPr>
+            <w:r>
+              <w:t xml:space="preserve">Output and boundary</w:t>
+            </w:r>
+          </w:p>
+        </w:tc>
+      </w:tr>
+      <w:tr>
+        <w:tc>
+          <w:tcPr/>
+          <w:p>
+            <w:pPr>
+              <w:pStyle w:val="Compact"/>
+            </w:pPr>
+            <w:r>
+              <w:t xml:space="preserve">Protocol definition</w:t>
+            </w:r>
+          </w:p>
+        </w:tc>
+        <w:tc>
+          <w:tcPr/>
+          <w:p>
+            <w:pPr>
+              <w:pStyle w:val="Compact"/>
+            </w:pPr>
+            <w:r>
+              <w:t xml:space="preserve">Define scope, topics, inclusion criteria and exclusion criteria</w:t>
+            </w:r>
+          </w:p>
+        </w:tc>
+        <w:tc>
+          <w:tcPr/>
+          <w:p>
+            <w:pPr>
+              <w:pStyle w:val="Compact"/>
+            </w:pPr>
+            <w:r>
+              <w:t xml:space="preserve">Produces a scoping-review protocol, topic list and exclusion rules; not claimed as a full PRISMA systematic review</w:t>
+            </w:r>
+          </w:p>
+        </w:tc>
+      </w:tr>
+      <w:tr>
+        <w:tc>
+          <w:tcPr/>
+          <w:p>
+            <w:pPr>
+              <w:pStyle w:val="Compact"/>
+            </w:pPr>
+            <w:r>
+              <w:t xml:space="preserve">Source identification</w:t>
+            </w:r>
+          </w:p>
+        </w:tc>
+        <w:tc>
+          <w:tcPr/>
+          <w:p>
+            <w:pPr>
+              <w:pStyle w:val="Compact"/>
+            </w:pPr>
+            <w:r>
+              <w:t xml:space="preserve">Identify candidate sources from standards, databases, industry guidance, company pages, public notices and local research notes</w:t>
+            </w:r>
+          </w:p>
+        </w:tc>
+        <w:tc>
+          <w:tcPr/>
+          <w:p>
+            <w:pPr>
+              <w:pStyle w:val="Compact"/>
+            </w:pPr>
+            <w:r>
+              <w:t xml:space="preserve">Produces a candidate-source list and search log; internal material is background input, not public factual proof</w:t>
+            </w:r>
+          </w:p>
+        </w:tc>
+      </w:tr>
+      <w:tr>
+        <w:tc>
+          <w:tcPr/>
+          <w:p>
+            <w:pPr>
+              <w:pStyle w:val="Compact"/>
+            </w:pPr>
+            <w:r>
+              <w:t xml:space="preserve">Source verification</w:t>
+            </w:r>
+          </w:p>
+        </w:tc>
+        <w:tc>
+          <w:tcPr/>
+          <w:p>
+            <w:pPr>
+              <w:pStyle w:val="Compact"/>
+            </w:pPr>
+            <w:r>
+              <w:t xml:space="preserve">Check official pages, DOI records, institutional pages or source-status evidence</w:t>
+            </w:r>
+          </w:p>
+        </w:tc>
+        <w:tc>
+          <w:tcPr/>
+          <w:p>
+            <w:pPr>
+              <w:pStyle w:val="Compact"/>
+            </w:pPr>
+            <w:r>
+              <w:t xml:space="preserve">Produces source-status, access-level and citability records; no clause-level technical requirements are inferred without authorized full text</w:t>
+            </w:r>
+          </w:p>
+        </w:tc>
+      </w:tr>
+      <w:tr>
+        <w:tc>
+          <w:tcPr/>
+          <w:p>
+            <w:pPr>
+              <w:pStyle w:val="Compact"/>
+            </w:pPr>
+            <w:r>
+              <w:t xml:space="preserve">Screening and eligibility</w:t>
+            </w:r>
+          </w:p>
+        </w:tc>
+        <w:tc>
+          <w:tcPr/>
+          <w:p>
+            <w:pPr>
+              <w:pStyle w:val="Compact"/>
+            </w:pPr>
+            <w:r>
+              <w:t xml:space="preserve">Screen for relevance, source quality, duplication, full-text availability and evidentiary responsibility</w:t>
+            </w:r>
+          </w:p>
+        </w:tc>
+        <w:tc>
+          <w:tcPr/>
+          <w:p>
+            <w:pPr>
+              <w:pStyle w:val="Compact"/>
+            </w:pPr>
+            <w:r>
+              <w:t xml:space="preserve">Produces included, excluded or held decisions; drafts, proposal pages and public notices support process claims only</w:t>
+            </w:r>
+          </w:p>
+        </w:tc>
+      </w:tr>
+      <w:tr>
+        <w:tc>
+          <w:tcPr/>
+          <w:p>
+            <w:pPr>
+              <w:pStyle w:val="Compact"/>
+            </w:pPr>
+            <w:r>
+              <w:t xml:space="preserve">Evidence classification</w:t>
+            </w:r>
+          </w:p>
+        </w:tc>
+        <w:tc>
+          <w:tcPr/>
+          <w:p>
+            <w:pPr>
+              <w:pStyle w:val="Compact"/>
+            </w:pPr>
+            <w:r>
+              <w:t xml:space="preserve">Separate authorized text, official status pages, peer-reviewed papers, guidance, company cases and unverified leads</w:t>
+            </w:r>
+          </w:p>
+        </w:tc>
+        <w:tc>
+          <w:tcPr/>
+          <w:p>
+            <w:pPr>
+              <w:pStyle w:val="Compact"/>
+            </w:pPr>
+            <w:r>
+              <w:t xml:space="preserve">Produces evidence classes and claim boundaries; public pages are not presented as safety certification, customer acceptance or operational-performance proof</w:t>
+            </w:r>
+          </w:p>
+        </w:tc>
+      </w:tr>
+      <w:tr>
+        <w:tc>
+          <w:tcPr/>
+          <w:p>
+            <w:pPr>
+              <w:pStyle w:val="Compact"/>
+            </w:pPr>
+            <w:r>
+              <w:t xml:space="preserve">Framework coding</w:t>
+            </w:r>
+          </w:p>
+        </w:tc>
+        <w:tc>
+          <w:tcPr/>
+          <w:p>
+            <w:pPr>
+              <w:pStyle w:val="Compact"/>
+            </w:pPr>
+            <w:r>
+              <w:t xml:space="preserve">Code by machine type, scenario, MWMS, WTDC, DMWT and safety-case boundary</w:t>
+            </w:r>
+          </w:p>
+        </w:tc>
+        <w:tc>
+          <w:tcPr/>
+          <w:p>
+            <w:pPr>
+              <w:pStyle w:val="Compact"/>
+            </w:pPr>
+            <w:r>
+              <w:t xml:space="preserve">Produces standards maps, scenario templates, risk-chain fields and evidence fields; no single case is generalized into an industry conclusion</w:t>
+            </w:r>
+          </w:p>
+        </w:tc>
+      </w:tr>
+      <w:tr>
+        <w:tc>
+          <w:tcPr/>
+          <w:p>
+            <w:pPr>
+              <w:pStyle w:val="Compact"/>
+            </w:pPr>
+            <w:r>
+              <w:t xml:space="preserve">Synthesis output</w:t>
+            </w:r>
+          </w:p>
+        </w:tc>
+        <w:tc>
+          <w:tcPr/>
+          <w:p>
+            <w:pPr>
+              <w:pStyle w:val="Compact"/>
+            </w:pPr>
+            <w:r>
+              <w:t xml:space="preserve">Synthesize MWMS, WTDC, DMWT, SOTIF-oriented risk chains, testing, operational monitoring and safety cases</w:t>
+            </w:r>
+          </w:p>
+        </w:tc>
+        <w:tc>
+          <w:tcPr/>
+          <w:p>
+            <w:pPr>
+              <w:pStyle w:val="Compact"/>
+            </w:pPr>
+            <w:r>
+              <w:t xml:space="preserve">Produces the paper framework, testing matrix, standardization opportunities and engineering-deployment task list; not a replacement for authorized standards, formal test reports or enterprise safety cases</w:t>
+            </w:r>
+          </w:p>
+        </w:tc>
+      </w:tr>
+    </w:tbl>
+    <w:bookmarkEnd w:id="18"/>
+    <w:bookmarkStart w:id="19" w:name="search-and-source-scope"/>
     <w:p>
       <w:pPr>
         <w:pStyle w:val="Heading3"/>
@@ -528,8 +769,8 @@
         <w:t xml:space="preserve">The initial search execution recorded 16 query records, including Crossref API searches and arXiv API attempts. Sixteen candidate sources were extracted, eleven were page-verified or metadata-reviewed, eleven received screening decisions, four advanced to full-text prescreening, three received full-text excerpt cards, and three were migrated into the main reference library. The current main BibTeX seed contains 60 entries after candidate migration. These counts are used as a traceable scoping-flow draft, not as a final PRISMA flow diagram.</w:t>
       </w:r>
     </w:p>
-    <w:bookmarkEnd w:id="22"/>
-    <w:bookmarkStart w:id="23" w:name="inclusion-and-exclusion-criteria"/>
+    <w:bookmarkEnd w:id="19"/>
+    <w:bookmarkStart w:id="20" w:name="inclusion-and-exclusion-criteria"/>
     <w:p>
       <w:pPr>
         <w:pStyle w:val="Heading3"/>
@@ -554,8 +795,8 @@
         <w:t xml:space="preserve">Sources were excluded or held when they discussed road-vehicle algorithms without transferable relevance to engineering-vehicle safety assurance; discussed general robotics or SLAM without relation to engineering vehicles, construction, mining, work equipment, site safety or extreme environments; lacked traceable source information; or made strong marketing claims without official or verifiable backing. Draft standards, public notices, proposal pages, FDIS, PRF and DIS materials were used only for standardization-process claims, not as final technical requirements.</w:t>
       </w:r>
     </w:p>
-    <w:bookmarkEnd w:id="23"/>
-    <w:bookmarkStart w:id="24" w:name="evidence-classes-and-claim-boundaries"/>
+    <w:bookmarkEnd w:id="20"/>
+    <w:bookmarkStart w:id="21" w:name="evidence-classes-and-claim-boundaries"/>
     <w:p>
       <w:pPr>
         <w:pStyle w:val="Heading3"/>
@@ -577,7 +818,7 @@
         <w:pStyle w:val="BodyText"/>
       </w:pPr>
       <w:r>
-        <w:t xml:space="preserve">Table 1. Evidence classes and claim boundaries for source use.</w:t>
+        <w:t xml:space="preserve">Table 2. Evidence classes and claim boundaries for source use.</w:t>
       </w:r>
     </w:p>
     <w:tbl>
@@ -1111,24 +1352,190 @@
         <w:t xml:space="preserve">This classification is central to the manuscript. A company page can anchor a wheel-loader or solar-piling scenario, but it cannot prove safety certification, customer acceptance, operational KPI or a complete safety case. A peer-reviewed wheel-loader loading paper can support task variables, material interaction and performance measures, but it cannot prove product safety maturity. A standard status page can confirm a standard project or publication status, but it cannot support clause-level interpretation without authorized text. Industry guidance can support operational safety topics, but it should not be presented as a binding standard unless that status is independently confirmed.</w:t>
       </w:r>
     </w:p>
+    <w:bookmarkEnd w:id="21"/>
+    <w:bookmarkEnd w:id="22"/>
+    <w:bookmarkStart w:id="29" w:name="X5ba7174744f3fb336918a8b4ab90565f06cccdf"/>
+    <w:p>
+      <w:pPr>
+        <w:pStyle w:val="Heading2"/>
+      </w:pPr>
+      <w:r>
+        <w:t xml:space="preserve">3. Road-vehicle safety methods as methodological donors</w:t>
+      </w:r>
+    </w:p>
+    <w:bookmarkStart w:id="23" w:name="X085b9d293fcd543127088eef367e8be83e1dd0c"/>
+    <w:p>
+      <w:pPr>
+        <w:pStyle w:val="Heading3"/>
+      </w:pPr>
+      <w:r>
+        <w:t xml:space="preserve">3.1 Passive safety, active safety and automated-driving safety</w:t>
+      </w:r>
+    </w:p>
+    <w:p>
+      <w:pPr>
+        <w:pStyle w:val="FirstParagraph"/>
+      </w:pPr>
+      <w:r>
+        <w:t xml:space="preserve">Traditional vehicle safety can be described through passive safety and active safety. Passive safety reduces harm after a crash, while active safety seeks to avoid or mitigate crashes before they occur. Automated driving changes the structure of the problem because the system takes over perception, prediction, planning and control within a defined operating condition. The safety question becomes whether the system can behave acceptably inside its declared boundary and fail or hand over safely outside that boundary.</w:t>
+      </w:r>
+    </w:p>
+    <w:p>
+      <w:pPr>
+        <w:pStyle w:val="BodyText"/>
+      </w:pPr>
+      <w:r>
+        <w:t xml:space="preserve">Engineering vehicles need this layered thinking, but the consequences must be rewritten. Personnel injury remains the highest-priority hazard. Yet unmanned worksites also make asset damage, infrastructure damage, underground utility damage, production interruption, schedule delay, task-quality failure, environmental harm and recovery capability central to the safety argument. A low-speed collision with a hopper, pile, trench wall or underground utility can be operationally severe. A task-quality error can create downstream hazards even if no immediate collision occurs.</w:t>
+      </w:r>
+    </w:p>
+    <w:bookmarkEnd w:id="23"/>
+    <w:bookmarkStart w:id="24" w:name="functional-safety"/>
+    <w:p>
+      <w:pPr>
+        <w:pStyle w:val="Heading3"/>
+      </w:pPr>
+      <w:r>
+        <w:t xml:space="preserve">3.2 Functional safety</w:t>
+      </w:r>
+    </w:p>
+    <w:p>
+      <w:pPr>
+        <w:pStyle w:val="FirstParagraph"/>
+      </w:pPr>
+      <w:r>
+        <w:t xml:space="preserve">Functional safety provides a lifecycle framework for hazards caused by malfunctioning behaviour of safety-related electrical and electronic systems [1]. For engineering vehicles, the transferable value is not the direct use of road-vehicle ASIL labels. The transferable value is the structure: define the item or system, identify hazards, assess risk, define safety goals, decompose safety requirements, implement technical safety concepts and verify evidence through lifecycle activities.</w:t>
+      </w:r>
+    </w:p>
+    <w:p>
+      <w:pPr>
+        <w:pStyle w:val="BodyText"/>
+      </w:pPr>
+      <w:r>
+        <w:t xml:space="preserve">Engineering machinery should be interpreted through machinery-specific functional-safety concepts where applicable. ISO 19014 uses machinery-control-system language, including machine control system safety analysis and machine performance levels, rather than road-vehicle ASIL [8, 12, 13, 14]. This distinction matters. Wheel loaders, excavators and autonomous haulage trucks have steering, braking, hydraulic actuation, work equipment, emergency stop, remote operation and control-system interfaces that require functional-safety analysis, but the severity, exposure and controllability assumptions are not those of passenger cars in public traffic.</w:t>
+      </w:r>
+    </w:p>
     <w:bookmarkEnd w:id="24"/>
+    <w:bookmarkStart w:id="25" w:name="safety-of-the-intended-functionality"/>
+    <w:p>
+      <w:pPr>
+        <w:pStyle w:val="Heading3"/>
+      </w:pPr>
+      <w:r>
+        <w:t xml:space="preserve">3.3 Safety of the Intended Functionality</w:t>
+      </w:r>
+    </w:p>
+    <w:p>
+      <w:pPr>
+        <w:pStyle w:val="FirstParagraph"/>
+      </w:pPr>
+      <w:r>
+        <w:t xml:space="preserve">Safety of the Intended Functionality addresses unreasonable risk caused by intended-function insufficiencies or reasonably foreseeable misuse in the absence of system faults [2]. Its value for engineering vehicles is direct but must be extended. In road vehicles, typical SOTIF concerns include perception limitations under rain, fog, glare, occlusion, unusual objects or construction zones. In engineering vehicles, similar insufficiencies occur in different physical forms: stockpile boundary recognition, bucket load estimation, trench geometry estimation, underground-utility map accuracy, dust and mud visibility, tool-pose estimation, material-state recognition and work-quality judgement.</w:t>
+      </w:r>
+    </w:p>
+    <w:p>
+      <w:pPr>
+        <w:pStyle w:val="BodyText"/>
+      </w:pPr>
+      <w:r>
+        <w:t xml:space="preserve">The SOTIF risk chain for engineering vehicles should therefore include function intention, function insufficiency, trigger condition, hazardous event, task consequence, mitigation and evidence. A loader may underperform not because a component has failed, but because unknown material, dust or stockpile evolution causes insufficient loading behaviour. An excavator may be unsafe not because its actuator fails, but because map-to-site alignment, soil condition or underground-utility uncertainty triggers an inadequate digging plan. A piling robot may create unacceptable downstream risk through positioning or verticality errors even when no collision occurs.</w:t>
+      </w:r>
+    </w:p>
     <w:bookmarkEnd w:id="25"/>
-    <w:bookmarkStart w:id="32" w:name="X5ba7174744f3fb336918a8b4ab90565f06cccdf"/>
+    <w:bookmarkStart w:id="26" w:name="cybersecurity-and-ai-safety"/>
+    <w:p>
+      <w:pPr>
+        <w:pStyle w:val="Heading3"/>
+      </w:pPr>
+      <w:r>
+        <w:t xml:space="preserve">3.4 Cybersecurity and AI safety</w:t>
+      </w:r>
+    </w:p>
+    <w:p>
+      <w:pPr>
+        <w:pStyle w:val="FirstParagraph"/>
+      </w:pPr>
+      <w:r>
+        <w:t xml:space="preserve">Cybersecurity engineering is increasingly safety-relevant for engineering vehicles. Remote operation, cloud dispatching, wireless networks, GNSS/RTK, electronic fences, over-the-air updates, remote emergency stop, fleet coordination and site data reporting all create cyber-physical dependencies. ISO/SAE 21434 is useful as a donor framework because it structures assets, threats, attack paths, risk treatment, cybersecurity requirements, verification and monitoring [3]. In autonomous mining, the safety relevance of wireless communication, positioning, remote control and cybersecurity has already been discussed in the AHS literature [11].</w:t>
+      </w:r>
+    </w:p>
+    <w:p>
+      <w:pPr>
+        <w:pStyle w:val="BodyText"/>
+      </w:pPr>
+      <w:r>
+        <w:t xml:space="preserve">AI safety is also broader than object detection. Autonomous engineering vehicles may use AI for terrain traversability, stockpile perception, material recognition, work-tool control, task planning, safety monitoring and report generation. ISO/PAS 8800 provides a road-vehicle AI safety reference point, but engineering vehicles require additional attention to worksite distribution shift, material variation, attachment state, work-tool dynamics and task-quality verification [4].</w:t>
+      </w:r>
+    </w:p>
+    <w:bookmarkEnd w:id="26"/>
+    <w:bookmarkStart w:id="27" w:name="scenario-based-testing-and-safety-cases"/>
+    <w:p>
+      <w:pPr>
+        <w:pStyle w:val="Heading3"/>
+      </w:pPr>
+      <w:r>
+        <w:t xml:space="preserve">3.5 Scenario-based testing and safety cases</w:t>
+      </w:r>
+    </w:p>
+    <w:p>
+      <w:pPr>
+        <w:pStyle w:val="FirstParagraph"/>
+      </w:pPr>
+      <w:r>
+        <w:t xml:space="preserve">Scenario-based testing helps move the discussion beyond mileage or operating hours [5]. For engineering vehicles, the corresponding question is not only how many hours the machine has operated, but which worksite conditions, task conditions, material states, tool states, supervision modes and abnormal events have been covered. Road-vehicle scenario layers are useful as a structuring idea, but the layers must be rewritten for worksite and task design conditions [25].</w:t>
+      </w:r>
+    </w:p>
+    <w:p>
+      <w:pPr>
+        <w:pStyle w:val="BodyText"/>
+      </w:pPr>
+      <w:r>
+        <w:t xml:space="preserve">Safety cases are needed because engineering-vehicle autonomy is a multi-party system problem. A single test result cannot establish safety for a machine, attachment, remote system, site infrastructure, supervision process, maintenance process and operating organization. UL 4600 is useful as a donor for claim-argument-evidence reasoning, even when the manuscript does not claim certification under that standard [6]. For autonomous engineering vehicles, a safety case should separate product assumptions from operational assumptions and show how evidence is maintained during changes in site, material, software, sensor configuration and supervision mode.</w:t>
+      </w:r>
+    </w:p>
+    <w:bookmarkEnd w:id="27"/>
+    <w:bookmarkStart w:id="28" w:name="X157ea020746681131f79981488910e6b5cbab99"/>
+    <w:p>
+      <w:pPr>
+        <w:pStyle w:val="Heading3"/>
+      </w:pPr>
+      <w:r>
+        <w:t xml:space="preserve">3.6 Driving automation levels and scenario layers</w:t>
+      </w:r>
+    </w:p>
+    <w:p>
+      <w:pPr>
+        <w:pStyle w:val="FirstParagraph"/>
+      </w:pPr>
+      <w:r>
+        <w:t xml:space="preserve">SAE J3016 provides a taxonomy for driving automation in on-road motor vehicles [24]. It is informative but insufficient for engineering vehicles. A machine may be highly automated in site navigation, partially automated in work-tool operation and still dependent on remote confirmation for abnormal situations. Calling such a system simply L4 or L5 would hide the most important safety questions.</w:t>
+      </w:r>
+    </w:p>
+    <w:p>
+      <w:pPr>
+        <w:pStyle w:val="BodyText"/>
+      </w:pPr>
+      <w:r>
+        <w:t xml:space="preserve">This paper therefore treats automation as a multi-dimensional property. Mobility automation, work-equipment automation and supervision mode should be described separately. A valid statement is not that a machine is L4, but that a specific mobile working machine system performs a specific dynamic moving and working task under specified worksite and task design conditions with specified supervision and fallback assumptions.</w:t>
+      </w:r>
+    </w:p>
+    <w:bookmarkEnd w:id="28"/>
+    <w:bookmarkEnd w:id="29"/>
+    <w:bookmarkStart w:id="34" w:name="Xd54e284332f70a5ee7d6026d5c629c39a0e25c2"/>
     <w:p>
       <w:pPr>
         <w:pStyle w:val="Heading2"/>
       </w:pPr>
       <w:r>
-        <w:t xml:space="preserve">3. Road-vehicle safety methods as methodological donors</w:t>
-      </w:r>
-    </w:p>
-    <w:bookmarkStart w:id="26" w:name="X085b9d293fcd543127088eef367e8be83e1dd0c"/>
+        <w:t xml:space="preserve">4. Existing standards and guidance for autonomous engineering vehicles</w:t>
+      </w:r>
+    </w:p>
+    <w:bookmarkStart w:id="30" w:name="a-layered-standards-and-guidance-map"/>
     <w:p>
       <w:pPr>
         <w:pStyle w:val="Heading3"/>
       </w:pPr>
       <w:r>
-        <w:t xml:space="preserve">3.1 Passive safety, active safety and automated-driving safety</w:t>
+        <w:t xml:space="preserve">4.1 A layered standards and guidance map</w:t>
       </w:r>
     </w:p>
     <w:p>
@@ -1136,25 +1543,73 @@
         <w:pStyle w:val="FirstParagraph"/>
       </w:pPr>
       <w:r>
-        <w:t xml:space="preserve">Traditional vehicle safety can be described through passive safety and active safety. Passive safety reduces harm after a crash, while active safety seeks to avoid or mitigate crashes before they occur. Automated driving changes the structure of the problem because the system takes over perception, prediction, planning and control within a defined operating condition. The safety question becomes whether the system can behave acceptably inside its declared boundary and fail or hand over safely outside that boundary.</w:t>
-      </w:r>
-    </w:p>
-    <w:p>
-      <w:pPr>
-        <w:pStyle w:val="BodyText"/>
-      </w:pPr>
-      <w:r>
-        <w:t xml:space="preserve">Engineering vehicles need this layered thinking, but the consequences must be rewritten. Personnel injury remains the highest-priority hazard. Yet unmanned worksites also make asset damage, infrastructure damage, underground utility damage, production interruption, schedule delay, task-quality failure, environmental harm and recovery capability central to the safety argument. A low-speed collision with a hopper, pile, trench wall or underground utility can be operationally severe. A task-quality error can create downstream hazards even if no immediate collision occurs.</w:t>
-      </w:r>
-    </w:p>
-    <w:bookmarkEnd w:id="26"/>
-    <w:bookmarkStart w:id="27" w:name="functional-safety"/>
+        <w:t xml:space="preserve">Existing standards and guidance can be organized into seven layers.</w:t>
+      </w:r>
+    </w:p>
+    <w:p>
+      <w:pPr>
+        <w:pStyle w:val="BodyText"/>
+      </w:pPr>
+      <w:r>
+        <w:t xml:space="preserve">The first layer is the object and basic machinery-safety foundation. Earth-moving machinery type definitions and traditional machinery safety requirements define what machines are and what general safety foundation they have. This layer is necessary but not sufficient for autonomous work.</w:t>
+      </w:r>
+    </w:p>
+    <w:p>
+      <w:pPr>
+        <w:pStyle w:val="BodyText"/>
+      </w:pPr>
+      <w:r>
+        <w:t xml:space="preserve">The second layer is functional safety of control systems for earth-moving machinery. ISO 19014 is the central reference for safety-related parts of control systems in this domain [8, 12, 13, 14]. Revision-status records such as FDIS entries can support standardization-process discussion, but they should not replace current published standards until official publication is verified [26, 27, 28, 29].</w:t>
+      </w:r>
+    </w:p>
+    <w:p>
+      <w:pPr>
+        <w:pStyle w:val="BodyText"/>
+      </w:pPr>
+      <w:r>
+        <w:t xml:space="preserve">The third layer is autonomous and semi-autonomous machine systems. ISO 17757 and related national or local standards provide a system-safety entry point for autonomous earth-moving or mining machinery [7, 19]. Their significance is that they treat autonomy as a system-safety issue rather than only a vehicle-control issue. However, this paper does not interpret them as engineering-vehicle SOTIF standards.</w:t>
+      </w:r>
+    </w:p>
+    <w:p>
+      <w:pPr>
+        <w:pStyle w:val="BodyText"/>
+      </w:pPr>
+      <w:r>
+        <w:t xml:space="preserve">The fourth layer is remote operation. ISO 15817 is relevant to remote operator control systems [15]. It is important for remote driving and remote supervision, but it cannot alone address full autonomy, AI insufficiency or multi-party operational responsibility.</w:t>
+      </w:r>
+    </w:p>
+    <w:p>
+      <w:pPr>
+        <w:pStyle w:val="BodyText"/>
+      </w:pPr>
+      <w:r>
+        <w:t xml:space="preserve">The fifth layer is collision warning and collision avoidance. ISO 21815 provides an important basis for collision warning and collision avoidance systems on earth-moving machinery [9, 16]. Draft or approval-stage documents can signal standardization progress for additional motion forms, but they cannot be treated as final published standards without verification [30, 31].</w:t>
+      </w:r>
+    </w:p>
+    <w:p>
+      <w:pPr>
+        <w:pStyle w:val="BodyText"/>
+      </w:pPr>
+      <w:r>
+        <w:t xml:space="preserve">The sixth layer is adjacent non-road mobile machinery, including underground mining machines and autonomous agricultural machinery. ISO 18497-1:2024 is especially useful as a comparison point because it addresses partially automated, semi-autonomous and autonomous functions in agricultural machinery and tractors, while explicitly remaining outside forestry applications and public-road operation [60]. These domains provide relevant safety lessons because they involve constrained worksites, non-road mobility, remote operation, environmental variability and work functions. Their direct applicability still requires task-by-task assessment.</w:t>
+      </w:r>
+    </w:p>
+    <w:p>
+      <w:pPr>
+        <w:pStyle w:val="BodyText"/>
+      </w:pPr>
+      <w:r>
+        <w:t xml:space="preserve">The seventh layer is industry guidance and national or group-standard dynamics. GMG guidance for autonomous mining systems, implementation guidance, functional-safety white papers, Chinese standards for autonomous or unmanned mining transport, and adjacent robot SOTIF project information show that system safety, operational readiness, change management, maintenance, training, hazard logs, safety cases, ODD declaration, scenario classification and risk-chain reasoning are becoming central to AI-enabled mobile work [10, 17, 32, 18, 20, 21, 22, 23].</w:t>
+      </w:r>
+    </w:p>
+    <w:bookmarkEnd w:id="30"/>
+    <w:bookmarkStart w:id="31" w:name="X817e235d6f4a5c44c75543dcea0d4624c3b6f72"/>
     <w:p>
       <w:pPr>
         <w:pStyle w:val="Heading3"/>
       </w:pPr>
       <w:r>
-        <w:t xml:space="preserve">3.2 Functional safety</w:t>
+        <w:t xml:space="preserve">4.2 What the current standards map can and cannot prove</w:t>
       </w:r>
     </w:p>
     <w:p>
@@ -1162,25 +1617,49 @@
         <w:pStyle w:val="FirstParagraph"/>
       </w:pPr>
       <w:r>
-        <w:t xml:space="preserve">Functional safety provides a lifecycle framework for hazards caused by malfunctioning behaviour of safety-related electrical and electronic systems [1]. For engineering vehicles, the transferable value is not the direct use of road-vehicle ASIL labels. The transferable value is the structure: define the item or system, identify hazards, assess risk, define safety goals, decompose safety requirements, implement technical safety concepts and verify evidence through lifecycle activities.</w:t>
-      </w:r>
-    </w:p>
-    <w:p>
-      <w:pPr>
-        <w:pStyle w:val="BodyText"/>
-      </w:pPr>
-      <w:r>
-        <w:t xml:space="preserve">Engineering machinery should be interpreted through machinery-specific functional-safety concepts where applicable. ISO 19014 uses machinery-control-system language, including machine control system safety analysis and machine performance levels, rather than road-vehicle ASIL [8, 12, 13, 14]. This distinction matters. Wheel loaders, excavators and autonomous haulage trucks have steering, braking, hydraulic actuation, work equipment, emergency stop, remote operation and control-system interfaces that require functional-safety analysis, but the severity, exposure and controllability assumptions are not those of passenger cars in public traffic.</w:t>
-      </w:r>
-    </w:p>
-    <w:bookmarkEnd w:id="27"/>
-    <w:bookmarkStart w:id="28" w:name="safety-of-the-intended-functionality"/>
+        <w:t xml:space="preserve">The standards map supports three claims.</w:t>
+      </w:r>
+    </w:p>
+    <w:p>
+      <w:pPr>
+        <w:pStyle w:val="BodyText"/>
+      </w:pPr>
+      <w:r>
+        <w:t xml:space="preserve">First, autonomous engineering-vehicle safety is not a blank field. There are existing standards and guidance for machinery safety, control-system functional safety, autonomous machine systems, remote operation, collision warning, collision avoidance and autonomous mining operations.</w:t>
+      </w:r>
+    </w:p>
+    <w:p>
+      <w:pPr>
+        <w:pStyle w:val="BodyText"/>
+      </w:pPr>
+      <w:r>
+        <w:t xml:space="preserve">Second, existing materials are fragmented across object definitions, control-system safety, remote operation, collision avoidance, mining guidance, national standards, group standards, adjacent non-road automation standards and adjacent robot SOTIF project information. The robot SOTIF project helps show that ODD, scenario, triggering-condition, functional-insufficiency, hazard-chain and mitigation concepts are moving into mobile-robot standardization. ISO 18497-1 shows a parallel non-road route in which partially automated, semi-autonomous and autonomous machine functions are handled through machine design principles, vocabulary, safe working information and intended-use boundaries [60]. Neither source provides a direct compliance template for engineering vehicles. The current materials still do not provide a unified evidence chain for AI-enabled mobile work across machine, work equipment, material, site, task quality, remote supervision and operational monitoring.</w:t>
+      </w:r>
+    </w:p>
+    <w:p>
+      <w:pPr>
+        <w:pStyle w:val="BodyText"/>
+      </w:pPr>
+      <w:r>
+        <w:t xml:space="preserve">Third, road-vehicle methods can help organize the missing evidence chain, but they cannot serve as direct compliance templates. The contribution is methodological integration, not a claim that one road-vehicle standard solves engineering-vehicle autonomy.</w:t>
+      </w:r>
+    </w:p>
+    <w:p>
+      <w:pPr>
+        <w:pStyle w:val="BodyText"/>
+      </w:pPr>
+      <w:r>
+        <w:t xml:space="preserve">The map cannot prove clause-level requirements where only official status pages or previews are available. It cannot prove that a company product has achieved independent safety assurance. It cannot prove operational KPI, customer acceptance or complete safety cases from public product pages. It also cannot use space-mining or lunar-resource materials as evidence for current terrestrial engineering-vehicle standards.</w:t>
+      </w:r>
+    </w:p>
+    <w:bookmarkEnd w:id="31"/>
+    <w:bookmarkStart w:id="32" w:name="X0b56bf9993ab5d527c4aad06e4f15b3665be254"/>
     <w:p>
       <w:pPr>
         <w:pStyle w:val="Heading3"/>
       </w:pPr>
       <w:r>
-        <w:t xml:space="preserve">3.3 Safety of the Intended Functionality</w:t>
+        <w:t xml:space="preserve">4.3 Safety evaluation objects shift from injury alone to work consequences</w:t>
       </w:r>
     </w:p>
     <w:p>
@@ -1188,25 +1667,33 @@
         <w:pStyle w:val="FirstParagraph"/>
       </w:pPr>
       <w:r>
-        <w:t xml:space="preserve">Safety of the Intended Functionality addresses unreasonable risk caused by intended-function insufficiencies or reasonably foreseeable misuse in the absence of system faults [2]. Its value for engineering vehicles is direct but must be extended. In road vehicles, typical SOTIF concerns include perception limitations under rain, fog, glare, occlusion, unusual objects or construction zones. In engineering vehicles, similar insufficiencies occur in different physical forms: stockpile boundary recognition, bucket load estimation, trench geometry estimation, underground-utility map accuracy, dust and mud visibility, tool-pose estimation, material-state recognition and work-quality judgement.</w:t>
-      </w:r>
-    </w:p>
-    <w:p>
-      <w:pPr>
-        <w:pStyle w:val="BodyText"/>
-      </w:pPr>
-      <w:r>
-        <w:t xml:space="preserve">The SOTIF risk chain for engineering vehicles should therefore include function intention, function insufficiency, trigger condition, hazardous event, task consequence, mitigation and evidence. A loader may underperform not because a component has failed, but because unknown material, dust or stockpile evolution causes insufficient loading behaviour. An excavator may be unsafe not because its actuator fails, but because map-to-site alignment, soil condition or underground-utility uncertainty triggers an inadequate digging plan. A piling robot may create unacceptable downstream risk through positioning or verticality errors even when no collision occurs.</w:t>
-      </w:r>
-    </w:p>
-    <w:bookmarkEnd w:id="28"/>
-    <w:bookmarkStart w:id="29" w:name="cybersecurity-and-ai-safety"/>
+        <w:t xml:space="preserve">Personnel safety remains the highest-priority concern. Controlled worksites still include maintenance workers, supervisors, other machine operators, visitors and people who may enter restricted areas. Yet autonomous engineering vehicles require a broader consequence model. Property damage, infrastructure damage, underground utility damage, production interruption, schedule delay, rework, task-quality failure, environmental harm and recovery capability must be considered.</w:t>
+      </w:r>
+    </w:p>
+    <w:p>
+      <w:pPr>
+        <w:pStyle w:val="BodyText"/>
+      </w:pPr>
+      <w:r>
+        <w:t xml:space="preserve">This shift matters for evaluation. A wheel loader may produce unacceptable risk through repeated misloading even without collision. An excavator may produce unacceptable risk through systematic trench-depth error, slope instability or utility encroachment. A solar piling system may create downstream structural and construction risks through position or verticality errors. Autonomous haulage may create safety-relevant risk through communication disruption, localization uncertainty, remote-control failure or poor interaction between manual and autonomous traffic.</w:t>
+      </w:r>
+    </w:p>
+    <w:p>
+      <w:pPr>
+        <w:pStyle w:val="BodyText"/>
+      </w:pPr>
+      <w:r>
+        <w:t xml:space="preserve">The safety assurance target is therefore not only to avoid immediate impact. It is to show that a mobile working machine system can safely perform bounded work tasks, maintain task quality, monitor its assumptions and recover from abnormal states.</w:t>
+      </w:r>
+    </w:p>
+    <w:bookmarkEnd w:id="32"/>
+    <w:bookmarkStart w:id="33" w:name="Xb3c6be02d3755625a207a1cd85da7537cd46d26"/>
     <w:p>
       <w:pPr>
         <w:pStyle w:val="Heading3"/>
       </w:pPr>
       <w:r>
-        <w:t xml:space="preserve">3.4 Cybersecurity and AI safety</w:t>
+        <w:t xml:space="preserve">4.4 Implication for the remainder of the paper</w:t>
       </w:r>
     </w:p>
     <w:p>
@@ -1214,25 +1701,35 @@
         <w:pStyle w:val="FirstParagraph"/>
       </w:pPr>
       <w:r>
-        <w:t xml:space="preserve">Cybersecurity engineering is increasingly safety-relevant for engineering vehicles. Remote operation, cloud dispatching, wireless networks, GNSS/RTK, electronic fences, over-the-air updates, remote emergency stop, fleet coordination and site data reporting all create cyber-physical dependencies. ISO/SAE 21434 is useful as a donor framework because it structures assets, threats, attack paths, risk treatment, cybersecurity requirements, verification and monitoring [3]. In autonomous mining, the safety relevance of wireless communication, positioning, remote control and cybersecurity has already been discussed in the AHS literature [11].</w:t>
-      </w:r>
-    </w:p>
-    <w:p>
-      <w:pPr>
-        <w:pStyle w:val="BodyText"/>
-      </w:pPr>
-      <w:r>
-        <w:t xml:space="preserve">AI safety is also broader than object detection. Autonomous engineering vehicles may use AI for terrain traversability, stockpile perception, material recognition, work-tool control, task planning, safety monitoring and report generation. ISO/PAS 8800 provides a road-vehicle AI safety reference point, but engineering vehicles require additional attention to worksite distribution shift, material variation, attachment state, work-tool dynamics and task-quality verification [4].</w:t>
-      </w:r>
-    </w:p>
-    <w:bookmarkEnd w:id="29"/>
-    <w:bookmarkStart w:id="30" w:name="scenario-based-testing-and-safety-cases"/>
+        <w:t xml:space="preserve">The remainder of the paper develops this standards map into a safety assurance framework. Section 5 will define MWMS, WTDC and DMWT as the three conceptual anchors. Section 6 will link these concepts to a SOTIF-oriented risk chain, scenario testing, operational monitoring and safety cases. Section 7 will use representative scenarios as templates for evidence collection, without treating public company pages as validation samples. Section 8 will discuss transfer limits, standardization gaps and the extreme-environment extension to lunar resource operations and space mining.</w:t>
+      </w:r>
+    </w:p>
+    <w:p>
+      <w:pPr>
+        <w:pStyle w:val="BodyText"/>
+      </w:pPr>
+      <w:r>
+        <w:t xml:space="preserve">The central argument is that autonomous engineering vehicles require a safety assurance language that can connect road-vehicle safety methods, machinery standards, field robotics, worksite operations and future physical AI deployment.</w:t>
+      </w:r>
+    </w:p>
+    <w:bookmarkEnd w:id="33"/>
+    <w:bookmarkEnd w:id="34"/>
+    <w:bookmarkStart w:id="41" w:name="X72ee2e29f79da33b3873dfde6f79084655d6d88"/>
+    <w:p>
+      <w:pPr>
+        <w:pStyle w:val="Heading2"/>
+      </w:pPr>
+      <w:r>
+        <w:t xml:space="preserve">5. Conceptual migration: MWMS, WTDC, DMWT and SOTIF-oriented risk chains</w:t>
+      </w:r>
+    </w:p>
+    <w:bookmarkStart w:id="35" w:name="Xb229ff994e9a7c216b4f60a2ab3bbd05481f5b6"/>
     <w:p>
       <w:pPr>
         <w:pStyle w:val="Heading3"/>
       </w:pPr>
       <w:r>
-        <w:t xml:space="preserve">3.5 Scenario-based testing and safety cases</w:t>
+        <w:t xml:space="preserve">5.1 From vehicle item to mobile working machine system</w:t>
       </w:r>
     </w:p>
     <w:p>
@@ -1240,25 +1737,41 @@
         <w:pStyle w:val="FirstParagraph"/>
       </w:pPr>
       <w:r>
-        <w:t xml:space="preserve">Scenario-based testing helps move the discussion beyond mileage or operating hours [5]. For engineering vehicles, the corresponding question is not only how many hours the machine has operated, but which worksite conditions, task conditions, material states, tool states, supervision modes and abnormal events have been covered. Road-vehicle scenario layers are useful as a structuring idea, but the layers must be rewritten for worksite and task design conditions [25].</w:t>
-      </w:r>
-    </w:p>
-    <w:p>
-      <w:pPr>
-        <w:pStyle w:val="BodyText"/>
-      </w:pPr>
-      <w:r>
-        <w:t xml:space="preserve">Safety cases are needed because engineering-vehicle autonomy is a multi-party system problem. A single test result cannot establish safety for a machine, attachment, remote system, site infrastructure, supervision process, maintenance process and operating organization. UL 4600 is useful as a donor for claim-argument-evidence reasoning, even when the manuscript does not claim certification under that standard [6]. For autonomous engineering vehicles, a safety case should separate product assumptions from operational assumptions and show how evidence is maintained during changes in site, material, software, sensor configuration and supervision mode.</w:t>
-      </w:r>
-    </w:p>
-    <w:bookmarkEnd w:id="30"/>
-    <w:bookmarkStart w:id="31" w:name="X157ea020746681131f79981488910e6b5cbab99"/>
+        <w:t xml:space="preserve">Road-vehicle safety engineering often begins with an item definition. For autonomous engineering vehicles, the corresponding assurance object should be broader than a vehicle, controller or autonomy software stack. This paper defines a mobile working machine system (MWMS) as the machine, work equipment, attachments, sensing and computing system, remote-operation or supervision system, site infrastructure, digital services, operating organization, maintenance organization and operational data loop that jointly enable a bounded mobile work task.</w:t>
+      </w:r>
+    </w:p>
+    <w:p>
+      <w:pPr>
+        <w:pStyle w:val="BodyText"/>
+      </w:pPr>
+      <w:r>
+        <w:t xml:space="preserve">This definition is necessary because the risk source is distributed. A wheel loader is not only a mobile chassis; it also includes a bucket, boom, hydraulic actuation, material interaction, loading strategy, unloading interface, site traffic organization, remote stop capability and production procedure. A trenching excavator is not only a tracked vehicle; it includes a bucket or trenching attachment, digital construction plan, underground-utility assumptions, exclusion zones, spoil placement, operator confirmation rules and recovery procedures. A solar piling system is not only an autonomous rover; it includes piling equipment, pile feeding or handling, positioning references, verticality control, construction quality record and site acceptance procedure.</w:t>
+      </w:r>
+    </w:p>
+    <w:p>
+      <w:pPr>
+        <w:pStyle w:val="BodyText"/>
+      </w:pPr>
+      <w:r>
+        <w:t xml:space="preserve">The MWMS concept is consistent with the direction of existing earth-moving and mining-machine materials, but it is not a restatement of any single standard. ISO 17757 provides an autonomous and semi-autonomous machine-system foundation for earth-moving machinery and mining [7]. ISO 19014 provides a functional-safety reference for safety-related parts of earth-moving machinery control systems [8]. GMG guidance frames autonomous mining as a system-safety and operational-readiness problem involving suppliers, operators, control rooms, infrastructure, training, maintenance, change management, hazard logs and safety cases [10, 17]. ISO 18497-1 adds an adjacent non-road reminder that automated machine safety must be tied to machine design principles, intended use, safe working information and residual risk communication [60]. The MWMS concept generalizes these insights for loaders, excavators, trenching systems, solar piling systems and other mobile working machines.</w:t>
+      </w:r>
+    </w:p>
+    <w:p>
+      <w:pPr>
+        <w:pStyle w:val="BodyText"/>
+      </w:pPr>
+      <w:r>
+        <w:t xml:space="preserve">MWMS prevents two common underestimations. First, low speed does not mean low risk. Work equipment can generate high forces, high moments and high-consequence contact events even when the machine moves slowly. Second, unmanned operation does not mean responsibility-free operation. Remote supervision, work permits, site isolation, maintenance, calibration, emergency stop, fallback and restart rules remain part of the safety argument.</w:t>
+      </w:r>
+    </w:p>
+    <w:bookmarkEnd w:id="35"/>
+    <w:bookmarkStart w:id="36" w:name="Xa7b446a65ca63dc9459c79e0329ae0518150540"/>
     <w:p>
       <w:pPr>
         <w:pStyle w:val="Heading3"/>
       </w:pPr>
       <w:r>
-        <w:t xml:space="preserve">3.6 Driving automation levels and scenario layers</w:t>
+        <w:t xml:space="preserve">5.2 From road ODD to worksite and task design conditions</w:t>
       </w:r>
     </w:p>
     <w:p>
@@ -1266,278 +1779,6 @@
         <w:pStyle w:val="FirstParagraph"/>
       </w:pPr>
       <w:r>
-        <w:t xml:space="preserve">SAE J3016 provides a taxonomy for driving automation in on-road motor vehicles [24]. It is informative but insufficient for engineering vehicles. A machine may be highly automated in site navigation, partially automated in work-tool operation and still dependent on remote confirmation for abnormal situations. Calling such a system simply L4 or L5 would hide the most important safety questions.</w:t>
-      </w:r>
-    </w:p>
-    <w:p>
-      <w:pPr>
-        <w:pStyle w:val="BodyText"/>
-      </w:pPr>
-      <w:r>
-        <w:t xml:space="preserve">This paper therefore treats automation as a multi-dimensional property. Mobility automation, work-equipment automation and supervision mode should be described separately. A valid statement is not that a machine is L4, but that a specific mobile working machine system performs a specific dynamic moving and working task under specified worksite and task design conditions with specified supervision and fallback assumptions.</w:t>
-      </w:r>
-    </w:p>
-    <w:bookmarkEnd w:id="31"/>
-    <w:bookmarkEnd w:id="32"/>
-    <w:bookmarkStart w:id="37" w:name="Xd54e284332f70a5ee7d6026d5c629c39a0e25c2"/>
-    <w:p>
-      <w:pPr>
-        <w:pStyle w:val="Heading2"/>
-      </w:pPr>
-      <w:r>
-        <w:t xml:space="preserve">4. Existing standards and guidance for autonomous engineering vehicles</w:t>
-      </w:r>
-    </w:p>
-    <w:bookmarkStart w:id="33" w:name="a-layered-standards-and-guidance-map"/>
-    <w:p>
-      <w:pPr>
-        <w:pStyle w:val="Heading3"/>
-      </w:pPr>
-      <w:r>
-        <w:t xml:space="preserve">4.1 A layered standards and guidance map</w:t>
-      </w:r>
-    </w:p>
-    <w:p>
-      <w:pPr>
-        <w:pStyle w:val="FirstParagraph"/>
-      </w:pPr>
-      <w:r>
-        <w:t xml:space="preserve">Existing standards and guidance can be organized into seven layers.</w:t>
-      </w:r>
-    </w:p>
-    <w:p>
-      <w:pPr>
-        <w:pStyle w:val="BodyText"/>
-      </w:pPr>
-      <w:r>
-        <w:t xml:space="preserve">The first layer is the object and basic machinery-safety foundation. Earth-moving machinery type definitions and traditional machinery safety requirements define what machines are and what general safety foundation they have. This layer is necessary but not sufficient for autonomous work.</w:t>
-      </w:r>
-    </w:p>
-    <w:p>
-      <w:pPr>
-        <w:pStyle w:val="BodyText"/>
-      </w:pPr>
-      <w:r>
-        <w:t xml:space="preserve">The second layer is functional safety of control systems for earth-moving machinery. ISO 19014 is the central reference for safety-related parts of control systems in this domain [8, 12, 13, 14]. Revision-status records such as FDIS entries can support standardization-process discussion, but they should not replace current published standards until official publication is verified [26, 27, 28, 29].</w:t>
-      </w:r>
-    </w:p>
-    <w:p>
-      <w:pPr>
-        <w:pStyle w:val="BodyText"/>
-      </w:pPr>
-      <w:r>
-        <w:t xml:space="preserve">The third layer is autonomous and semi-autonomous machine systems. ISO 17757 and related national or local standards provide a system-safety entry point for autonomous earth-moving or mining machinery [7, 19]. Their significance is that they treat autonomy as a system-safety issue rather than only a vehicle-control issue. However, this paper does not interpret them as engineering-vehicle SOTIF standards.</w:t>
-      </w:r>
-    </w:p>
-    <w:p>
-      <w:pPr>
-        <w:pStyle w:val="BodyText"/>
-      </w:pPr>
-      <w:r>
-        <w:t xml:space="preserve">The fourth layer is remote operation. ISO 15817 is relevant to remote operator control systems [15]. It is important for remote driving and remote supervision, but it cannot alone address full autonomy, AI insufficiency or multi-party operational responsibility.</w:t>
-      </w:r>
-    </w:p>
-    <w:p>
-      <w:pPr>
-        <w:pStyle w:val="BodyText"/>
-      </w:pPr>
-      <w:r>
-        <w:t xml:space="preserve">The fifth layer is collision warning and collision avoidance. ISO 21815 provides an important basis for collision warning and collision avoidance systems on earth-moving machinery [9, 16]. Draft or approval-stage documents can signal standardization progress for additional motion forms, but they cannot be treated as final published standards without verification [30, 31].</w:t>
-      </w:r>
-    </w:p>
-    <w:p>
-      <w:pPr>
-        <w:pStyle w:val="BodyText"/>
-      </w:pPr>
-      <w:r>
-        <w:t xml:space="preserve">The sixth layer is adjacent non-road mobile machinery, including underground mining machines and autonomous agricultural machinery. ISO 18497-1:2024 is especially useful as a comparison point because it addresses partially automated, semi-autonomous and autonomous functions in agricultural machinery and tractors, while explicitly remaining outside forestry applications and public-road operation [60]. These domains provide relevant safety lessons because they involve constrained worksites, non-road mobility, remote operation, environmental variability and work functions. Their direct applicability still requires task-by-task assessment.</w:t>
-      </w:r>
-    </w:p>
-    <w:p>
-      <w:pPr>
-        <w:pStyle w:val="BodyText"/>
-      </w:pPr>
-      <w:r>
-        <w:t xml:space="preserve">The seventh layer is industry guidance and national or group-standard dynamics. GMG guidance for autonomous mining systems, implementation guidance, functional-safety white papers, Chinese standards for autonomous or unmanned mining transport, and adjacent robot SOTIF project information show that system safety, operational readiness, change management, maintenance, training, hazard logs, safety cases, ODD declaration, scenario classification and risk-chain reasoning are becoming central to AI-enabled mobile work [10, 17, 32, 18, 20, 21, 22, 23].</w:t>
-      </w:r>
-    </w:p>
-    <w:bookmarkEnd w:id="33"/>
-    <w:bookmarkStart w:id="34" w:name="X817e235d6f4a5c44c75543dcea0d4624c3b6f72"/>
-    <w:p>
-      <w:pPr>
-        <w:pStyle w:val="Heading3"/>
-      </w:pPr>
-      <w:r>
-        <w:t xml:space="preserve">4.2 What the current standards map can and cannot prove</w:t>
-      </w:r>
-    </w:p>
-    <w:p>
-      <w:pPr>
-        <w:pStyle w:val="FirstParagraph"/>
-      </w:pPr>
-      <w:r>
-        <w:t xml:space="preserve">The standards map supports three claims.</w:t>
-      </w:r>
-    </w:p>
-    <w:p>
-      <w:pPr>
-        <w:pStyle w:val="BodyText"/>
-      </w:pPr>
-      <w:r>
-        <w:t xml:space="preserve">First, autonomous engineering-vehicle safety is not a blank field. There are existing standards and guidance for machinery safety, control-system functional safety, autonomous machine systems, remote operation, collision warning, collision avoidance and autonomous mining operations.</w:t>
-      </w:r>
-    </w:p>
-    <w:p>
-      <w:pPr>
-        <w:pStyle w:val="BodyText"/>
-      </w:pPr>
-      <w:r>
-        <w:t xml:space="preserve">Second, existing materials are fragmented across object definitions, control-system safety, remote operation, collision avoidance, mining guidance, national standards, group standards, adjacent non-road automation standards and adjacent robot SOTIF project information. The robot SOTIF project helps show that ODD, scenario, triggering-condition, functional-insufficiency, hazard-chain and mitigation concepts are moving into mobile-robot standardization. ISO 18497-1 shows a parallel non-road route in which partially automated, semi-autonomous and autonomous machine functions are handled through machine design principles, vocabulary, safe working information and intended-use boundaries [60]. Neither source provides a direct compliance template for engineering vehicles. The current materials still do not provide a unified evidence chain for AI-enabled mobile work across machine, work equipment, material, site, task quality, remote supervision and operational monitoring.</w:t>
-      </w:r>
-    </w:p>
-    <w:p>
-      <w:pPr>
-        <w:pStyle w:val="BodyText"/>
-      </w:pPr>
-      <w:r>
-        <w:t xml:space="preserve">Third, road-vehicle methods can help organize the missing evidence chain, but they cannot serve as direct compliance templates. The contribution is methodological integration, not a claim that one road-vehicle standard solves engineering-vehicle autonomy.</w:t>
-      </w:r>
-    </w:p>
-    <w:p>
-      <w:pPr>
-        <w:pStyle w:val="BodyText"/>
-      </w:pPr>
-      <w:r>
-        <w:t xml:space="preserve">The map cannot prove clause-level requirements where only official status pages or previews are available. It cannot prove that a company product has achieved independent safety assurance. It cannot prove operational KPI, customer acceptance or complete safety cases from public product pages. It also cannot use space-mining or lunar-resource materials as evidence for current terrestrial engineering-vehicle standards.</w:t>
-      </w:r>
-    </w:p>
-    <w:bookmarkEnd w:id="34"/>
-    <w:bookmarkStart w:id="35" w:name="X0b56bf9993ab5d527c4aad06e4f15b3665be254"/>
-    <w:p>
-      <w:pPr>
-        <w:pStyle w:val="Heading3"/>
-      </w:pPr>
-      <w:r>
-        <w:t xml:space="preserve">4.3 Safety evaluation objects shift from injury alone to work consequences</w:t>
-      </w:r>
-    </w:p>
-    <w:p>
-      <w:pPr>
-        <w:pStyle w:val="FirstParagraph"/>
-      </w:pPr>
-      <w:r>
-        <w:t xml:space="preserve">Personnel safety remains the highest-priority concern. Controlled worksites still include maintenance workers, supervisors, other machine operators, visitors and people who may enter restricted areas. Yet autonomous engineering vehicles require a broader consequence model. Property damage, infrastructure damage, underground utility damage, production interruption, schedule delay, rework, task-quality failure, environmental harm and recovery capability must be considered.</w:t>
-      </w:r>
-    </w:p>
-    <w:p>
-      <w:pPr>
-        <w:pStyle w:val="BodyText"/>
-      </w:pPr>
-      <w:r>
-        <w:t xml:space="preserve">This shift matters for evaluation. A wheel loader may produce unacceptable risk through repeated misloading even without collision. An excavator may produce unacceptable risk through systematic trench-depth error, slope instability or utility encroachment. A solar piling system may create downstream structural and construction risks through position or verticality errors. Autonomous haulage may create safety-relevant risk through communication disruption, localization uncertainty, remote-control failure or poor interaction between manual and autonomous traffic.</w:t>
-      </w:r>
-    </w:p>
-    <w:p>
-      <w:pPr>
-        <w:pStyle w:val="BodyText"/>
-      </w:pPr>
-      <w:r>
-        <w:t xml:space="preserve">The safety assurance target is therefore not only to avoid immediate impact. It is to show that a mobile working machine system can safely perform bounded work tasks, maintain task quality, monitor its assumptions and recover from abnormal states.</w:t>
-      </w:r>
-    </w:p>
-    <w:bookmarkEnd w:id="35"/>
-    <w:bookmarkStart w:id="36" w:name="Xb3c6be02d3755625a207a1cd85da7537cd46d26"/>
-    <w:p>
-      <w:pPr>
-        <w:pStyle w:val="Heading3"/>
-      </w:pPr>
-      <w:r>
-        <w:t xml:space="preserve">4.4 Implication for the remainder of the paper</w:t>
-      </w:r>
-    </w:p>
-    <w:p>
-      <w:pPr>
-        <w:pStyle w:val="FirstParagraph"/>
-      </w:pPr>
-      <w:r>
-        <w:t xml:space="preserve">The remainder of the paper develops this standards map into a safety assurance framework. Section 5 will define MWMS, WTDC and DMWT as the three conceptual anchors. Section 6 will link these concepts to a SOTIF-oriented risk chain, scenario testing, operational monitoring and safety cases. Section 7 will use representative scenarios as templates for evidence collection, without treating public company pages as validation samples. Section 8 will discuss transfer limits, standardization gaps and the extreme-environment extension to lunar resource operations and space mining.</w:t>
-      </w:r>
-    </w:p>
-    <w:p>
-      <w:pPr>
-        <w:pStyle w:val="BodyText"/>
-      </w:pPr>
-      <w:r>
-        <w:t xml:space="preserve">The central argument is that autonomous engineering vehicles require a safety assurance language that can connect road-vehicle safety methods, machinery standards, field robotics, worksite operations and future physical AI deployment.</w:t>
-      </w:r>
-    </w:p>
-    <w:bookmarkEnd w:id="36"/>
-    <w:bookmarkEnd w:id="37"/>
-    <w:bookmarkStart w:id="44" w:name="X72ee2e29f79da33b3873dfde6f79084655d6d88"/>
-    <w:p>
-      <w:pPr>
-        <w:pStyle w:val="Heading2"/>
-      </w:pPr>
-      <w:r>
-        <w:t xml:space="preserve">5. Conceptual migration: MWMS, WTDC, DMWT and SOTIF-oriented risk chains</w:t>
-      </w:r>
-    </w:p>
-    <w:bookmarkStart w:id="38" w:name="Xb229ff994e9a7c216b4f60a2ab3bbd05481f5b6"/>
-    <w:p>
-      <w:pPr>
-        <w:pStyle w:val="Heading3"/>
-      </w:pPr>
-      <w:r>
-        <w:t xml:space="preserve">5.1 From vehicle item to mobile working machine system</w:t>
-      </w:r>
-    </w:p>
-    <w:p>
-      <w:pPr>
-        <w:pStyle w:val="FirstParagraph"/>
-      </w:pPr>
-      <w:r>
-        <w:t xml:space="preserve">Road-vehicle safety engineering often begins with an item definition. For autonomous engineering vehicles, the corresponding assurance object should be broader than a vehicle, controller or autonomy software stack. This paper defines a mobile working machine system (MWMS) as the machine, work equipment, attachments, sensing and computing system, remote-operation or supervision system, site infrastructure, digital services, operating organization, maintenance organization and operational data loop that jointly enable a bounded mobile work task.</w:t>
-      </w:r>
-    </w:p>
-    <w:p>
-      <w:pPr>
-        <w:pStyle w:val="BodyText"/>
-      </w:pPr>
-      <w:r>
-        <w:t xml:space="preserve">This definition is necessary because the risk source is distributed. A wheel loader is not only a mobile chassis; it also includes a bucket, boom, hydraulic actuation, material interaction, loading strategy, unloading interface, site traffic organization, remote stop capability and production procedure. A trenching excavator is not only a tracked vehicle; it includes a bucket or trenching attachment, digital construction plan, underground-utility assumptions, exclusion zones, spoil placement, operator confirmation rules and recovery procedures. A solar piling system is not only an autonomous rover; it includes piling equipment, pile feeding or handling, positioning references, verticality control, construction quality record and site acceptance procedure.</w:t>
-      </w:r>
-    </w:p>
-    <w:p>
-      <w:pPr>
-        <w:pStyle w:val="BodyText"/>
-      </w:pPr>
-      <w:r>
-        <w:t xml:space="preserve">The MWMS concept is consistent with the direction of existing earth-moving and mining-machine materials, but it is not a restatement of any single standard. ISO 17757 provides an autonomous and semi-autonomous machine-system foundation for earth-moving machinery and mining [7]. ISO 19014 provides a functional-safety reference for safety-related parts of earth-moving machinery control systems [8]. GMG guidance frames autonomous mining as a system-safety and operational-readiness problem involving suppliers, operators, control rooms, infrastructure, training, maintenance, change management, hazard logs and safety cases [10, 17]. ISO 18497-1 adds an adjacent non-road reminder that automated machine safety must be tied to machine design principles, intended use, safe working information and residual risk communication [60]. The MWMS concept generalizes these insights for loaders, excavators, trenching systems, solar piling systems and other mobile working machines.</w:t>
-      </w:r>
-    </w:p>
-    <w:p>
-      <w:pPr>
-        <w:pStyle w:val="BodyText"/>
-      </w:pPr>
-      <w:r>
-        <w:t xml:space="preserve">MWMS prevents two common underestimations. First, low speed does not mean low risk. Work equipment can generate high forces, high moments and high-consequence contact events even when the machine moves slowly. Second, unmanned operation does not mean responsibility-free operation. Remote supervision, work permits, site isolation, maintenance, calibration, emergency stop, fallback and restart rules remain part of the safety argument.</w:t>
-      </w:r>
-    </w:p>
-    <w:bookmarkEnd w:id="38"/>
-    <w:bookmarkStart w:id="39" w:name="Xa7b446a65ca63dc9459c79e0329ae0518150540"/>
-    <w:p>
-      <w:pPr>
-        <w:pStyle w:val="Heading3"/>
-      </w:pPr>
-      <w:r>
-        <w:t xml:space="preserve">5.2 From road ODD to worksite and task design conditions</w:t>
-      </w:r>
-    </w:p>
-    <w:p>
-      <w:pPr>
-        <w:pStyle w:val="FirstParagraph"/>
-      </w:pPr>
-      <w:r>
         <w:t xml:space="preserve">The operating design domain concept is useful for automated driving because it forces developers to state where, when and under what conditions an automated driving system is intended to operate. For engineering vehicles, direct use of road ODD is too narrow. This paper defines worksite and task design conditions (WTDC) as the set of site, material, work-equipment, task-quality, digital and organizational conditions under which an MWMS is intended to perform a specified work task.</w:t>
       </w:r>
     </w:p>
@@ -1554,7 +1795,7 @@
         <w:pStyle w:val="BodyText"/>
       </w:pPr>
       <w:r>
-        <w:t xml:space="preserve">Table 2. Worksite and task design condition layers for autonomous engineering vehicles.</w:t>
+        <w:t xml:space="preserve">Table 3. Worksite and task design condition layers for autonomous engineering vehicles.</w:t>
       </w:r>
     </w:p>
     <w:tbl>
@@ -1966,8 +2207,8 @@
         <w:t xml:space="preserve">This layered WTDC structure is inspired by scenario-based safety evaluation and six-layer scenario modeling, but it is rewritten for worksite tasks rather than copied from road traffic [5, 25]. Its practical value is test design. An engineering-vehicle test should not only ask how many hours the machine has worked. It should ask which work areas, terrain states, material states, attachment states, task-quality requirements, communication states and supervision modes have been covered.</w:t>
       </w:r>
     </w:p>
-    <w:bookmarkEnd w:id="39"/>
-    <w:bookmarkStart w:id="40" w:name="Xa458bc4bc3d9ee81008da18df6ad82207fdc4ea"/>
+    <w:bookmarkEnd w:id="36"/>
+    <w:bookmarkStart w:id="37" w:name="Xa458bc4bc3d9ee81008da18df6ad82207fdc4ea"/>
     <w:p>
       <w:pPr>
         <w:pStyle w:val="Heading3"/>
@@ -2024,8 +2265,8 @@
         <w:t xml:space="preserve">The DMWT concept changes the central question. The issue is not whether the machine can drive to a location by itself. The issue is whether the MWMS can safely, reliably and verifiably perform useful work under declared WTDC.</w:t>
       </w:r>
     </w:p>
-    <w:bookmarkEnd w:id="40"/>
-    <w:bookmarkStart w:id="41" w:name="Xda566691cfb336051ee91bd26c7b3717a266363"/>
+    <w:bookmarkEnd w:id="37"/>
+    <w:bookmarkStart w:id="38" w:name="Xda566691cfb336051ee91bd26c7b3717a266363"/>
     <w:p>
       <w:pPr>
         <w:pStyle w:val="Heading3"/>
@@ -2055,7 +2296,7 @@
         <w:pStyle w:val="BodyText"/>
       </w:pPr>
       <w:r>
-        <w:t xml:space="preserve">Table 3. SOTIF-oriented risk-chain elements for mobile working-machine tasks.</w:t>
+        <w:t xml:space="preserve">Table 4. SOTIF-oriented risk-chain elements for mobile working-machine tasks.</w:t>
       </w:r>
     </w:p>
     <w:tbl>
@@ -2362,8 +2603,8 @@
         <w:t xml:space="preserve">This risk chain keeps the logic of SOTIF while changing the objects. In road vehicles, trigger conditions are often road, traffic or weather conditions. In engineering vehicles, they are worksite and task conditions. In road vehicles, the hazardous event is often a driving conflict. In engineering vehicles, the hazardous event may involve work equipment, material, infrastructure, task quality or production continuity. In road vehicles, evidence often focuses on driving scenarios. In engineering vehicles, evidence must include work-cycle scenarios, tool states, material states, quality records and operational logs.</w:t>
       </w:r>
     </w:p>
-    <w:bookmarkEnd w:id="41"/>
-    <w:bookmarkStart w:id="42" w:name="three-dimensional-automation-description"/>
+    <w:bookmarkEnd w:id="38"/>
+    <w:bookmarkStart w:id="39" w:name="three-dimensional-automation-description"/>
     <w:p>
       <w:pPr>
         <w:pStyle w:val="Heading3"/>
@@ -2385,15 +2626,15 @@
         <w:pStyle w:val="BodyText"/>
       </w:pPr>
       <w:r>
-        <w:t xml:space="preserve">This paper therefore describes autonomy through three dimensions: mobility automation, work-equipment automation and supervision mode. Their low, medium and high automation interpretations are provided in Table 6 so that the main manuscript keeps its display items focused on the framework evidence chain.</w:t>
-      </w:r>
-    </w:p>
-    <w:p>
-      <w:pPr>
-        <w:pStyle w:val="BodyText"/>
-      </w:pPr>
-      <w:r>
-        <w:t xml:space="preserve">Table 6. Three-dimensional automation description for mobile working machine systems.</w:t>
+        <w:t xml:space="preserve">This paper therefore describes autonomy through three dimensions: mobility automation, work-equipment automation and supervision mode. Their low, medium and high automation interpretations are provided in Table 5 so that the main manuscript keeps its display items focused on the framework evidence chain.</w:t>
+      </w:r>
+    </w:p>
+    <w:p>
+      <w:pPr>
+        <w:pStyle w:val="BodyText"/>
+      </w:pPr>
+      <w:r>
+        <w:t xml:space="preserve">Table 5. Three-dimensional automation description for mobile working machine systems.</w:t>
       </w:r>
     </w:p>
     <w:tbl>
@@ -2614,8 +2855,8 @@
         <w:t xml:space="preserve">, but it is safer and more useful for testing, operations and standardization.</w:t>
       </w:r>
     </w:p>
-    <w:bookmarkEnd w:id="42"/>
-    <w:bookmarkStart w:id="43" w:name="X22c7825b020edc3efb124357b0ecc785351f4a5"/>
+    <w:bookmarkEnd w:id="39"/>
+    <w:bookmarkStart w:id="40" w:name="X22c7825b020edc3efb124357b0ecc785351f4a5"/>
     <w:p>
       <w:pPr>
         <w:pStyle w:val="Heading3"/>
@@ -2648,9 +2889,9 @@
         <w:t xml:space="preserve">Together, these two sources strengthen the paper’s central boundary shift. The assurance object is no longer only an automated machine. It is a mobile working machine system that includes the machine, work equipment, worksite, digital context, supervision model, organisational routines and evidence loop. This is also why recent source-page evidence on remote operation and AI-assisted site inspection should be treated carefully: both topics are relevant to the same work-system boundary, but abstract-level evidence should not be written as full-text close reading.</w:t>
       </w:r>
     </w:p>
-    <w:bookmarkEnd w:id="43"/>
-    <w:bookmarkEnd w:id="44"/>
-    <w:bookmarkStart w:id="50" w:name="X2f259f0711b7d590178b361c7a55054c0a50bb5"/>
+    <w:bookmarkEnd w:id="40"/>
+    <w:bookmarkEnd w:id="41"/>
+    <w:bookmarkStart w:id="47" w:name="X2f259f0711b7d590178b361c7a55054c0a50bb5"/>
     <w:p>
       <w:pPr>
         <w:pStyle w:val="Heading2"/>
@@ -2659,7 +2900,7 @@
         <w:t xml:space="preserve">6. Safety assurance evidence chain: development, testing, monitoring and safety cases</w:t>
       </w:r>
     </w:p>
-    <w:bookmarkStart w:id="45" w:name="Xbbb84bdedfdcb8a7f890a23cebfee0e967f8dcb"/>
+    <w:bookmarkStart w:id="42" w:name="Xbbb84bdedfdcb8a7f890a23cebfee0e967f8dcb"/>
     <w:p>
       <w:pPr>
         <w:pStyle w:val="Heading3"/>
@@ -2788,8 +3029,8 @@
         <w:t xml:space="preserve">This sequence reduces a common failure mode: demonstrating automation first and trying to reconstruct the safety argument afterward. For mobile working machines, a demonstration without MWMS boundary, WTDC, DMWT, risk chains, test coverage and operational monitoring is not a reviewable safety claim.</w:t>
       </w:r>
     </w:p>
-    <w:bookmarkEnd w:id="45"/>
-    <w:bookmarkStart w:id="46" w:name="wtdc-dmwt-testing-matrix"/>
+    <w:bookmarkEnd w:id="42"/>
+    <w:bookmarkStart w:id="43" w:name="wtdc-dmwt-testing-matrix"/>
     <w:p>
       <w:pPr>
         <w:pStyle w:val="Heading3"/>
@@ -2811,7 +3052,7 @@
         <w:pStyle w:val="BodyText"/>
       </w:pPr>
       <w:r>
-        <w:t xml:space="preserve">Table 4. WTDC-DMWT scenario testing levels and evidence forms.</w:t>
+        <w:t xml:space="preserve">Table 6. WTDC-DMWT scenario testing levels and evidence forms.</w:t>
       </w:r>
     </w:p>
     <w:tbl>
@@ -3045,8 +3286,8 @@
         <w:t xml:space="preserve">Terrain-navigation, scenario-engineering, virtual construction and construction-AI papers also support parts of the evidence chain. They are useful for WTDC terrain layers, digital-twin scenarios, site monitoring and hazard reasoning, but they are not vehicle-level safety assurance by themselves [40, 41, 42, 43, 44].</w:t>
       </w:r>
     </w:p>
-    <w:bookmarkEnd w:id="46"/>
-    <w:bookmarkStart w:id="47" w:name="X78877fe362229ff813c801a3e4cfc7f95b418ee"/>
+    <w:bookmarkEnd w:id="43"/>
+    <w:bookmarkStart w:id="44" w:name="X78877fe362229ff813c801a3e4cfc7f95b418ee"/>
     <w:p>
       <w:pPr>
         <w:pStyle w:val="Heading3"/>
@@ -3270,8 +3511,8 @@
         <w:t xml:space="preserve">This model changes how evidence is interpreted. Bucket material weight, loading time, mass, time and work are important for DMWT testing and task quality, but they are not automatically safety metrics [35, 36]. A system can be efficient but unsafe; it can also be safe enough in a restricted mode but commercially impractical. Safety acceptance should therefore separate harm prevention, task-quality assurance, production continuity and operational recoverability.</w:t>
       </w:r>
     </w:p>
-    <w:bookmarkEnd w:id="47"/>
-    <w:bookmarkStart w:id="48" w:name="Xe4626e142acbc2ecbffb09986f34d804d53eb74"/>
+    <w:bookmarkEnd w:id="44"/>
+    <w:bookmarkStart w:id="45" w:name="Xe4626e142acbc2ecbffb09986f34d804d53eb74"/>
     <w:p>
       <w:pPr>
         <w:pStyle w:val="Heading3"/>
@@ -3408,8 +3649,8 @@
         <w:t xml:space="preserve">Construction-hazard recognition and site-inspection AI research can support external monitoring and report generation, but it must not be treated as a safety monitor by default [43, 44]. If such tools are used, the safety case must define data sources, detection limitations, false-positive and false-negative treatment, rule source, human review, response responsibility and post-update validation.</w:t>
       </w:r>
     </w:p>
-    <w:bookmarkEnd w:id="48"/>
-    <w:bookmarkStart w:id="49" w:name="safety-case-structure"/>
+    <w:bookmarkEnd w:id="45"/>
+    <w:bookmarkStart w:id="46" w:name="safety-case-structure"/>
     <w:p>
       <w:pPr>
         <w:pStyle w:val="Heading3"/>
@@ -3439,7 +3680,7 @@
         <w:pStyle w:val="BodyText"/>
       </w:pPr>
       <w:r>
-        <w:t xml:space="preserve">Table 5. Minimum safety-case claim groups for autonomous engineering vehicles.</w:t>
+        <w:t xml:space="preserve">Table 8. Minimum safety-case claim groups for autonomous engineering vehicles.</w:t>
       </w:r>
     </w:p>
     <w:tbl>
@@ -3711,24 +3952,150 @@
         <w:t xml:space="preserve">Supplier product safety cases and operator operational safety cases should be separated. A supplier can argue that a product is safe under declared assumptions and configuration. An operator must argue that the product, site, infrastructure, personnel, maintenance and operating process are safe for a specific deployment. For autonomous haulage, this distinction is especially important because communication, localization, dispatch, remote operation and cybersecurity can directly affect safe operation [11].</w:t>
       </w:r>
     </w:p>
+    <w:bookmarkEnd w:id="46"/>
+    <w:bookmarkEnd w:id="47"/>
+    <w:bookmarkStart w:id="54" w:name="Xbf8cfe0e2e293a119f4f2e8f7f68287f69532ca"/>
+    <w:p>
+      <w:pPr>
+        <w:pStyle w:val="Heading2"/>
+      </w:pPr>
+      <w:r>
+        <w:t xml:space="preserve">7. Representative scenarios: templates, not validation samples</w:t>
+      </w:r>
+    </w:p>
+    <w:bookmarkStart w:id="48" w:name="evidence-principle"/>
+    <w:p>
+      <w:pPr>
+        <w:pStyle w:val="Heading3"/>
+      </w:pPr>
+      <w:r>
+        <w:t xml:space="preserve">7.1 Evidence principle</w:t>
+      </w:r>
+    </w:p>
+    <w:p>
+      <w:pPr>
+        <w:pStyle w:val="FirstParagraph"/>
+      </w:pPr>
+      <w:r>
+        <w:t xml:space="preserve">The scenarios in this section are templates for applying the framework. They are not validation samples. Public company pages, product pages and annual reports can show that a product direction, scenario or function exists. They cannot prove independent safety certification, complete safety case, field maturity, customer acceptance, operating KPI, incident rate or long-term reliability. Peer-reviewed papers can support algorithms, experiments and research findings. They cannot prove commercial deployment maturity unless that evidence is directly present. Industry guidance can support assurance topics. It cannot replace site-specific operational evidence.</w:t>
+      </w:r>
+    </w:p>
+    <w:p>
+      <w:pPr>
+        <w:pStyle w:val="BodyText"/>
+      </w:pPr>
+      <w:r>
+        <w:t xml:space="preserve">This principle is important because autonomous engineering vehicles are moving quickly and public claims are often visually persuasive. A review paper should use public cases to anchor scenarios, then state what evidence would be needed for a defensible safety claim.</w:t>
+      </w:r>
+    </w:p>
+    <w:bookmarkEnd w:id="48"/>
+    <w:bookmarkStart w:id="49" w:name="Xcf0bd554cf1ea02266ac4acee1a9f1ea0a6bc1b"/>
+    <w:p>
+      <w:pPr>
+        <w:pStyle w:val="Heading3"/>
+      </w:pPr>
+      <w:r>
+        <w:t xml:space="preserve">7.2 Wheel-loader loading in batching plants and vessel holds</w:t>
+      </w:r>
+    </w:p>
+    <w:p>
+      <w:pPr>
+        <w:pStyle w:val="FirstParagraph"/>
+      </w:pPr>
+      <w:r>
+        <w:t xml:space="preserve">Wheel-loader loading is a high-frequency mobile work task. Public cases from Chinese manufacturers can anchor batching-plant or similar unmanned-loader scenarios, while academic wheel-loader research supports task variables such as material variation, loading-cycle performance and work-equipment control [45, 46, 35, 36].</w:t>
+      </w:r>
+    </w:p>
+    <w:p>
+      <w:pPr>
+        <w:pStyle w:val="BodyText"/>
+      </w:pPr>
+      <w:r>
+        <w:t xml:space="preserve">The MWMS includes the loader, bucket, hydraulic system, perception sensors, localization system, control software, remote supervision system, stockpile, hopper or unloading point, traffic lanes, exclusion zones, site personnel rules, maintenance process and operational data system.</w:t>
+      </w:r>
+    </w:p>
+    <w:p>
+      <w:pPr>
+        <w:pStyle w:val="BodyText"/>
+      </w:pPr>
+      <w:r>
+        <w:t xml:space="preserve">The WTDC should include stockpile geometry, material type, moisture, dust, visibility, route width, slope, temporary obstacles, hopper position, other vehicle movement, communication quality, lighting and supervision mode. Vessel-hold loading adds confined space, walls, limited GNSS, restricted escape routes, dust and difficult recovery.</w:t>
+      </w:r>
+    </w:p>
+    <w:p>
+      <w:pPr>
+        <w:pStyle w:val="BodyText"/>
+      </w:pPr>
+      <w:r>
+        <w:t xml:space="preserve">The DMWT includes repeated cycles of approach, pile-face selection, bucket insertion, lifting, curling, load estimation, travel, alignment, unloading, completion confirmation and return. Safety-relevant insufficiencies include stockpile-boundary recognition error, insufficient material-state recognition, bucket-load estimation error, perception degradation under dust, repeated-cycle localization drift and failure to detect temporary obstacles.</w:t>
+      </w:r>
+    </w:p>
+    <w:p>
+      <w:pPr>
+        <w:pStyle w:val="BodyText"/>
+      </w:pPr>
+      <w:r>
+        <w:t xml:space="preserve">The safety case should require evidence for personnel isolation, hopper and wall protection, bucket path limitation, emergency stop, remote confirmation, task-quality monitoring, repeated-cycle testing, sensor contamination handling, maintenance and post-change revalidation. Public pages can anchor the scenario, but the actual safety claim would need field test records, event logs, site procedures and anonymized operational evidence.</w:t>
+      </w:r>
+    </w:p>
     <w:bookmarkEnd w:id="49"/>
+    <w:bookmarkStart w:id="50" w:name="X40592c98e5a9b14be431dc7865753d61b3efb62"/>
+    <w:p>
+      <w:pPr>
+        <w:pStyle w:val="Heading3"/>
+      </w:pPr>
+      <w:r>
+        <w:t xml:space="preserve">7.3 Autonomous trenching for pipelines and linear construction</w:t>
+      </w:r>
+    </w:p>
+    <w:p>
+      <w:pPr>
+        <w:pStyle w:val="FirstParagraph"/>
+      </w:pPr>
+      <w:r>
+        <w:t xml:space="preserve">Autonomous trenching is a high-value scenario because it combines mobility, excavation, underground-asset risk and strong task-quality requirements. Public trenching-product materials can anchor the scenario, while autonomous-excavator research supports robotic excavation as a technical research direction [47, 37].</w:t>
+      </w:r>
+    </w:p>
+    <w:p>
+      <w:pPr>
+        <w:pStyle w:val="BodyText"/>
+      </w:pPr>
+      <w:r>
+        <w:t xml:space="preserve">The MWMS includes the excavator or trenching machine, bucket or trenching attachment, digital construction model, localization system, utility map, exclusion-zone management, remote operator or supervisor, site safety officer, spoil-placement area, inspection procedure, maintenance process and data log.</w:t>
+      </w:r>
+    </w:p>
+    <w:p>
+      <w:pPr>
+        <w:pStyle w:val="BodyText"/>
+      </w:pPr>
+      <w:r>
+        <w:t xml:space="preserve">The WTDC should include trench route, permitted depth and width, soil type, slope, water, rocks, underground utilities, no-dig areas, nearby equipment, worker entry, GNSS/RTK quality, map accuracy, communication quality and weather. The DMWT includes alignment to the design model, movement along the route, stable machine positioning, bucket trajectory control, trench-depth control, spoil placement, workface update, inspection, anomaly handling and safe restart.</w:t>
+      </w:r>
+    </w:p>
+    <w:p>
+      <w:pPr>
+        <w:pStyle w:val="BodyText"/>
+      </w:pPr>
+      <w:r>
+        <w:t xml:space="preserve">The most important SOTIF triggers include utility-map error, soil hardness outside training or planning assumptions, unexpected rock, unstable trench wall, bucket-pose estimation error, localization drift, personnel entry and communication degradation. Hazardous events include utility strike, over-digging, under-digging, slope instability, machine collision, spoil misplacement and unsafe restart after interruption.</w:t>
+      </w:r>
+    </w:p>
+    <w:p>
+      <w:pPr>
+        <w:pStyle w:val="BodyText"/>
+      </w:pPr>
+      <w:r>
+        <w:t xml:space="preserve">The safety case should therefore require evidence for utility verification, design-model alignment, depth and slope tolerance, bucket and swing envelope limits, remote confirmation rules, exclusion-zone monitoring, emergency stop, recovery after map mismatch and task-quality records. The strongest field evidence would be anonymized trench segments with WTDC, DMWT phases, deviations, stops, remote confirmations, quality inspections and lessons learned.</w:t>
+      </w:r>
+    </w:p>
     <w:bookmarkEnd w:id="50"/>
-    <w:bookmarkStart w:id="57" w:name="Xbf8cfe0e2e293a119f4f2e8f7f68287f69532ca"/>
-    <w:p>
-      <w:pPr>
-        <w:pStyle w:val="Heading2"/>
-      </w:pPr>
-      <w:r>
-        <w:t xml:space="preserve">7. Representative scenarios: templates, not validation samples</w:t>
-      </w:r>
-    </w:p>
-    <w:bookmarkStart w:id="51" w:name="evidence-principle"/>
+    <w:bookmarkStart w:id="51" w:name="solar-piling-systems"/>
     <w:p>
       <w:pPr>
         <w:pStyle w:val="Heading3"/>
       </w:pPr>
       <w:r>
-        <w:t xml:space="preserve">7.1 Evidence principle</w:t>
+        <w:t xml:space="preserve">7.4 Solar piling systems</w:t>
       </w:r>
     </w:p>
     <w:p>
@@ -3736,25 +4103,49 @@
         <w:pStyle w:val="FirstParagraph"/>
       </w:pPr>
       <w:r>
-        <w:t xml:space="preserve">The scenarios in this section are templates for applying the framework. They are not validation samples. Public company pages, product pages and annual reports can show that a product direction, scenario or function exists. They cannot prove independent safety certification, complete safety case, field maturity, customer acceptance, operating KPI, incident rate or long-term reliability. Peer-reviewed papers can support algorithms, experiments and research findings. They cannot prove commercial deployment maturity unless that evidence is directly present. Industry guidance can support assurance topics. It cannot replace site-specific operational evidence.</w:t>
-      </w:r>
-    </w:p>
-    <w:p>
-      <w:pPr>
-        <w:pStyle w:val="BodyText"/>
-      </w:pPr>
-      <w:r>
-        <w:t xml:space="preserve">This principle is important because autonomous engineering vehicles are moving quickly and public claims are often visually persuasive. A review paper should use public cases to anchor scenarios, then state what evidence would be needed for a defensible safety claim.</w:t>
+        <w:t xml:space="preserve">Solar piling is a narrow but valuable case because the task is repetitive, bounded and quality-sensitive. Public solar-piling product materials can anchor the task direction, but they do not establish safety assurance or field performance by themselves [38].</w:t>
+      </w:r>
+    </w:p>
+    <w:p>
+      <w:pPr>
+        <w:pStyle w:val="BodyText"/>
+      </w:pPr>
+      <w:r>
+        <w:t xml:space="preserve">The MWMS includes the mobile base, piling equipment, pile handling or supply process, RTK or local positioning reference, digital pile layout, exclusion-zone management, remote supervision, maintenance, quality inspection and as-built data management.</w:t>
+      </w:r>
+    </w:p>
+    <w:p>
+      <w:pPr>
+        <w:pStyle w:val="BodyText"/>
+      </w:pPr>
+      <w:r>
+        <w:t xml:space="preserve">The WTDC should include site boundary, pile spacing, ground slope, soil condition, pile type, pile location tolerance, verticality tolerance, RTK/GNSS quality, wind, visibility, workers in the work area, other vehicles, pile supply and communication. The DMWT includes moving to the pile location, local alignment, pile handling, driving, depth and verticality measurement, anomaly handling, quality record and movement to the next location.</w:t>
+      </w:r>
+    </w:p>
+    <w:p>
+      <w:pPr>
+        <w:pStyle w:val="BodyText"/>
+      </w:pPr>
+      <w:r>
+        <w:t xml:space="preserve">Safety-relevant insufficiencies include location error, verticality-control error, insufficient ground-condition recognition, pile-handling error, worker-entry detection failure, RTK loss and failure to recognize abnormal vibration or failed pile driving. Consequences include worker injury, machine damage, pile damage, positional rework, structural-quality dispute and schedule delay.</w:t>
+      </w:r>
+    </w:p>
+    <w:p>
+      <w:pPr>
+        <w:pStyle w:val="BodyText"/>
+      </w:pPr>
+      <w:r>
+        <w:t xml:space="preserve">The safety case should require evidence for geofence, remote stop, worker-exclusion procedure, positioning validation, pile-quality measurement, abnormal-driving detection, as-built records, restart rules, maintenance and configuration management. Solar piling is suitable as an early safety-case template because the task is narrow enough to define WTDC and DMWT precisely.</w:t>
       </w:r>
     </w:p>
     <w:bookmarkEnd w:id="51"/>
-    <w:bookmarkStart w:id="52" w:name="Xcf0bd554cf1ea02266ac4acee1a9f1ea0a6bc1b"/>
+    <w:bookmarkStart w:id="52" w:name="X7bed00867bc5a07ee40e89cb08d2cdd69105950"/>
     <w:p>
       <w:pPr>
         <w:pStyle w:val="Heading3"/>
       </w:pPr>
       <w:r>
-        <w:t xml:space="preserve">7.2 Wheel-loader loading in batching plants and vessel holds</w:t>
+        <w:t xml:space="preserve">7.5 Autonomous haulage as a mature reference, not a universal evidence source</w:t>
       </w:r>
     </w:p>
     <w:p>
@@ -3762,185 +4153,35 @@
         <w:pStyle w:val="FirstParagraph"/>
       </w:pPr>
       <w:r>
-        <w:t xml:space="preserve">Wheel-loader loading is a high-frequency mobile work task. Public cases from Chinese manufacturers can anchor batching-plant or similar unmanned-loader scenarios, while academic wheel-loader research supports task variables such as material variation, loading-cycle performance and work-equipment control [45, 46, 35, 36].</w:t>
-      </w:r>
-    </w:p>
-    <w:p>
-      <w:pPr>
-        <w:pStyle w:val="BodyText"/>
-      </w:pPr>
-      <w:r>
-        <w:t xml:space="preserve">The MWMS includes the loader, bucket, hydraulic system, perception sensors, localization system, control software, remote supervision system, stockpile, hopper or unloading point, traffic lanes, exclusion zones, site personnel rules, maintenance process and operational data system.</w:t>
-      </w:r>
-    </w:p>
-    <w:p>
-      <w:pPr>
-        <w:pStyle w:val="BodyText"/>
-      </w:pPr>
-      <w:r>
-        <w:t xml:space="preserve">The WTDC should include stockpile geometry, material type, moisture, dust, visibility, route width, slope, temporary obstacles, hopper position, other vehicle movement, communication quality, lighting and supervision mode. Vessel-hold loading adds confined space, walls, limited GNSS, restricted escape routes, dust and difficult recovery.</w:t>
-      </w:r>
-    </w:p>
-    <w:p>
-      <w:pPr>
-        <w:pStyle w:val="BodyText"/>
-      </w:pPr>
-      <w:r>
-        <w:t xml:space="preserve">The DMWT includes repeated cycles of approach, pile-face selection, bucket insertion, lifting, curling, load estimation, travel, alignment, unloading, completion confirmation and return. Safety-relevant insufficiencies include stockpile-boundary recognition error, insufficient material-state recognition, bucket-load estimation error, perception degradation under dust, repeated-cycle localization drift and failure to detect temporary obstacles.</w:t>
-      </w:r>
-    </w:p>
-    <w:p>
-      <w:pPr>
-        <w:pStyle w:val="BodyText"/>
-      </w:pPr>
-      <w:r>
-        <w:t xml:space="preserve">The safety case should require evidence for personnel isolation, hopper and wall protection, bucket path limitation, emergency stop, remote confirmation, task-quality monitoring, repeated-cycle testing, sensor contamination handling, maintenance and post-change revalidation. Public pages can anchor the scenario, but the actual safety claim would need field test records, event logs, site procedures and anonymized operational evidence.</w:t>
+        <w:t xml:space="preserve">Autonomous haulage is the most mature public reference among engineering-vehicle autonomy domains. It has stronger guidance, operational organization, simulation research and cybersecurity-safety coupling than many loader or excavator scenarios [10, 17, 33, 34, 11].</w:t>
+      </w:r>
+    </w:p>
+    <w:p>
+      <w:pPr>
+        <w:pStyle w:val="BodyText"/>
+      </w:pPr>
+      <w:r>
+        <w:t xml:space="preserve">Its transferable value is system assurance. Autonomous haulage shows why the safety object should include control rooms, dispatch, communication, maintenance, training, road design, manual-autonomous separation, commissioning, change management, hazard logs and safety cases. It also shows that cybersecurity is safety-relevant when communication, localization, remote control or dispatch affects vehicle behaviour.</w:t>
+      </w:r>
+    </w:p>
+    <w:p>
+      <w:pPr>
+        <w:pStyle w:val="BodyText"/>
+      </w:pPr>
+      <w:r>
+        <w:t xml:space="preserve">Its non-transferable limit is task specificity. Haulage does not solve bucket loading, trench-depth control, pile verticality, material-state recognition or work-tool quality assurance. It can serve as an assurance reference, not a universal validation sample.</w:t>
+      </w:r>
+    </w:p>
+    <w:p>
+      <w:pPr>
+        <w:pStyle w:val="BodyText"/>
+      </w:pPr>
+      <w:r>
+        <w:t xml:space="preserve">Recent work-system evidence from a Swedish AHS implementation further supports this boundary: the haul trucks may be unmanned, but the production system remains manned through on-site operators, control-room operators, formal procedures and organisational learning [58].</w:t>
       </w:r>
     </w:p>
     <w:bookmarkEnd w:id="52"/>
-    <w:bookmarkStart w:id="53" w:name="X40592c98e5a9b14be431dc7865753d61b3efb62"/>
-    <w:p>
-      <w:pPr>
-        <w:pStyle w:val="Heading3"/>
-      </w:pPr>
-      <w:r>
-        <w:t xml:space="preserve">7.3 Autonomous trenching for pipelines and linear construction</w:t>
-      </w:r>
-    </w:p>
-    <w:p>
-      <w:pPr>
-        <w:pStyle w:val="FirstParagraph"/>
-      </w:pPr>
-      <w:r>
-        <w:t xml:space="preserve">Autonomous trenching is a high-value scenario because it combines mobility, excavation, underground-asset risk and strong task-quality requirements. Public trenching-product materials can anchor the scenario, while autonomous-excavator research supports robotic excavation as a technical research direction [47, 37].</w:t>
-      </w:r>
-    </w:p>
-    <w:p>
-      <w:pPr>
-        <w:pStyle w:val="BodyText"/>
-      </w:pPr>
-      <w:r>
-        <w:t xml:space="preserve">The MWMS includes the excavator or trenching machine, bucket or trenching attachment, digital construction model, localization system, utility map, exclusion-zone management, remote operator or supervisor, site safety officer, spoil-placement area, inspection procedure, maintenance process and data log.</w:t>
-      </w:r>
-    </w:p>
-    <w:p>
-      <w:pPr>
-        <w:pStyle w:val="BodyText"/>
-      </w:pPr>
-      <w:r>
-        <w:t xml:space="preserve">The WTDC should include trench route, permitted depth and width, soil type, slope, water, rocks, underground utilities, no-dig areas, nearby equipment, worker entry, GNSS/RTK quality, map accuracy, communication quality and weather. The DMWT includes alignment to the design model, movement along the route, stable machine positioning, bucket trajectory control, trench-depth control, spoil placement, workface update, inspection, anomaly handling and safe restart.</w:t>
-      </w:r>
-    </w:p>
-    <w:p>
-      <w:pPr>
-        <w:pStyle w:val="BodyText"/>
-      </w:pPr>
-      <w:r>
-        <w:t xml:space="preserve">The most important SOTIF triggers include utility-map error, soil hardness outside training or planning assumptions, unexpected rock, unstable trench wall, bucket-pose estimation error, localization drift, personnel entry and communication degradation. Hazardous events include utility strike, over-digging, under-digging, slope instability, machine collision, spoil misplacement and unsafe restart after interruption.</w:t>
-      </w:r>
-    </w:p>
-    <w:p>
-      <w:pPr>
-        <w:pStyle w:val="BodyText"/>
-      </w:pPr>
-      <w:r>
-        <w:t xml:space="preserve">The safety case should therefore require evidence for utility verification, design-model alignment, depth and slope tolerance, bucket and swing envelope limits, remote confirmation rules, exclusion-zone monitoring, emergency stop, recovery after map mismatch and task-quality records. The strongest field evidence would be anonymized trench segments with WTDC, DMWT phases, deviations, stops, remote confirmations, quality inspections and lessons learned.</w:t>
-      </w:r>
-    </w:p>
-    <w:bookmarkEnd w:id="53"/>
-    <w:bookmarkStart w:id="54" w:name="solar-piling-systems"/>
-    <w:p>
-      <w:pPr>
-        <w:pStyle w:val="Heading3"/>
-      </w:pPr>
-      <w:r>
-        <w:t xml:space="preserve">7.4 Solar piling systems</w:t>
-      </w:r>
-    </w:p>
-    <w:p>
-      <w:pPr>
-        <w:pStyle w:val="FirstParagraph"/>
-      </w:pPr>
-      <w:r>
-        <w:t xml:space="preserve">Solar piling is a narrow but valuable case because the task is repetitive, bounded and quality-sensitive. Public solar-piling product materials can anchor the task direction, but they do not establish safety assurance or field performance by themselves [38].</w:t>
-      </w:r>
-    </w:p>
-    <w:p>
-      <w:pPr>
-        <w:pStyle w:val="BodyText"/>
-      </w:pPr>
-      <w:r>
-        <w:t xml:space="preserve">The MWMS includes the mobile base, piling equipment, pile handling or supply process, RTK or local positioning reference, digital pile layout, exclusion-zone management, remote supervision, maintenance, quality inspection and as-built data management.</w:t>
-      </w:r>
-    </w:p>
-    <w:p>
-      <w:pPr>
-        <w:pStyle w:val="BodyText"/>
-      </w:pPr>
-      <w:r>
-        <w:t xml:space="preserve">The WTDC should include site boundary, pile spacing, ground slope, soil condition, pile type, pile location tolerance, verticality tolerance, RTK/GNSS quality, wind, visibility, workers in the work area, other vehicles, pile supply and communication. The DMWT includes moving to the pile location, local alignment, pile handling, driving, depth and verticality measurement, anomaly handling, quality record and movement to the next location.</w:t>
-      </w:r>
-    </w:p>
-    <w:p>
-      <w:pPr>
-        <w:pStyle w:val="BodyText"/>
-      </w:pPr>
-      <w:r>
-        <w:t xml:space="preserve">Safety-relevant insufficiencies include location error, verticality-control error, insufficient ground-condition recognition, pile-handling error, worker-entry detection failure, RTK loss and failure to recognize abnormal vibration or failed pile driving. Consequences include worker injury, machine damage, pile damage, positional rework, structural-quality dispute and schedule delay.</w:t>
-      </w:r>
-    </w:p>
-    <w:p>
-      <w:pPr>
-        <w:pStyle w:val="BodyText"/>
-      </w:pPr>
-      <w:r>
-        <w:t xml:space="preserve">The safety case should require evidence for geofence, remote stop, worker-exclusion procedure, positioning validation, pile-quality measurement, abnormal-driving detection, as-built records, restart rules, maintenance and configuration management. Solar piling is suitable as an early safety-case template because the task is narrow enough to define WTDC and DMWT precisely.</w:t>
-      </w:r>
-    </w:p>
-    <w:bookmarkEnd w:id="54"/>
-    <w:bookmarkStart w:id="55" w:name="X7bed00867bc5a07ee40e89cb08d2cdd69105950"/>
-    <w:p>
-      <w:pPr>
-        <w:pStyle w:val="Heading3"/>
-      </w:pPr>
-      <w:r>
-        <w:t xml:space="preserve">7.5 Autonomous haulage as a mature reference, not a universal evidence source</w:t>
-      </w:r>
-    </w:p>
-    <w:p>
-      <w:pPr>
-        <w:pStyle w:val="FirstParagraph"/>
-      </w:pPr>
-      <w:r>
-        <w:t xml:space="preserve">Autonomous haulage is the most mature public reference among engineering-vehicle autonomy domains. It has stronger guidance, operational organization, simulation research and cybersecurity-safety coupling than many loader or excavator scenarios [10, 17, 33, 34, 11].</w:t>
-      </w:r>
-    </w:p>
-    <w:p>
-      <w:pPr>
-        <w:pStyle w:val="BodyText"/>
-      </w:pPr>
-      <w:r>
-        <w:t xml:space="preserve">Its transferable value is system assurance. Autonomous haulage shows why the safety object should include control rooms, dispatch, communication, maintenance, training, road design, manual-autonomous separation, commissioning, change management, hazard logs and safety cases. It also shows that cybersecurity is safety-relevant when communication, localization, remote control or dispatch affects vehicle behaviour.</w:t>
-      </w:r>
-    </w:p>
-    <w:p>
-      <w:pPr>
-        <w:pStyle w:val="BodyText"/>
-      </w:pPr>
-      <w:r>
-        <w:t xml:space="preserve">Its non-transferable limit is task specificity. Haulage does not solve bucket loading, trench-depth control, pile verticality, material-state recognition or work-tool quality assurance. It can serve as an assurance reference, not a universal validation sample.</w:t>
-      </w:r>
-    </w:p>
-    <w:p>
-      <w:pPr>
-        <w:pStyle w:val="BodyText"/>
-      </w:pPr>
-      <w:r>
-        <w:t xml:space="preserve">Recent work-system evidence from a Swedish AHS implementation further supports this boundary: the haul trucks may be unmanned, but the production system remains manned through on-site operators, control-room operators, formal procedures and organisational learning [58].</w:t>
-      </w:r>
-    </w:p>
-    <w:bookmarkEnd w:id="55"/>
-    <w:bookmarkStart w:id="56" w:name="Xc397da2834744d0fca211a32df344e7049f1d71"/>
+    <w:bookmarkStart w:id="53" w:name="Xc397da2834744d0fca211a32df344e7049f1d71"/>
     <w:p>
       <w:pPr>
         <w:pStyle w:val="Heading3"/>
@@ -4037,24 +4278,148 @@
         <w:t xml:space="preserve">Three to five anonymized samples across loader, trenching, piling and haulage would substantially improve the manuscript. Without them, the framework can still be a useful review and conceptual contribution, but strong practical claims should remain limited.</w:t>
       </w:r>
     </w:p>
+    <w:bookmarkEnd w:id="53"/>
+    <w:bookmarkEnd w:id="54"/>
+    <w:bookmarkStart w:id="58" w:name="Xa8271907d1ddcdc21b0b8d351518e8652de216e"/>
+    <w:p>
+      <w:pPr>
+        <w:pStyle w:val="Heading2"/>
+      </w:pPr>
+      <w:r>
+        <w:t xml:space="preserve">8. Extreme-environment extension: lunar resource operations and space mining</w:t>
+      </w:r>
+    </w:p>
+    <w:bookmarkStart w:id="55" w:name="X47d77a1b9142c69d233ea0466c6e12fb4ca17d1"/>
+    <w:p>
+      <w:pPr>
+        <w:pStyle w:val="Heading3"/>
+      </w:pPr>
+      <w:r>
+        <w:t xml:space="preserve">8.1 Why space mining belongs in the discussion</w:t>
+      </w:r>
+    </w:p>
+    <w:p>
+      <w:pPr>
+        <w:pStyle w:val="FirstParagraph"/>
+      </w:pPr>
+      <w:r>
+        <w:t xml:space="preserve">Lunar resource operations and space mining are not evidence for current terrestrial engineering-vehicle standards. They belong in the discussion because they stress-test the same conceptual structure. Space-resource work requires mobile machines to move, excavate, collect, transport, deposit, construct, inspect and maintain operations in uncertain terrain with limited human presence and strong remote-supervision constraints [48, 49, 50, 51, 52, 53].</w:t>
+      </w:r>
+    </w:p>
+    <w:p>
+      <w:pPr>
+        <w:pStyle w:val="BodyText"/>
+      </w:pPr>
+      <w:r>
+        <w:t xml:space="preserve">The structural similarity is clear. Both terrestrial engineering-vehicle autonomy and lunar resource autonomy involve mobile work, material interaction, work-tool control, uncertain terrain, remote supervision, task-quality requirements and operational monitoring. The difference is that space work pushes every assumption harder: communication delay, lack of immediate rescue, limited maintenance, extreme temperature, dust adhesion, lighting variation, energy constraints, localization without terrestrial infrastructure and high cost of failure.</w:t>
+      </w:r>
+    </w:p>
+    <w:bookmarkEnd w:id="55"/>
+    <w:bookmarkStart w:id="56" w:name="wtdc-and-dmwt-under-extreme-conditions"/>
+    <w:p>
+      <w:pPr>
+        <w:pStyle w:val="Heading3"/>
+      </w:pPr>
+      <w:r>
+        <w:t xml:space="preserve">8.2 WTDC and DMWT under extreme conditions</w:t>
+      </w:r>
+    </w:p>
+    <w:p>
+      <w:pPr>
+        <w:pStyle w:val="FirstParagraph"/>
+      </w:pPr>
+      <w:r>
+        <w:t xml:space="preserve">In a lunar or planetary context, WTDC layers change but do not disappear. Work area becomes a landing-site, construction zone or resource prospecting area. Terrain includes craters, slopes, regolith, rocks and deformable surfaces. Fixed infrastructure may include landers, power systems, communication relays and storage units. Temporary changes include excavated piles, tracks, berms, trenches and constructed surfaces. Dynamic objects include other robots and crewed or uncrewed vehicles. Material state includes regolith distribution, particle properties, ice-bearing materials and boulders. Environment includes vacuum, radiation, low gravity, dust and extreme temperature. Digital conditions include delayed communication, autonomy mode, mapping and mission planning. Organization includes ground control, supervisory autonomy, abort rules and health management.</w:t>
+      </w:r>
+    </w:p>
+    <w:p>
+      <w:pPr>
+        <w:pStyle w:val="BodyText"/>
+      </w:pPr>
+      <w:r>
+        <w:t xml:space="preserve">DMWT also remains recognizable. Lunar excavation may include moving to a target, local mapping, terrain preparation, cutting, scooping, hauling, dumping, compacting or grading, and validating task completion. Lunar construction simulation, CraterGrader and related space-robotics work show that terrain manipulation, site preparation, deformable terrain, autonomous construction, excavation and multi-machine coordination are active research directions [54, 55, 56, 57].</w:t>
+      </w:r>
+    </w:p>
     <w:bookmarkEnd w:id="56"/>
+    <w:bookmarkStart w:id="57" w:name="safety-implication"/>
+    <w:p>
+      <w:pPr>
+        <w:pStyle w:val="Heading3"/>
+      </w:pPr>
+      <w:r>
+        <w:t xml:space="preserve">8.3 Safety implication</w:t>
+      </w:r>
+    </w:p>
+    <w:p>
+      <w:pPr>
+        <w:pStyle w:val="FirstParagraph"/>
+      </w:pPr>
+      <w:r>
+        <w:t xml:space="preserve">The space extension reinforces three conclusions for terrestrial engineering vehicles.</w:t>
+      </w:r>
+    </w:p>
+    <w:p>
+      <w:pPr>
+        <w:pStyle w:val="BodyText"/>
+      </w:pPr>
+      <w:r>
+        <w:t xml:space="preserve">First, mobility and work cannot be separated. A space excavator that reaches the resource but cannot manipulate material safely has not completed the safety-relevant task. The same is true for loaders, trenchers and piling systems on Earth.</w:t>
+      </w:r>
+    </w:p>
+    <w:p>
+      <w:pPr>
+        <w:pStyle w:val="BodyText"/>
+      </w:pPr>
+      <w:r>
+        <w:t xml:space="preserve">Second, task quality is safety-relevant. Incorrect excavation, unstable terrain preparation or poor construction quality can create downstream mission risk. On Earth, analogous risks include trench collapse, utility damage, pile rework, hopper damage and production shutdown.</w:t>
+      </w:r>
+    </w:p>
+    <w:p>
+      <w:pPr>
+        <w:pStyle w:val="BodyText"/>
+      </w:pPr>
+      <w:r>
+        <w:t xml:space="preserve">Third, operational monitoring and change management are unavoidable. In extreme environments, assumptions will fail. Evidence must therefore include health monitoring, anomaly detection, recovery, remote-supervision rules and revalidation after software or configuration changes.</w:t>
+      </w:r>
+    </w:p>
+    <w:p>
+      <w:pPr>
+        <w:pStyle w:val="BodyText"/>
+      </w:pPr>
+      <w:r>
+        <w:t xml:space="preserve">The space-mining extension should therefore be used as a conceptual horizon. It strengthens the</w:t>
+      </w:r>
+      <w:r>
+        <w:t xml:space="preserve"> </w:t>
+      </w:r>
+      <w:r>
+        <w:t xml:space="preserve">“safe working”</w:t>
+      </w:r>
+      <w:r>
+        <w:t xml:space="preserve"> </w:t>
+      </w:r>
+      <w:r>
+        <w:t xml:space="preserve">thesis, but it should not be used to claim that current terrestrial standards already cover space mining or that space-robotics prototypes validate terrestrial product safety.</w:t>
+      </w:r>
+    </w:p>
     <w:bookmarkEnd w:id="57"/>
-    <w:bookmarkStart w:id="61" w:name="Xa8271907d1ddcdc21b0b8d351518e8652de216e"/>
+    <w:bookmarkEnd w:id="58"/>
+    <w:bookmarkStart w:id="64" w:name="discussion-and-conclusions"/>
     <w:p>
       <w:pPr>
         <w:pStyle w:val="Heading2"/>
       </w:pPr>
       <w:r>
-        <w:t xml:space="preserve">8. Extreme-environment extension: lunar resource operations and space mining</w:t>
-      </w:r>
-    </w:p>
-    <w:bookmarkStart w:id="58" w:name="X47d77a1b9142c69d233ea0466c6e12fb4ca17d1"/>
+        <w:t xml:space="preserve">9. Discussion and conclusions</w:t>
+      </w:r>
+    </w:p>
+    <w:bookmarkStart w:id="59" w:name="X1939fd16cabc654d3769007e2543f1afc36c3b2"/>
     <w:p>
       <w:pPr>
         <w:pStyle w:val="Heading3"/>
       </w:pPr>
       <w:r>
-        <w:t xml:space="preserve">8.1 Why space mining belongs in the discussion</w:t>
+        <w:t xml:space="preserve">9.1 Transferable elements from road-vehicle safety</w:t>
       </w:r>
     </w:p>
     <w:p>
@@ -4062,25 +4427,25 @@
         <w:pStyle w:val="FirstParagraph"/>
       </w:pPr>
       <w:r>
-        <w:t xml:space="preserve">Lunar resource operations and space mining are not evidence for current terrestrial engineering-vehicle standards. They belong in the discussion because they stress-test the same conceptual structure. Space-resource work requires mobile machines to move, excavate, collect, transport, deposit, construct, inspect and maintain operations in uncertain terrain with limited human presence and strong remote-supervision constraints [48, 49, 50, 51, 52, 53].</w:t>
-      </w:r>
-    </w:p>
-    <w:p>
-      <w:pPr>
-        <w:pStyle w:val="BodyText"/>
-      </w:pPr>
-      <w:r>
-        <w:t xml:space="preserve">The structural similarity is clear. Both terrestrial engineering-vehicle autonomy and lunar resource autonomy involve mobile work, material interaction, work-tool control, uncertain terrain, remote supervision, task-quality requirements and operational monitoring. The difference is that space work pushes every assumption harder: communication delay, lack of immediate rescue, limited maintenance, extreme temperature, dust adhesion, lighting variation, energy constraints, localization without terrestrial infrastructure and high cost of failure.</w:t>
-      </w:r>
-    </w:p>
-    <w:bookmarkEnd w:id="58"/>
-    <w:bookmarkStart w:id="59" w:name="wtdc-and-dmwt-under-extreme-conditions"/>
+        <w:t xml:space="preserve">Road-vehicle safety provides strong methodological donors. Functional safety contributes lifecycle thinking, hazard analysis, safety goals, requirement decomposition and verification discipline. SOTIF contributes the distinction between malfunction and intended-function insufficiency, and gives a structure for identifying trigger conditions and unknown unsafe scenarios. Cybersecurity contributes asset, threat and risk-treatment thinking for connected and remotely supervised systems. AI safety contributes attention to model limitations, data quality, distribution shift and post-update validation. Scenario-based testing contributes a way to organize coverage by functional, logical and concrete scenarios. Safety cases contribute claim-argument-evidence discipline.</w:t>
+      </w:r>
+    </w:p>
+    <w:p>
+      <w:pPr>
+        <w:pStyle w:val="BodyText"/>
+      </w:pPr>
+      <w:r>
+        <w:t xml:space="preserve">These elements are valuable because they are problem structures. They force the engineering-vehicle field to state system boundaries, operating boundaries, task definitions, assumptions, limitations, evidence and residual risk.</w:t>
+      </w:r>
+    </w:p>
+    <w:bookmarkEnd w:id="59"/>
+    <w:bookmarkStart w:id="60" w:name="X7e5d3f6232983f6a6efa5bce1bcf4c6a1ae9aea"/>
     <w:p>
       <w:pPr>
         <w:pStyle w:val="Heading3"/>
       </w:pPr>
       <w:r>
-        <w:t xml:space="preserve">8.2 WTDC and DMWT under extreme conditions</w:t>
+        <w:t xml:space="preserve">9.2 Non-transferable elements and required adaptation</w:t>
       </w:r>
     </w:p>
     <w:p>
@@ -4088,25 +4453,25 @@
         <w:pStyle w:val="FirstParagraph"/>
       </w:pPr>
       <w:r>
-        <w:t xml:space="preserve">In a lunar or planetary context, WTDC layers change but do not disappear. Work area becomes a landing-site, construction zone or resource prospecting area. Terrain includes craters, slopes, regolith, rocks and deformable surfaces. Fixed infrastructure may include landers, power systems, communication relays and storage units. Temporary changes include excavated piles, tracks, berms, trenches and constructed surfaces. Dynamic objects include other robots and crewed or uncrewed vehicles. Material state includes regolith distribution, particle properties, ice-bearing materials and boulders. Environment includes vacuum, radiation, low gravity, dust and extreme temperature. Digital conditions include delayed communication, autonomy mode, mapping and mission planning. Organization includes ground control, supervisory autonomy, abort rules and health management.</w:t>
-      </w:r>
-    </w:p>
-    <w:p>
-      <w:pPr>
-        <w:pStyle w:val="BodyText"/>
-      </w:pPr>
-      <w:r>
-        <w:t xml:space="preserve">DMWT also remains recognizable. Lunar excavation may include moving to a target, local mapping, terrain preparation, cutting, scooping, hauling, dumping, compacting or grading, and validating task completion. Lunar construction simulation, CraterGrader and related space-robotics work show that terrain manipulation, site preparation, deformable terrain, autonomous construction, excavation and multi-machine coordination are active research directions [54, 55, 56, 57].</w:t>
-      </w:r>
-    </w:p>
-    <w:bookmarkEnd w:id="59"/>
-    <w:bookmarkStart w:id="60" w:name="safety-implication"/>
+        <w:t xml:space="preserve">Several road-vehicle elements should not be copied. ASIL should not be mechanically mapped to machinery machine performance levels. SAE driving automation levels should not be used as a complete description of work-equipment automation or supervision mode. Road ODD should not be used without material, work-equipment, task-quality, digital and organizational layers. Road scenario layers should not be treated as a final worksite ontology. Road-traffic exposure, controllability and injury assumptions should not be assumed to cover property damage, utility damage, production interruption, rework, environmental impact and recovery capability.</w:t>
+      </w:r>
+    </w:p>
+    <w:p>
+      <w:pPr>
+        <w:pStyle w:val="BodyText"/>
+      </w:pPr>
+      <w:r>
+        <w:t xml:space="preserve">The field therefore needs adapted language. MWMS replaces a narrow vehicle item. WTDC replaces direct road ODD transfer. DMWT replaces dynamic driving task when physical work is involved. The SOTIF-oriented risk chain must include task consequences and evidence loops. Automation should be described through mobility automation, work-equipment automation and supervision mode.</w:t>
+      </w:r>
+    </w:p>
+    <w:bookmarkEnd w:id="60"/>
+    <w:bookmarkStart w:id="61" w:name="X98e5d08c9b260545d8b76b10cccb98c6d4d1007"/>
     <w:p>
       <w:pPr>
         <w:pStyle w:val="Heading3"/>
       </w:pPr>
       <w:r>
-        <w:t xml:space="preserve">8.3 Safety implication</w:t>
+        <w:t xml:space="preserve">9.3 Implications for research, standardization and product deployment</w:t>
       </w:r>
     </w:p>
     <w:p>
@@ -4114,71 +4479,49 @@
         <w:pStyle w:val="FirstParagraph"/>
       </w:pPr>
       <w:r>
-        <w:t xml:space="preserve">The space extension reinforces three conclusions for terrestrial engineering vehicles.</w:t>
-      </w:r>
-    </w:p>
-    <w:p>
-      <w:pPr>
-        <w:pStyle w:val="BodyText"/>
-      </w:pPr>
-      <w:r>
-        <w:t xml:space="preserve">First, mobility and work cannot be separated. A space excavator that reaches the resource but cannot manipulate material safely has not completed the safety-relevant task. The same is true for loaders, trenchers and piling systems on Earth.</w:t>
-      </w:r>
-    </w:p>
-    <w:p>
-      <w:pPr>
-        <w:pStyle w:val="BodyText"/>
-      </w:pPr>
-      <w:r>
-        <w:t xml:space="preserve">Second, task quality is safety-relevant. Incorrect excavation, unstable terrain preparation or poor construction quality can create downstream mission risk. On Earth, analogous risks include trench collapse, utility damage, pile rework, hopper damage and production shutdown.</w:t>
-      </w:r>
-    </w:p>
-    <w:p>
-      <w:pPr>
-        <w:pStyle w:val="BodyText"/>
-      </w:pPr>
-      <w:r>
-        <w:t xml:space="preserve">Third, operational monitoring and change management are unavoidable. In extreme environments, assumptions will fail. Evidence must therefore include health monitoring, anomaly detection, recovery, remote-supervision rules and revalidation after software or configuration changes.</w:t>
-      </w:r>
-    </w:p>
-    <w:p>
-      <w:pPr>
-        <w:pStyle w:val="BodyText"/>
-      </w:pPr>
-      <w:r>
-        <w:t xml:space="preserve">The space-mining extension should therefore be used as a conceptual horizon. It strengthens the</w:t>
-      </w:r>
-      <w:r>
-        <w:t xml:space="preserve"> </w:t>
-      </w:r>
-      <w:r>
-        <w:t xml:space="preserve">“safe working”</w:t>
-      </w:r>
-      <w:r>
-        <w:t xml:space="preserve"> </w:t>
-      </w:r>
-      <w:r>
-        <w:t xml:space="preserve">thesis, but it should not be used to claim that current terrestrial standards already cover space mining or that space-robotics prototypes validate terrestrial product safety.</w:t>
-      </w:r>
-    </w:p>
-    <w:bookmarkEnd w:id="60"/>
+        <w:t xml:space="preserve">For researchers, the next step is not only to develop better navigation or manipulation algorithms. It is to build WTDC and DMWT models, scenario libraries, simulation benchmarks, task-quality metrics, trigger-condition discovery methods and operational-data feedback loops. Loader, trenching, piling and haulage tasks should be used as distinct benchmarks because their risk chains are materially different.</w:t>
+      </w:r>
+    </w:p>
+    <w:p>
+      <w:pPr>
+        <w:pStyle w:val="BodyText"/>
+      </w:pPr>
+      <w:r>
+        <w:t xml:space="preserve">Recent excavation pretraining work also shows why research benchmarks should record not only task success, but also terrain, soil, attachment, machine configuration, fallback and post-update validation boundaries [59].</w:t>
+      </w:r>
+    </w:p>
+    <w:p>
+      <w:pPr>
+        <w:pStyle w:val="BodyText"/>
+      </w:pPr>
+      <w:r>
+        <w:t xml:space="preserve">For standardization groups and testing organizations, the most productive starting point is likely not a universal autonomous engineering-vehicle standard. A more practical route is task-specific testing and evaluation guidance: unmanned loader operation in batching plants or vessel holds, autonomous trenching for pipeline construction, autonomous solar piling and autonomous mine haulage. These guides can define WTDC layers, DMWT phases, scenario parameters, trigger conditions, evidence records and safety-case expectations.</w:t>
+      </w:r>
+    </w:p>
+    <w:p>
+      <w:pPr>
+        <w:pStyle w:val="BodyText"/>
+      </w:pPr>
+      <w:r>
+        <w:t xml:space="preserve">For manufacturers, automation suppliers and operators, product deployment should be designed around evidence from the beginning. A system should be able to state what it can do, where it can do it, when it must stop, who supervises it, what data it records, how changes are validated and what evidence supports each safety claim. In practical terms, this means building the scenario library, test records, event logs, hazard log and operational safety case alongside autonomy development.</w:t>
+      </w:r>
+    </w:p>
+    <w:p>
+      <w:pPr>
+        <w:pStyle w:val="BodyText"/>
+      </w:pPr>
+      <w:r>
+        <w:t xml:space="preserve">For space-resource and extreme-environment communities, terrestrial engineering-vehicle safety offers a near-term laboratory for safe mobile work. Loaders, excavators, trenchers, piling systems and haulage trucks provide real tasks in which mobility, work-tool control, material interaction, supervision and monitoring can be studied before the same logic is pushed into lunar or planetary operations.</w:t>
+      </w:r>
+    </w:p>
     <w:bookmarkEnd w:id="61"/>
-    <w:bookmarkStart w:id="67" w:name="discussion-and-conclusions"/>
-    <w:p>
-      <w:pPr>
-        <w:pStyle w:val="Heading2"/>
-      </w:pPr>
-      <w:r>
-        <w:t xml:space="preserve">9. Discussion and conclusions</w:t>
-      </w:r>
-    </w:p>
-    <w:bookmarkStart w:id="62" w:name="X1939fd16cabc654d3769007e2543f1afc36c3b2"/>
+    <w:bookmarkStart w:id="62" w:name="limitations"/>
     <w:p>
       <w:pPr>
         <w:pStyle w:val="Heading3"/>
       </w:pPr>
       <w:r>
-        <w:t xml:space="preserve">9.1 Transferable elements from road-vehicle safety</w:t>
+        <w:t xml:space="preserve">9.4 Limitations</w:t>
       </w:r>
     </w:p>
     <w:p>
@@ -4186,25 +4529,57 @@
         <w:pStyle w:val="FirstParagraph"/>
       </w:pPr>
       <w:r>
-        <w:t xml:space="preserve">Road-vehicle safety provides strong methodological donors. Functional safety contributes lifecycle thinking, hazard analysis, safety goals, requirement decomposition and verification discipline. SOTIF contributes the distinction between malfunction and intended-function insufficiency, and gives a structure for identifying trigger conditions and unknown unsafe scenarios. Cybersecurity contributes asset, threat and risk-treatment thinking for connected and remotely supervised systems. AI safety contributes attention to model limitations, data quality, distribution shift and post-update validation. Scenario-based testing contributes a way to organize coverage by functional, logical and concrete scenarios. Safety cases contribute claim-argument-evidence discipline.</w:t>
-      </w:r>
-    </w:p>
-    <w:p>
-      <w:pPr>
-        <w:pStyle w:val="BodyText"/>
-      </w:pPr>
-      <w:r>
-        <w:t xml:space="preserve">These elements are valuable because they are problem structures. They force the engineering-vehicle field to state system boundaries, operating boundaries, task definitions, assumptions, limitations, evidence and residual risk.</w:t>
+        <w:t xml:space="preserve">This review has five limitations.</w:t>
+      </w:r>
+    </w:p>
+    <w:p>
+      <w:pPr>
+        <w:pStyle w:val="BodyText"/>
+      </w:pPr>
+      <w:r>
+        <w:t xml:space="preserve">First, several standards are used through official status pages, public previews or mapped secondary materials. Clause-level claims require authorized full-text access and final verification. This also applies to adjacent standards such as ISO 18497-1:2024: its public page can support publication status, scope summary and boundary discussion, but not detailed clause interpretation.</w:t>
+      </w:r>
+    </w:p>
+    <w:p>
+      <w:pPr>
+        <w:pStyle w:val="BodyText"/>
+      </w:pPr>
+      <w:r>
+        <w:t xml:space="preserve">Second, public company cases are used only as scenario anchors. They are not evidence of independent safety assurance, customer acceptance, operating KPI or long-term safety performance.</w:t>
+      </w:r>
+    </w:p>
+    <w:p>
+      <w:pPr>
+        <w:pStyle w:val="BodyText"/>
+      </w:pPr>
+      <w:r>
+        <w:t xml:space="preserve">Third, the current framework requires anonymized field samples. Without field samples, it remains a structured review and conceptual framework rather than a validated deployment methodology.</w:t>
+      </w:r>
+    </w:p>
+    <w:p>
+      <w:pPr>
+        <w:pStyle w:val="BodyText"/>
+      </w:pPr>
+      <w:r>
+        <w:t xml:space="preserve">Fourth, the paper focuses on selected high-demand scenarios: wheel-loader loading, trenching, solar piling and autonomous haulage. Other engineering vehicles, including cranes, graders, bulldozers, road rollers, underground mining machines and agricultural-adjacent mobile machines, require further adaptation.</w:t>
+      </w:r>
+    </w:p>
+    <w:p>
+      <w:pPr>
+        <w:pStyle w:val="BodyText"/>
+      </w:pPr>
+      <w:r>
+        <w:t xml:space="preserve">Fifth, space mining is treated as an extreme-environment extension. It is useful for conceptual stress-testing but does not provide direct evidence for current terrestrial standards.</w:t>
       </w:r>
     </w:p>
     <w:bookmarkEnd w:id="62"/>
-    <w:bookmarkStart w:id="63" w:name="X7e5d3f6232983f6a6efa5bce1bcf4c6a1ae9aea"/>
+    <w:bookmarkStart w:id="63" w:name="conclusions"/>
     <w:p>
       <w:pPr>
         <w:pStyle w:val="Heading3"/>
       </w:pPr>
       <w:r>
-        <w:t xml:space="preserve">9.2 Non-transferable elements and required adaptation</w:t>
+        <w:t xml:space="preserve">9.5 Conclusions</w:t>
       </w:r>
     </w:p>
     <w:p>
@@ -4212,162 +4587,28 @@
         <w:pStyle w:val="FirstParagraph"/>
       </w:pPr>
       <w:r>
-        <w:t xml:space="preserve">Several road-vehicle elements should not be copied. ASIL should not be mechanically mapped to machinery machine performance levels. SAE driving automation levels should not be used as a complete description of work-equipment automation or supervision mode. Road ODD should not be used without material, work-equipment, task-quality, digital and organizational layers. Road scenario layers should not be treated as a final worksite ontology. Road-traffic exposure, controllability and injury assumptions should not be assumed to cover property damage, utility damage, production interruption, rework, environmental impact and recovery capability.</w:t>
-      </w:r>
-    </w:p>
-    <w:p>
-      <w:pPr>
-        <w:pStyle w:val="BodyText"/>
-      </w:pPr>
-      <w:r>
-        <w:t xml:space="preserve">The field therefore needs adapted language. MWMS replaces a narrow vehicle item. WTDC replaces direct road ODD transfer. DMWT replaces dynamic driving task when physical work is involved. The SOTIF-oriented risk chain must include task consequences and evidence loops. Automation should be described through mobility automation, work-equipment automation and supervision mode.</w:t>
+        <w:t xml:space="preserve">Autonomous engineering vehicles should not be understood as low-speed automated cars. They are mobile working machine systems. Their safety assurance must cover movement, work equipment, material interaction, task quality, remote supervision, site organization, operational monitoring and change management.</w:t>
+      </w:r>
+    </w:p>
+    <w:p>
+      <w:pPr>
+        <w:pStyle w:val="BodyText"/>
+      </w:pPr>
+      <w:r>
+        <w:t xml:space="preserve">Road-vehicle safety methods remain highly valuable when they are transferred as problem structures. Functional safety, SOTIF, cybersecurity, AI safety, scenario-based testing and safety cases can organize the evidence chain. However, the rating labels, road-scenario assumptions and road-traffic consequence models must be rewritten.</w:t>
+      </w:r>
+    </w:p>
+    <w:p>
+      <w:pPr>
+        <w:pStyle w:val="BodyText"/>
+      </w:pPr>
+      <w:r>
+        <w:t xml:space="preserve">The proposed MWMS, WTDC and DMWT concepts provide a practical bridge from safe driving to safe working. They allow researchers to deepen the problem, standardization groups to define task-specific evaluation guidance, and companies to build deployment evidence that goes beyond demonstrations. The central safety question is not whether an engineering vehicle can drive autonomously. It is whether the system can safely complete bounded work, keep its assumptions visible and update its evidence as the worksite changes.</w:t>
       </w:r>
     </w:p>
     <w:bookmarkEnd w:id="63"/>
-    <w:bookmarkStart w:id="64" w:name="X98e5d08c9b260545d8b76b10cccb98c6d4d1007"/>
-    <w:p>
-      <w:pPr>
-        <w:pStyle w:val="Heading3"/>
-      </w:pPr>
-      <w:r>
-        <w:t xml:space="preserve">9.3 Implications for research, standardization and product deployment</w:t>
-      </w:r>
-    </w:p>
-    <w:p>
-      <w:pPr>
-        <w:pStyle w:val="FirstParagraph"/>
-      </w:pPr>
-      <w:r>
-        <w:t xml:space="preserve">For researchers, the next step is not only to develop better navigation or manipulation algorithms. It is to build WTDC and DMWT models, scenario libraries, simulation benchmarks, task-quality metrics, trigger-condition discovery methods and operational-data feedback loops. Loader, trenching, piling and haulage tasks should be used as distinct benchmarks because their risk chains are materially different.</w:t>
-      </w:r>
-    </w:p>
-    <w:p>
-      <w:pPr>
-        <w:pStyle w:val="BodyText"/>
-      </w:pPr>
-      <w:r>
-        <w:t xml:space="preserve">Recent excavation pretraining work also shows why research benchmarks should record not only task success, but also terrain, soil, attachment, machine configuration, fallback and post-update validation boundaries [59].</w:t>
-      </w:r>
-    </w:p>
-    <w:p>
-      <w:pPr>
-        <w:pStyle w:val="BodyText"/>
-      </w:pPr>
-      <w:r>
-        <w:t xml:space="preserve">For standardization groups and testing organizations, the most productive starting point is likely not a universal autonomous engineering-vehicle standard. A more practical route is task-specific testing and evaluation guidance: unmanned loader operation in batching plants or vessel holds, autonomous trenching for pipeline construction, autonomous solar piling and autonomous mine haulage. These guides can define WTDC layers, DMWT phases, scenario parameters, trigger conditions, evidence records and safety-case expectations.</w:t>
-      </w:r>
-    </w:p>
-    <w:p>
-      <w:pPr>
-        <w:pStyle w:val="BodyText"/>
-      </w:pPr>
-      <w:r>
-        <w:t xml:space="preserve">For manufacturers, automation suppliers and operators, product deployment should be designed around evidence from the beginning. A system should be able to state what it can do, where it can do it, when it must stop, who supervises it, what data it records, how changes are validated and what evidence supports each safety claim. In practical terms, this means building the scenario library, test records, event logs, hazard log and operational safety case alongside autonomy development.</w:t>
-      </w:r>
-    </w:p>
-    <w:p>
-      <w:pPr>
-        <w:pStyle w:val="BodyText"/>
-      </w:pPr>
-      <w:r>
-        <w:t xml:space="preserve">For space-resource and extreme-environment communities, terrestrial engineering-vehicle safety offers a near-term laboratory for safe mobile work. Loaders, excavators, trenchers, piling systems and haulage trucks provide real tasks in which mobility, work-tool control, material interaction, supervision and monitoring can be studied before the same logic is pushed into lunar or planetary operations.</w:t>
-      </w:r>
-    </w:p>
     <w:bookmarkEnd w:id="64"/>
-    <w:bookmarkStart w:id="65" w:name="limitations"/>
-    <w:p>
-      <w:pPr>
-        <w:pStyle w:val="Heading3"/>
-      </w:pPr>
-      <w:r>
-        <w:t xml:space="preserve">9.4 Limitations</w:t>
-      </w:r>
-    </w:p>
-    <w:p>
-      <w:pPr>
-        <w:pStyle w:val="FirstParagraph"/>
-      </w:pPr>
-      <w:r>
-        <w:t xml:space="preserve">This review has five limitations.</w:t>
-      </w:r>
-    </w:p>
-    <w:p>
-      <w:pPr>
-        <w:pStyle w:val="BodyText"/>
-      </w:pPr>
-      <w:r>
-        <w:t xml:space="preserve">First, several standards are used through official status pages, public previews or mapped secondary materials. Clause-level claims require authorized full-text access and final verification. This also applies to adjacent standards such as ISO 18497-1:2024: its public page can support publication status, scope summary and boundary discussion, but not detailed clause interpretation.</w:t>
-      </w:r>
-    </w:p>
-    <w:p>
-      <w:pPr>
-        <w:pStyle w:val="BodyText"/>
-      </w:pPr>
-      <w:r>
-        <w:t xml:space="preserve">Second, public company cases are used only as scenario anchors. They are not evidence of independent safety assurance, customer acceptance, operating KPI or long-term safety performance.</w:t>
-      </w:r>
-    </w:p>
-    <w:p>
-      <w:pPr>
-        <w:pStyle w:val="BodyText"/>
-      </w:pPr>
-      <w:r>
-        <w:t xml:space="preserve">Third, the current framework requires anonymized field samples. Without field samples, it remains a structured review and conceptual framework rather than a validated deployment methodology.</w:t>
-      </w:r>
-    </w:p>
-    <w:p>
-      <w:pPr>
-        <w:pStyle w:val="BodyText"/>
-      </w:pPr>
-      <w:r>
-        <w:t xml:space="preserve">Fourth, the paper focuses on selected high-demand scenarios: wheel-loader loading, trenching, solar piling and autonomous haulage. Other engineering vehicles, including cranes, graders, bulldozers, road rollers, underground mining machines and agricultural-adjacent mobile machines, require further adaptation.</w:t>
-      </w:r>
-    </w:p>
-    <w:p>
-      <w:pPr>
-        <w:pStyle w:val="BodyText"/>
-      </w:pPr>
-      <w:r>
-        <w:t xml:space="preserve">Fifth, space mining is treated as an extreme-environment extension. It is useful for conceptual stress-testing but does not provide direct evidence for current terrestrial standards.</w:t>
-      </w:r>
-    </w:p>
-    <w:bookmarkEnd w:id="65"/>
-    <w:bookmarkStart w:id="66" w:name="conclusions"/>
-    <w:p>
-      <w:pPr>
-        <w:pStyle w:val="Heading3"/>
-      </w:pPr>
-      <w:r>
-        <w:t xml:space="preserve">9.5 Conclusions</w:t>
-      </w:r>
-    </w:p>
-    <w:p>
-      <w:pPr>
-        <w:pStyle w:val="FirstParagraph"/>
-      </w:pPr>
-      <w:r>
-        <w:t xml:space="preserve">Autonomous engineering vehicles should not be understood as low-speed automated cars. They are mobile working machine systems. Their safety assurance must cover movement, work equipment, material interaction, task quality, remote supervision, site organization, operational monitoring and change management.</w:t>
-      </w:r>
-    </w:p>
-    <w:p>
-      <w:pPr>
-        <w:pStyle w:val="BodyText"/>
-      </w:pPr>
-      <w:r>
-        <w:t xml:space="preserve">Road-vehicle safety methods remain highly valuable when they are transferred as problem structures. Functional safety, SOTIF, cybersecurity, AI safety, scenario-based testing and safety cases can organize the evidence chain. However, the rating labels, road-scenario assumptions and road-traffic consequence models must be rewritten.</w:t>
-      </w:r>
-    </w:p>
-    <w:p>
-      <w:pPr>
-        <w:pStyle w:val="BodyText"/>
-      </w:pPr>
-      <w:r>
-        <w:t xml:space="preserve">The proposed MWMS, WTDC and DMWT concepts provide a practical bridge from safe driving to safe working. They allow researchers to deepen the problem, standardization groups to define task-specific evaluation guidance, and companies to build deployment evidence that goes beyond demonstrations. The central safety question is not whether an engineering vehicle can drive autonomously. It is whether the system can safely complete bounded work, keep its assumptions visible and update its evidence as the worksite changes.</w:t>
-      </w:r>
-    </w:p>
-    <w:bookmarkEnd w:id="66"/>
-    <w:bookmarkEnd w:id="67"/>
-    <w:bookmarkStart w:id="68" w:name="references"/>
+    <w:bookmarkStart w:id="65" w:name="references"/>
     <w:p>
       <w:pPr>
         <w:pStyle w:val="Heading2"/>
@@ -5126,8 +5367,8 @@
         <w:t xml:space="preserve">[60] International Organization for Standardization. ISO 18497-1:2024 Agricultural machinery and tractors - Safety of partially automated, semi-autonomous and autonomous machinery - Part 1: Machine design principles and vocabulary. International Organization for Standardization, Geneva, 2024. https://www.iso.org/standard/82684.html (accessed 2026-06-04).</w:t>
       </w:r>
     </w:p>
-    <w:bookmarkEnd w:id="68"/>
-    <w:bookmarkEnd w:id="69"/>
+    <w:bookmarkEnd w:id="65"/>
+    <w:bookmarkEnd w:id="66"/>
     <w:sectPr>
       <w:footnotePr>
         <w:numRestart w:val="eachSect"/>

</xml_diff>

<commit_message>
Polish manuscript academic tone
</commit_message>
<xml_diff>
--- a/paper/manuscript-en.docx
+++ b/paper/manuscript-en.docx
@@ -282,17 +282,17 @@
         <w:pStyle w:val="BodyText"/>
       </w:pPr>
       <w:r>
-        <w:t xml:space="preserve">The safety question therefore changes from safe driving to safe working. Road vehicles mainly need to justify safe dynamic driving behaviour under road traffic conditions. Engineering vehicles need to justify safe work under defined worksite and task conditions. Movement remains important, but it is no longer the whole task. The work equipment, material interaction, task quality, site organization, remote supervision and operational monitoring become part of the safety assurance object.</w:t>
+        <w:t xml:space="preserve">The safety argument therefore expands from safe driving to safe working. Road vehicles mainly need to justify safe dynamic driving behaviour under road traffic conditions. Engineering vehicles need to justify safe work under defined worksite and task conditions. Mobility remains necessary, while the complete task also includes work equipment, material interaction, task quality, site organization, remote supervision and operational monitoring.</w:t>
       </w:r>
     </w:p>
     <w:bookmarkEnd w:id="13"/>
-    <w:bookmarkStart w:id="14" w:name="X24a13cc9125503318e2b773fdc5d553be1530e4"/>
+    <w:bookmarkStart w:id="14" w:name="fragmentation-in-the-standards-landscape"/>
     <w:p>
       <w:pPr>
         <w:pStyle w:val="Heading3"/>
       </w:pPr>
       <w:r>
-        <w:t xml:space="preserve">1.2 The problem is not a lack of every standard</w:t>
+        <w:t xml:space="preserve">1.2 Fragmentation in the standards landscape</w:t>
       </w:r>
     </w:p>
     <w:p>
@@ -300,33 +300,33 @@
         <w:pStyle w:val="FirstParagraph"/>
       </w:pPr>
       <w:r>
-        <w:t xml:space="preserve">A common starting point is to say that autonomous engineering vehicles lack standards. That statement is too broad. Earth-moving machinery, mining machines, machinery control systems, remote operation, collision warning and collision avoidance already have relevant standards and guidance. ISO 17757 addresses autonomous and semi-autonomous machine systems for earth-moving machinery and mining. ISO 19014 provides a functional safety framework for safety-related parts of control systems on earth-moving machinery. ISO 15817 addresses remote operator control systems. ISO 21815 addresses collision warning and collision avoidance systems. Industry guidance such as GMG documents discusses autonomous mining systems, operational readiness, system safety, change management, hazard logs and safety cases [7, 8, 12, 13, 14, 15, 9, 16, 10, 17].</w:t>
-      </w:r>
-    </w:p>
-    <w:p>
-      <w:pPr>
-        <w:pStyle w:val="BodyText"/>
-      </w:pPr>
-      <w:r>
-        <w:t xml:space="preserve">The more precise problem is fragmentation. Existing standards and guidance cover important local parts of the assurance problem, but they do not yet form a unified evidence chain for AI-enabled mobile work. They do not by themselves connect worksite conditions, dynamic work tasks, function insufficiencies, trigger conditions, work-equipment hazards, quality consequences, remote supervision, testing, operational monitoring and safety cases. In China, national, industry and group standards are also moving into autonomous earth-moving machinery, unmanned off-highway dump trucks and open-pit unmanned transport. In adjacent non-road machinery, ISO 18497-1:2024 addresses design principles and vocabulary for partially automated, semi-autonomous and autonomous agricultural machinery and tractors. It is not an engineering-vehicle standard, but it shows that automated mobile work outside public roads is also being treated through machine type, task boundary, safe working information and verification-oriented design principles [60]. In parallel, a national-standard project on robot SOTIF entered public consultation on 2 June 2026, with the consultation period ending on 2 July 2026 and a stated 18-month project cycle. Its public scope concerns mobile robot systems with environmental perception, information processing and autonomous or semi-autonomous decision-making, including ODD declaration, scenario classification, triggering conditions, functional insufficiencies, hazard-chain construction, risk evaluation and mitigation. This is an adjacent standardization signal for mobile physical AI, not a published requirement for intelligent construction or mining machinery. These sources are important standardization signals, but official status pages and draft or project information cannot be used as final technical requirements without authorized texts or confirmed official documents [18, 19, 20, 21, 22, 23].</w:t>
-      </w:r>
-    </w:p>
-    <w:p>
-      <w:pPr>
-        <w:pStyle w:val="BodyText"/>
-      </w:pPr>
-      <w:r>
-        <w:t xml:space="preserve">This paper therefore does not claim that the field is empty. It claims that the field needs a safety assurance framework that organizes road-vehicle safety methods, machinery safety standards, autonomous mining guidance, construction automation research, public company cases and future field evidence into a common structure.</w:t>
+        <w:t xml:space="preserve">Autonomous engineering vehicles already have a partial standards foundation. Earth-moving machinery, mining machines, machinery control systems, remote operation, collision warning and collision avoidance all have relevant standards and guidance. ISO 17757 addresses autonomous and semi-autonomous machine systems for earth-moving machinery and mining. ISO 19014 provides a functional safety framework for safety-related parts of control systems on earth-moving machinery. ISO 15817 addresses remote operator control systems. ISO 21815 addresses collision warning and collision avoidance systems. Industry guidance such as GMG documents discusses autonomous mining systems, operational readiness, system safety, change management, hazard logs and safety cases [7, 8, 12, 13, 14, 15, 9, 16, 10, 17].</w:t>
+      </w:r>
+    </w:p>
+    <w:p>
+      <w:pPr>
+        <w:pStyle w:val="BodyText"/>
+      </w:pPr>
+      <w:r>
+        <w:t xml:space="preserve">The present difficulty is fragmentation. Existing standards and guidance cover important local parts of the assurance problem, but they do not yet form a unified evidence chain for AI-enabled mobile work. They do not systematically connect worksite conditions, dynamic work tasks, function insufficiencies, trigger conditions, work-equipment hazards, quality consequences, remote supervision, testing, operational monitoring and safety cases. In China, national, industry and group standards are also moving into autonomous earth-moving machinery, unmanned off-highway dump trucks and open-pit unmanned transport. In adjacent non-road machinery, ISO 18497-1:2024 addresses design principles and vocabulary for partially automated, semi-autonomous and autonomous agricultural machinery and tractors. Although it is outside the engineering-vehicle domain, it shows that automated mobile work beyond public roads is also being treated through machine type, task boundary, safe working information and verification-oriented design principles [60]. In parallel, a national-standard project on robot SOTIF entered public consultation on 2 June 2026, with the consultation period ending on 2 July 2026 and a stated 18-month project cycle. Its public scope concerns mobile robot systems with environmental perception, information processing and autonomous or semi-autonomous decision-making, including ODD declaration, scenario classification, triggering conditions, functional insufficiencies, hazard-chain construction, risk evaluation and mitigation. This project is an adjacent standardization signal for mobile physical AI, but it is not yet a published requirement for intelligent construction or mining machinery. These sources are valuable standardization signals; without authorized texts or confirmed official documents, official status pages and draft or project information should not be used as final technical requirements [18, 19, 20, 21, 22, 23].</w:t>
+      </w:r>
+    </w:p>
+    <w:p>
+      <w:pPr>
+        <w:pStyle w:val="BodyText"/>
+      </w:pPr>
+      <w:r>
+        <w:t xml:space="preserve">On this basis, the paper proposes a safety assurance framework that organizes road-vehicle safety methods, machinery safety standards, autonomous mining guidance, construction automation research, public company cases and future field evidence into a common structure.</w:t>
       </w:r>
     </w:p>
     <w:bookmarkEnd w:id="14"/>
-    <w:bookmarkStart w:id="15" w:name="X158cfa96bc338a6794880c11de516a6e47a4bc1"/>
+    <w:bookmarkStart w:id="15" w:name="X996ad9409a6bfbe37dfc5697dcc7e3a646497ac"/>
     <w:p>
       <w:pPr>
         <w:pStyle w:val="Heading3"/>
       </w:pPr>
       <w:r>
-        <w:t xml:space="preserve">1.3 Why road-vehicle methods are useful but cannot be copied</w:t>
+        <w:t xml:space="preserve">1.3 Transfer boundaries of road-vehicle safety methods</w:t>
       </w:r>
     </w:p>
     <w:p>
@@ -334,23 +334,23 @@
         <w:pStyle w:val="FirstParagraph"/>
       </w:pPr>
       <w:r>
-        <w:t xml:space="preserve">Road-vehicle safety methods are useful because they provide mature problem structures. They force engineers to define system boundaries, operating conditions, hazards, insufficiencies, trigger conditions, verification evidence, residual risk and operational monitoring. Functional safety separates failure-related risk from normal performance limitations. SOTIF focuses attention on the gap between intended functionality and real-world conditions. Cybersecurity engineering links assets, threats, attack paths and safety-relevant consequences. Scenario-based testing helps organize test coverage beyond distance accumulation. Safety cases make explicit the relationship between claims, arguments, evidence, assumptions and limitations [1, 2, 3, 5, 6].</w:t>
-      </w:r>
-    </w:p>
-    <w:p>
-      <w:pPr>
-        <w:pStyle w:val="BodyText"/>
-      </w:pPr>
-      <w:r>
-        <w:t xml:space="preserve">However, direct copying would be misleading. ASIL is not a machinery performance level. SAE driving automation levels are defined for on-road motor vehicles and cannot express the automation level of a bucket, boom, breaker, grapple or piling mechanism. Road-vehicle ODD does not cover material state, attachment configuration, underground utilities, task quality or site production constraints. Road-scenario taxonomies do not directly describe stockpiles, trenches, piles, haul roads, loading zones or controlled work areas. Road-vehicle exposure, controllability and injury assumptions do not directly capture property damage, production delay, rework, quality failure, environmental damage and recovery capability [24, 25].</w:t>
-      </w:r>
-    </w:p>
-    <w:p>
-      <w:pPr>
-        <w:pStyle w:val="BodyText"/>
-      </w:pPr>
-      <w:r>
-        <w:t xml:space="preserve">The principle used in this paper is therefore to transfer problem structures, not rating labels. Road-vehicle methods are treated as methodological donors. Engineering vehicles are treated as mobile working machine systems whose assurance requires new system boundaries, operating conditions, task definitions and claim boundaries.</w:t>
+        <w:t xml:space="preserve">Road-vehicle safety methods provide mature problem structures. They require engineers to define system boundaries, operating conditions, hazards, insufficiencies, trigger conditions, verification evidence, residual risk and operational monitoring. Functional safety separates failure-related risk from normal performance limitations. SOTIF focuses attention on the gap between intended functionality and real-world conditions. Cybersecurity engineering links assets, threats, attack paths and safety-relevant consequences. Scenario-based testing helps organize test coverage beyond distance accumulation. Safety cases make explicit the relationship between claims, arguments, evidence, assumptions and limitations [1, 2, 3, 5, 6].</w:t>
+      </w:r>
+    </w:p>
+    <w:p>
+      <w:pPr>
+        <w:pStyle w:val="BodyText"/>
+      </w:pPr>
+      <w:r>
+        <w:t xml:space="preserve">Direct transfer of rating labels and scenario assumptions would create boundary errors. ASIL is distinct from machinery performance levels. SAE driving automation levels are defined for on-road motor vehicles and do not express the automation level of a bucket, boom, breaker, grapple or piling mechanism. Road-vehicle ODD does not cover material state, attachment configuration, underground utilities, task quality or site production constraints. Road-scenario taxonomies do not directly describe stockpiles, trenches, piles, haul roads, loading zones or controlled work areas. Road-vehicle exposure, controllability and injury assumptions are insufficient for property damage, production delay, rework, quality failure, environmental damage and recovery capability [24, 25].</w:t>
+      </w:r>
+    </w:p>
+    <w:p>
+      <w:pPr>
+        <w:pStyle w:val="BodyText"/>
+      </w:pPr>
+      <w:r>
+        <w:t xml:space="preserve">The paper therefore transfers problem structures. Road-vehicle methods are treated as methodological donors, while engineering vehicles are treated as mobile working machine systems whose assurance requires redefined system boundaries, operating conditions, task structures and claim boundaries.</w:t>
       </w:r>
     </w:p>
     <w:bookmarkEnd w:id="15"/>
@@ -368,7 +368,7 @@
         <w:pStyle w:val="FirstParagraph"/>
       </w:pPr>
       <w:r>
-        <w:t xml:space="preserve">This review covers autonomous and intelligent engineering vehicles that combine mobility with physical work. The main examples are wheel loaders, excavators, mining haulage trucks, trenching machines, solar piling systems and adjacent construction robots. The paper also discusses lunar resource operations and space mining as an extreme-environment extension of mobile working-machine safety, not as evidence for current terrestrial standards.</w:t>
+        <w:t xml:space="preserve">This review covers autonomous and intelligent engineering vehicles that combine mobility with physical work. The main examples are wheel loaders, excavators, mining haulage trucks, trenching machines, solar piling systems and adjacent construction robots. The paper also discusses lunar resource operations and space mining as an extreme-environment extension of mobile working-machine safety; those materials are not used as evidence for current terrestrial standards.</w:t>
       </w:r>
     </w:p>
     <w:p>
@@ -384,15 +384,15 @@
         <w:pStyle w:val="BodyText"/>
       </w:pPr>
       <w:r>
-        <w:t xml:space="preserve">First, it reframes autonomous engineering-vehicle safety from safe driving to safe working. Second, it maps the relationship between road-vehicle safety methods, earth-moving and mining-machine standards, autonomous mining guidance, construction automation research, public company cases and standardization processes. Third, it proposes three concepts: mobile working machine system (MWMS), worksite and task design conditions (WTDC), and dynamic moving and working task (DMWT). Fourth, it identifies which road-vehicle safety concepts can be transferred and which rating labels, scenario ontologies and risk assumptions should not be copied. Fifth, it shows how the framework can be applied to wheel-loader, trenching, solar piling and autonomous haulage scenarios, while maintaining strict boundaries between public scenario anchors and verified field evidence.</w:t>
-      </w:r>
-    </w:p>
-    <w:p>
-      <w:pPr>
-        <w:pStyle w:val="BodyText"/>
-      </w:pPr>
-      <w:r>
-        <w:t xml:space="preserve">This paper offers a structured synthesis and a practitioner-facing problem frame. Its purpose is to open a safety assurance problem that can be deepened by researchers and implemented by equipment manufacturers, automation solution providers, testing organizations, construction operators, mining operators and standardization groups.</w:t>
+        <w:t xml:space="preserve">First, it reframes autonomous engineering-vehicle safety from safe driving to safe working. Second, it maps the relationship between road-vehicle safety methods, earth-moving and mining-machine standards, autonomous mining guidance, construction automation research, public company cases and standardization processes. Third, it proposes three concepts: mobile working machine system (MWMS), worksite and task design conditions (WTDC), and dynamic moving and working task (DMWT). Fourth, it identifies transferable components of road-vehicle safety concepts and the required reconstruction of rating labels, scenario ontologies and risk assumptions. Fifth, it shows how the framework can be applied to wheel-loader, trenching, solar piling and autonomous haulage scenarios, while maintaining strict boundaries between public scenario anchors and verified field evidence.</w:t>
+      </w:r>
+    </w:p>
+    <w:p>
+      <w:pPr>
+        <w:pStyle w:val="BodyText"/>
+      </w:pPr>
+      <w:r>
+        <w:t xml:space="preserve">This paper offers a structured synthesis and a practitioner-facing problem frame for further development by researchers, equipment manufacturers, automation solution providers, testing organizations, construction operators, mining operators and standardization groups.</w:t>
       </w:r>
     </w:p>
     <w:bookmarkEnd w:id="16"/>
@@ -420,15 +420,15 @@
         <w:pStyle w:val="FirstParagraph"/>
       </w:pPr>
       <w:r>
-        <w:t xml:space="preserve">This paper is positioned as a systematized scoping review with a conceptual framework. It is not claimed as a complete PRISMA systematic review. The reason is methodological honesty: the current evidence base combines standards, official standard status pages, peer-reviewed papers, industry guidance, public company pages, candidate papers, public notices and future anonymized field samples. These source types do not carry the same evidentiary responsibility. They should not be counted or interpreted as if they were a single homogeneous literature pool.</w:t>
-      </w:r>
-    </w:p>
-    <w:p>
-      <w:pPr>
-        <w:pStyle w:val="BodyText"/>
-      </w:pPr>
-      <w:r>
-        <w:t xml:space="preserve">Table 1 summarizes the systematized scoping-review workflow used in this paper. The workflow begins with protocol definition and proceeds through source identification, source verification, screening and eligibility, evidence classification, framework coding and synthesis. Its purpose is not to create a decorative process figure. It is to make the evidence boundary explicit: which materials can support clause-level claims, which can only support standardization-status claims, which can anchor public scenarios, and which should remain future research leads.</w:t>
+        <w:t xml:space="preserve">This paper is positioned as a systematized scoping review with a conceptual framework, rather than a complete PRISMA systematic review. This positioning follows from the heterogeneity of the evidence base: standards, official standard status pages, peer-reviewed papers, industry guidance, public company pages, candidate papers, public notices and future anonymized field samples carry different evidentiary responsibilities and should not be counted or interpreted as a single homogeneous literature pool.</w:t>
+      </w:r>
+    </w:p>
+    <w:p>
+      <w:pPr>
+        <w:pStyle w:val="BodyText"/>
+      </w:pPr>
+      <w:r>
+        <w:t xml:space="preserve">Table 1 summarizes the systematized scoping-review workflow used in this paper. The workflow begins with protocol definition and proceeds through source identification, source verification, screening and eligibility, evidence classification, framework coding and synthesis. Its function is to make the evidence boundary explicit: which materials can support clause-level claims, which can only support standardization-status claims, which can anchor public scenarios, and which should remain future research leads.</w:t>
       </w:r>
     </w:p>
     <w:p>
@@ -519,7 +519,7 @@
               <w:pStyle w:val="Compact"/>
             </w:pPr>
             <w:r>
-              <w:t xml:space="preserve">Produces a scoping-review protocol, topic list and exclusion rules; not claimed as a full PRISMA systematic review</w:t>
+              <w:t xml:space="preserve">Produces a scoping-review protocol, topic list and exclusion rules; boundary is a non-PRISMA systematized scoping review</w:t>
             </w:r>
           </w:p>
         </w:tc>
@@ -1349,7 +1349,7 @@
         <w:pStyle w:val="BodyText"/>
       </w:pPr>
       <w:r>
-        <w:t xml:space="preserve">This classification is central to the manuscript. A company page can anchor a wheel-loader or solar-piling scenario, but it cannot prove safety certification, customer acceptance, operational KPI or a complete safety case. A peer-reviewed wheel-loader loading paper can support task variables, material interaction and performance measures, but it cannot prove product safety maturity. A standard status page can confirm a standard project or publication status, but it cannot support clause-level interpretation without authorized text. Industry guidance can support operational safety topics, but it should not be presented as a binding standard unless that status is independently confirmed.</w:t>
+        <w:t xml:space="preserve">This classification constrains how evidence is used in the manuscript. A company page can anchor a wheel-loader or solar-piling scenario, but it cannot prove safety certification, customer acceptance, operational KPI or a complete safety case. A peer-reviewed wheel-loader loading paper can support task variables, material interaction and performance measures, but it cannot prove product safety maturity. A standard status page can confirm a standard project or publication status, but it cannot support clause-level interpretation without authorized text. Industry guidance can support operational safety topics, but it should not be presented as a binding standard unless that status is independently confirmed.</w:t>
       </w:r>
     </w:p>
     <w:bookmarkEnd w:id="21"/>
@@ -1385,7 +1385,7 @@
         <w:pStyle w:val="BodyText"/>
       </w:pPr>
       <w:r>
-        <w:t xml:space="preserve">Engineering vehicles need this layered thinking, but the consequences must be rewritten. Personnel injury remains the highest-priority hazard. Yet unmanned worksites also make asset damage, infrastructure damage, underground utility damage, production interruption, schedule delay, task-quality failure, environmental harm and recovery capability central to the safety argument. A low-speed collision with a hopper, pile, trench wall or underground utility can be operationally severe. A task-quality error can create downstream hazards even if no immediate collision occurs.</w:t>
+        <w:t xml:space="preserve">Engineering vehicles can adopt this layered thinking, but the consequence model must be extended. Personnel injury remains the highest-priority hazard. Yet unmanned worksites also make asset damage, infrastructure damage, underground utility damage, production interruption, schedule delay, task-quality failure, environmental harm and recovery capability central to the safety argument. A low-speed collision with a hopper, pile, trench wall or underground utility can be operationally severe. A task-quality error can create downstream hazards even if no immediate collision occurs.</w:t>
       </w:r>
     </w:p>
     <w:bookmarkEnd w:id="23"/>
@@ -1403,15 +1403,15 @@
         <w:pStyle w:val="FirstParagraph"/>
       </w:pPr>
       <w:r>
-        <w:t xml:space="preserve">Functional safety provides a lifecycle framework for hazards caused by malfunctioning behaviour of safety-related electrical and electronic systems [1]. For engineering vehicles, the transferable value is not the direct use of road-vehicle ASIL labels. The transferable value is the structure: define the item or system, identify hazards, assess risk, define safety goals, decompose safety requirements, implement technical safety concepts and verify evidence through lifecycle activities.</w:t>
-      </w:r>
-    </w:p>
-    <w:p>
-      <w:pPr>
-        <w:pStyle w:val="BodyText"/>
-      </w:pPr>
-      <w:r>
-        <w:t xml:space="preserve">Engineering machinery should be interpreted through machinery-specific functional-safety concepts where applicable. ISO 19014 uses machinery-control-system language, including machine control system safety analysis and machine performance levels, rather than road-vehicle ASIL [8, 12, 13, 14]. This distinction matters. Wheel loaders, excavators and autonomous haulage trucks have steering, braking, hydraulic actuation, work equipment, emergency stop, remote operation and control-system interfaces that require functional-safety analysis, but the severity, exposure and controllability assumptions are not those of passenger cars in public traffic.</w:t>
+        <w:t xml:space="preserve">Functional safety provides a lifecycle framework for hazards caused by malfunctioning behaviour of safety-related electrical and electronic systems [1]. For engineering vehicles, its transferable value lies mainly in the structure: define the item or system, identify hazards, assess risk, define safety goals, decompose safety requirements, implement technical safety concepts and verify evidence through lifecycle activities.</w:t>
+      </w:r>
+    </w:p>
+    <w:p>
+      <w:pPr>
+        <w:pStyle w:val="BodyText"/>
+      </w:pPr>
+      <w:r>
+        <w:t xml:space="preserve">Engineering machinery should be interpreted through machinery-specific functional-safety concepts where applicable. ISO 19014 uses machinery-control-system language, including machine control system safety analysis and machine performance levels, and is distinct from road-vehicle ASIL [8, 12, 13, 14]. This distinction directly affects risk-parameter interpretation. Wheel loaders, excavators and autonomous haulage trucks have steering, braking, hydraulic actuation, work equipment, emergency stop, remote operation and control-system interfaces that require functional-safety analysis, but the severity, exposure and controllability assumptions differ from those of passenger cars in public traffic.</w:t>
       </w:r>
     </w:p>
     <w:bookmarkEnd w:id="24"/>
@@ -1429,15 +1429,15 @@
         <w:pStyle w:val="FirstParagraph"/>
       </w:pPr>
       <w:r>
-        <w:t xml:space="preserve">Safety of the Intended Functionality addresses unreasonable risk caused by intended-function insufficiencies or reasonably foreseeable misuse in the absence of system faults [2]. Its value for engineering vehicles is direct but must be extended. In road vehicles, typical SOTIF concerns include perception limitations under rain, fog, glare, occlusion, unusual objects or construction zones. In engineering vehicles, similar insufficiencies occur in different physical forms: stockpile boundary recognition, bucket load estimation, trench geometry estimation, underground-utility map accuracy, dust and mud visibility, tool-pose estimation, material-state recognition and work-quality judgement.</w:t>
-      </w:r>
-    </w:p>
-    <w:p>
-      <w:pPr>
-        <w:pStyle w:val="BodyText"/>
-      </w:pPr>
-      <w:r>
-        <w:t xml:space="preserve">The SOTIF risk chain for engineering vehicles should therefore include function intention, function insufficiency, trigger condition, hazardous event, task consequence, mitigation and evidence. A loader may underperform not because a component has failed, but because unknown material, dust or stockpile evolution causes insufficient loading behaviour. An excavator may be unsafe not because its actuator fails, but because map-to-site alignment, soil condition or underground-utility uncertainty triggers an inadequate digging plan. A piling robot may create unacceptable downstream risk through positioning or verticality errors even when no collision occurs.</w:t>
+        <w:t xml:space="preserve">Safety of the Intended Functionality addresses unreasonable risk caused by intended-function insufficiencies or reasonably foreseeable misuse in the absence of system faults [2]. Its value for engineering vehicles is direct, while the application object must be extended. In road vehicles, typical SOTIF concerns include perception limitations under rain, fog, glare, occlusion, unusual objects or construction zones. In engineering vehicles, similar insufficiencies occur in different physical forms: stockpile boundary recognition, bucket load estimation, trench geometry estimation, underground-utility map accuracy, dust and mud visibility, tool-pose estimation, material-state recognition and work-quality judgement.</w:t>
+      </w:r>
+    </w:p>
+    <w:p>
+      <w:pPr>
+        <w:pStyle w:val="BodyText"/>
+      </w:pPr>
+      <w:r>
+        <w:t xml:space="preserve">The SOTIF risk chain for engineering vehicles should therefore include function intention, function insufficiency, trigger condition, hazardous event, task consequence, mitigation and evidence. A loader may underperform in the absence of component failure when unknown material, dust or stockpile evolution causes insufficient loading behaviour. An excavator may generate an unsafe plan in the absence of actuator failure when map-to-site alignment, soil condition or underground-utility uncertainty triggers an inadequate digging plan. A piling robot may create unacceptable downstream risk through positioning or verticality errors even when no collision occurs.</w:t>
       </w:r>
     </w:p>
     <w:bookmarkEnd w:id="25"/>
@@ -1463,7 +1463,7 @@
         <w:pStyle w:val="BodyText"/>
       </w:pPr>
       <w:r>
-        <w:t xml:space="preserve">AI safety is also broader than object detection. Autonomous engineering vehicles may use AI for terrain traversability, stockpile perception, material recognition, work-tool control, task planning, safety monitoring and report generation. ISO/PAS 8800 provides a road-vehicle AI safety reference point, but engineering vehicles require additional attention to worksite distribution shift, material variation, attachment state, work-tool dynamics and task-quality verification [4].</w:t>
+        <w:t xml:space="preserve">AI safety extends beyond object detection. Autonomous engineering vehicles may use AI for terrain traversability, stockpile perception, material recognition, work-tool control, task planning, safety monitoring and report generation. ISO/PAS 8800 provides a road-vehicle AI safety reference point, but engineering vehicles require additional attention to worksite distribution shift, material variation, attachment state, work-tool dynamics and task-quality verification [4].</w:t>
       </w:r>
     </w:p>
     <w:bookmarkEnd w:id="26"/>
@@ -1481,15 +1481,15 @@
         <w:pStyle w:val="FirstParagraph"/>
       </w:pPr>
       <w:r>
-        <w:t xml:space="preserve">Scenario-based testing helps move the discussion beyond mileage or operating hours [5]. For engineering vehicles, the corresponding question is not only how many hours the machine has operated, but which worksite conditions, task conditions, material states, tool states, supervision modes and abnormal events have been covered. Road-vehicle scenario layers are useful as a structuring idea, but the layers must be rewritten for worksite and task design conditions [25].</w:t>
-      </w:r>
-    </w:p>
-    <w:p>
-      <w:pPr>
-        <w:pStyle w:val="BodyText"/>
-      </w:pPr>
-      <w:r>
-        <w:t xml:space="preserve">Safety cases are needed because engineering-vehicle autonomy is a multi-party system problem. A single test result cannot establish safety for a machine, attachment, remote system, site infrastructure, supervision process, maintenance process and operating organization. UL 4600 is useful as a donor for claim-argument-evidence reasoning, even when the manuscript does not claim certification under that standard [6]. For autonomous engineering vehicles, a safety case should separate product assumptions from operational assumptions and show how evidence is maintained during changes in site, material, software, sensor configuration and supervision mode.</w:t>
+        <w:t xml:space="preserve">Scenario-based testing helps move evaluation from mileage or operating hours to coverage structure [5]. For engineering vehicles, the relevant question concerns which worksite conditions, task conditions, material states, tool states, supervision modes and abnormal events have been covered. Road-vehicle scenario layers are useful as a structuring idea, but the layers must be rewritten for worksite and task design conditions [25].</w:t>
+      </w:r>
+    </w:p>
+    <w:p>
+      <w:pPr>
+        <w:pStyle w:val="BodyText"/>
+      </w:pPr>
+      <w:r>
+        <w:t xml:space="preserve">Engineering-vehicle autonomy has multi-party system properties and therefore requires safety cases. A single test result cannot establish safety for a machine, attachment, remote system, site infrastructure, supervision process, maintenance process and operating organization. UL 4600 is useful as a donor for claim-argument-evidence reasoning, even when the manuscript does not claim certification under that standard [6]. For autonomous engineering vehicles, a safety case should separate product assumptions from operational assumptions and show how evidence is maintained during changes in site, material, software, sensor configuration and supervision mode.</w:t>
       </w:r>
     </w:p>
     <w:bookmarkEnd w:id="27"/>
@@ -1515,7 +1515,7 @@
         <w:pStyle w:val="BodyText"/>
       </w:pPr>
       <w:r>
-        <w:t xml:space="preserve">This paper therefore treats automation as a multi-dimensional property. Mobility automation, work-equipment automation and supervision mode should be described separately. A valid statement is not that a machine is L4, but that a specific mobile working machine system performs a specific dynamic moving and working task under specified worksite and task design conditions with specified supervision and fallback assumptions.</w:t>
+        <w:t xml:space="preserve">This paper therefore treats automation as a multi-dimensional property. Mobility automation, work-equipment automation and supervision mode should be described separately. A rigorous autonomy statement should specify that a particular mobile working machine system performs a particular dynamic moving and working task under specified worksite and task design conditions with specified supervision and fallback assumptions.</w:t>
       </w:r>
     </w:p>
     <w:bookmarkEnd w:id="28"/>
@@ -1551,7 +1551,7 @@
         <w:pStyle w:val="BodyText"/>
       </w:pPr>
       <w:r>
-        <w:t xml:space="preserve">The first layer is the object and basic machinery-safety foundation. Earth-moving machinery type definitions and traditional machinery safety requirements define what machines are and what general safety foundation they have. This layer is necessary but not sufficient for autonomous work.</w:t>
+        <w:t xml:space="preserve">The first layer is the object and basic machinery-safety foundation. Earth-moving machinery type definitions and traditional machinery safety requirements define machine types and general safety foundations. This layer is necessary but not sufficient for autonomous work.</w:t>
       </w:r>
     </w:p>
     <w:p>
@@ -1567,7 +1567,7 @@
         <w:pStyle w:val="BodyText"/>
       </w:pPr>
       <w:r>
-        <w:t xml:space="preserve">The third layer is autonomous and semi-autonomous machine systems. ISO 17757 and related national or local standards provide a system-safety entry point for autonomous earth-moving or mining machinery [7, 19]. Their significance is that they treat autonomy as a system-safety issue rather than only a vehicle-control issue. However, this paper does not interpret them as engineering-vehicle SOTIF standards.</w:t>
+        <w:t xml:space="preserve">The third layer is autonomous and semi-autonomous machine systems. ISO 17757 and related national or local standards provide a system-safety entry point for autonomous earth-moving or mining machinery [7, 19]. Their significance is that they treat autonomy as a system-safety issue and extend the analysis beyond vehicle control alone. This paper does not interpret them as engineering-vehicle SOTIF standards.</w:t>
       </w:r>
     </w:p>
     <w:p>
@@ -1603,13 +1603,13 @@
       </w:r>
     </w:p>
     <w:bookmarkEnd w:id="30"/>
-    <w:bookmarkStart w:id="31" w:name="X817e235d6f4a5c44c75543dcea0d4624c3b6f72"/>
+    <w:bookmarkStart w:id="31" w:name="X3a26744feefe5e66f19afc97c2416b5f06f8afd"/>
     <w:p>
       <w:pPr>
         <w:pStyle w:val="Heading3"/>
       </w:pPr>
       <w:r>
-        <w:t xml:space="preserve">4.2 What the current standards map can and cannot prove</w:t>
+        <w:t xml:space="preserve">4.2 Evidentiary scope and boundaries of the current standards map</w:t>
       </w:r>
     </w:p>
     <w:p>
@@ -1625,31 +1625,31 @@
         <w:pStyle w:val="BodyText"/>
       </w:pPr>
       <w:r>
-        <w:t xml:space="preserve">First, autonomous engineering-vehicle safety is not a blank field. There are existing standards and guidance for machinery safety, control-system functional safety, autonomous machine systems, remote operation, collision warning, collision avoidance and autonomous mining operations.</w:t>
-      </w:r>
-    </w:p>
-    <w:p>
-      <w:pPr>
-        <w:pStyle w:val="BodyText"/>
-      </w:pPr>
-      <w:r>
-        <w:t xml:space="preserve">Second, existing materials are fragmented across object definitions, control-system safety, remote operation, collision avoidance, mining guidance, national standards, group standards, adjacent non-road automation standards and adjacent robot SOTIF project information. The robot SOTIF project helps show that ODD, scenario, triggering-condition, functional-insufficiency, hazard-chain and mitigation concepts are moving into mobile-robot standardization. ISO 18497-1 shows a parallel non-road route in which partially automated, semi-autonomous and autonomous machine functions are handled through machine design principles, vocabulary, safe working information and intended-use boundaries [60]. Neither source provides a direct compliance template for engineering vehicles. The current materials still do not provide a unified evidence chain for AI-enabled mobile work across machine, work equipment, material, site, task quality, remote supervision and operational monitoring.</w:t>
-      </w:r>
-    </w:p>
-    <w:p>
-      <w:pPr>
-        <w:pStyle w:val="BodyText"/>
-      </w:pPr>
-      <w:r>
-        <w:t xml:space="preserve">Third, road-vehicle methods can help organize the missing evidence chain, but they cannot serve as direct compliance templates. The contribution is methodological integration, not a claim that one road-vehicle standard solves engineering-vehicle autonomy.</w:t>
-      </w:r>
-    </w:p>
-    <w:p>
-      <w:pPr>
-        <w:pStyle w:val="BodyText"/>
-      </w:pPr>
-      <w:r>
-        <w:t xml:space="preserve">The map cannot prove clause-level requirements where only official status pages or previews are available. It cannot prove that a company product has achieved independent safety assurance. It cannot prove operational KPI, customer acceptance or complete safety cases from public product pages. It also cannot use space-mining or lunar-resource materials as evidence for current terrestrial engineering-vehicle standards.</w:t>
+        <w:t xml:space="preserve">First, autonomous engineering-vehicle safety has an existing standards foundation. There are existing standards and guidance for machinery safety, control-system functional safety, autonomous machine systems, remote operation, collision warning, collision avoidance and autonomous mining operations.</w:t>
+      </w:r>
+    </w:p>
+    <w:p>
+      <w:pPr>
+        <w:pStyle w:val="BodyText"/>
+      </w:pPr>
+      <w:r>
+        <w:t xml:space="preserve">Second, existing materials are fragmented across object definitions, control-system safety, remote operation, collision avoidance, mining guidance, national standards, group standards, adjacent non-road automation standards and adjacent robot SOTIF project information. The robot SOTIF project helps show that ODD, scenario, triggering-condition, functional-insufficiency, hazard-chain and mitigation concepts are moving into mobile-robot standardization. ISO 18497-1 shows a parallel non-road route in which partially automated, semi-autonomous and autonomous machine functions are handled through machine design principles, vocabulary, safe working information and intended-use boundaries [60]. Neither source constitutes a direct compliance template for engineering vehicles. The current materials still do not provide a unified evidence chain for AI-enabled mobile work across machine, work equipment, material, site, task quality, remote supervision and operational monitoring.</w:t>
+      </w:r>
+    </w:p>
+    <w:p>
+      <w:pPr>
+        <w:pStyle w:val="BodyText"/>
+      </w:pPr>
+      <w:r>
+        <w:t xml:space="preserve">Third, road-vehicle methods can help organize the missing evidence chain, but they cannot serve as direct compliance templates. The contribution is methodological integration rather than a claim that one road-vehicle standard solves engineering-vehicle autonomy.</w:t>
+      </w:r>
+    </w:p>
+    <w:p>
+      <w:pPr>
+        <w:pStyle w:val="BodyText"/>
+      </w:pPr>
+      <w:r>
+        <w:t xml:space="preserve">The evidentiary scope of the map is also bounded: official status pages or previews cannot prove clause-level requirements; public product pages cannot prove independent safety assurance, operational KPI, customer acceptance or complete safety cases; and space-mining or lunar-resource materials cannot serve as evidence for current terrestrial engineering-vehicle standards.</w:t>
       </w:r>
     </w:p>
     <w:bookmarkEnd w:id="31"/>
@@ -1675,15 +1675,15 @@
         <w:pStyle w:val="BodyText"/>
       </w:pPr>
       <w:r>
-        <w:t xml:space="preserve">This shift matters for evaluation. A wheel loader may produce unacceptable risk through repeated misloading even without collision. An excavator may produce unacceptable risk through systematic trench-depth error, slope instability or utility encroachment. A solar piling system may create downstream structural and construction risks through position or verticality errors. Autonomous haulage may create safety-relevant risk through communication disruption, localization uncertainty, remote-control failure or poor interaction between manual and autonomous traffic.</w:t>
-      </w:r>
-    </w:p>
-    <w:p>
-      <w:pPr>
-        <w:pStyle w:val="BodyText"/>
-      </w:pPr>
-      <w:r>
-        <w:t xml:space="preserve">The safety assurance target is therefore not only to avoid immediate impact. It is to show that a mobile working machine system can safely perform bounded work tasks, maintain task quality, monitor its assumptions and recover from abnormal states.</w:t>
+        <w:t xml:space="preserve">The extended consequence model changes evaluation. A wheel loader may produce unacceptable risk through repeated misloading even without collision. An excavator may produce unacceptable risk through systematic trench-depth error, slope instability or utility encroachment. A solar piling system may create downstream structural and construction risks through position or verticality errors. Autonomous haulage may create safety-relevant risk through communication disruption, localization uncertainty, remote-control failure or poor interaction between manual and autonomous traffic.</w:t>
+      </w:r>
+    </w:p>
+    <w:p>
+      <w:pPr>
+        <w:pStyle w:val="BodyText"/>
+      </w:pPr>
+      <w:r>
+        <w:t xml:space="preserve">The safety assurance target should therefore include immediate impact avoidance, safe completion of bounded work tasks, task-quality maintenance, assumption monitoring and recovery from abnormal states.</w:t>
       </w:r>
     </w:p>
     <w:bookmarkEnd w:id="32"/>
@@ -1701,7 +1701,7 @@
         <w:pStyle w:val="FirstParagraph"/>
       </w:pPr>
       <w:r>
-        <w:t xml:space="preserve">The remainder of the paper develops this standards map into a safety assurance framework. Section 5 will define MWMS, WTDC and DMWT as the three conceptual anchors. Section 6 will link these concepts to a SOTIF-oriented risk chain, scenario testing, operational monitoring and safety cases. Section 7 will use representative scenarios as templates for evidence collection, without treating public company pages as validation samples. Section 8 will discuss transfer limits, standardization gaps and the extreme-environment extension to lunar resource operations and space mining.</w:t>
+        <w:t xml:space="preserve">The remainder of the paper develops this standards map into a safety assurance framework. Section 5 will define MWMS, WTDC and DMWT as the three conceptual anchors. Section 6 will link these concepts to a SOTIF-oriented risk chain, scenario testing, operational monitoring and safety cases. Section 7 will use representative scenarios as templates for evidence collection and limit public company pages to scenario anchors. Section 8 will discuss transfer limits, standardization gaps and the extreme-environment extension to lunar resource operations and space mining.</w:t>
       </w:r>
     </w:p>
     <w:p>
@@ -1745,7 +1745,7 @@
         <w:pStyle w:val="BodyText"/>
       </w:pPr>
       <w:r>
-        <w:t xml:space="preserve">This definition is necessary because the risk source is distributed. A wheel loader is not only a mobile chassis; it also includes a bucket, boom, hydraulic actuation, material interaction, loading strategy, unloading interface, site traffic organization, remote stop capability and production procedure. A trenching excavator is not only a tracked vehicle; it includes a bucket or trenching attachment, digital construction plan, underground-utility assumptions, exclusion zones, spoil placement, operator confirmation rules and recovery procedures. A solar piling system is not only an autonomous rover; it includes piling equipment, pile feeding or handling, positioning references, verticality control, construction quality record and site acceptance procedure.</w:t>
+        <w:t xml:space="preserve">This definition reflects the distributed risk sources of autonomous engineering vehicles. In addition to the mobile chassis, a wheel-loader system includes the bucket, boom, hydraulic actuation, material interaction, loading strategy, unloading interface, site traffic organization, remote stop capability and production procedure. In addition to the tracked vehicle, a trenching excavator system includes the bucket or trenching attachment, digital construction plan, underground-utility assumptions, exclusion zones, spoil placement, operator confirmation rules and recovery procedures. In addition to the autonomous mobile base, a solar piling system includes piling equipment, pile feeding or handling, positioning references, verticality control, construction quality records and site acceptance procedures.</w:t>
       </w:r>
     </w:p>
     <w:p>
@@ -1761,7 +1761,7 @@
         <w:pStyle w:val="BodyText"/>
       </w:pPr>
       <w:r>
-        <w:t xml:space="preserve">MWMS prevents two common underestimations. First, low speed does not mean low risk. Work equipment can generate high forces, high moments and high-consequence contact events even when the machine moves slowly. Second, unmanned operation does not mean responsibility-free operation. Remote supervision, work permits, site isolation, maintenance, calibration, emergency stop, fallback and restart rules remain part of the safety argument.</w:t>
+        <w:t xml:space="preserve">The MWMS concept addresses two frequent underestimations. First, low speed is not equivalent to low risk. Work equipment can generate high forces, high moments and high-consequence contact events even when the machine moves slowly. Second, unmanned operation does not remove operational responsibility. Remote supervision, work permits, site isolation, maintenance, calibration, emergency stop, fallback and restart rules remain part of the safety argument.</w:t>
       </w:r>
     </w:p>
     <w:bookmarkEnd w:id="35"/>
@@ -2204,7 +2204,7 @@
         <w:pStyle w:val="BodyText"/>
       </w:pPr>
       <w:r>
-        <w:t xml:space="preserve">This layered WTDC structure is inspired by scenario-based safety evaluation and six-layer scenario modeling, but it is rewritten for worksite tasks rather than copied from road traffic [5, 25]. Its practical value is test design. An engineering-vehicle test should not only ask how many hours the machine has worked. It should ask which work areas, terrain states, material states, attachment states, task-quality requirements, communication states and supervision modes have been covered.</w:t>
+        <w:t xml:space="preserve">This layered WTDC structure is inspired by scenario-based safety evaluation and six-layer scenario modeling, but it is reorganized for worksite tasks [5, 25]. Its practical value is test design. Engineering-vehicle tests should extend from operating time to the coverage of work areas, terrain states, material states, attachment states, task-quality requirements, communication states and supervision modes.</w:t>
       </w:r>
     </w:p>
     <w:bookmarkEnd w:id="36"/>
@@ -2254,15 +2254,15 @@
         <w:pStyle w:val="BodyText"/>
       </w:pPr>
       <w:r>
-        <w:t xml:space="preserve">For autonomous haulage, DMWT includes route assignment, dispatch, loading-zone interaction, haul-road driving, dumping, interaction with manual traffic, remote monitoring, communication-failure response and maintenance interface. Autonomous haulage is therefore a mature reference for lifecycle and organizational assurance, but it is not a universal proof that loader, excavator or piling tasks are solved [10, 17, 33, 34].</w:t>
-      </w:r>
-    </w:p>
-    <w:p>
-      <w:pPr>
-        <w:pStyle w:val="BodyText"/>
-      </w:pPr>
-      <w:r>
-        <w:t xml:space="preserve">The DMWT concept changes the central question. The issue is not whether the machine can drive to a location by itself. The issue is whether the MWMS can safely, reliably and verifiably perform useful work under declared WTDC.</w:t>
+        <w:t xml:space="preserve">For autonomous haulage, DMWT includes route assignment, dispatch, loading-zone interaction, haul-road driving, dumping, interaction with manual traffic, remote monitoring, communication-failure response and maintenance interface. Autonomous haulage is therefore a mature reference for lifecycle and organizational assurance, but it cannot serve as universal proof that loader, excavator or piling tasks are solved [10, 17, 33, 34].</w:t>
+      </w:r>
+    </w:p>
+    <w:p>
+      <w:pPr>
+        <w:pStyle w:val="BodyText"/>
+      </w:pPr>
+      <w:r>
+        <w:t xml:space="preserve">The DMWT concept shifts the central question from autonomous mobility to useful work: whether the MWMS can safely, reliably and verifiably perform useful work under declared WTDC.</w:t>
       </w:r>
     </w:p>
     <w:bookmarkEnd w:id="37"/>
@@ -2843,7 +2843,7 @@
         <w:pStyle w:val="BodyText"/>
       </w:pPr>
       <w:r>
-        <w:t xml:space="preserve">A precise autonomy statement should therefore be written as follows: a specified MWMS performs a specified DMWT within specified WTDC with defined mobility automation, work-equipment automation, supervision mode and fallback assumptions. This formulation is less convenient than saying</w:t>
+        <w:t xml:space="preserve">A precise autonomy statement should therefore be written as follows: a specified MWMS performs a specified DMWT within specified WTDC with defined mobility automation, work-equipment automation, supervision mode and fallback assumptions. This formulation is less concise than</w:t>
       </w:r>
       <w:r>
         <w:t xml:space="preserve"> </w:t>
@@ -2852,7 +2852,7 @@
         <w:t xml:space="preserve">“Level 4 engineering vehicle”</w:t>
       </w:r>
       <w:r>
-        <w:t xml:space="preserve">, but it is safer and more useful for testing, operations and standardization.</w:t>
+        <w:t xml:space="preserve">, but it is more appropriate for testing, operations and standardization.</w:t>
       </w:r>
     </w:p>
     <w:bookmarkEnd w:id="39"/>
@@ -2870,7 +2870,7 @@
         <w:pStyle w:val="FirstParagraph"/>
       </w:pPr>
       <w:r>
-        <w:t xml:space="preserve">Recent work-system evidence from autonomous haulage reinforces the need to expand the assurance boundary. In an explorative case study of a Swedish open-pit copper mine, Lund shows that autonomous haulage redistributes rather than removes human responsibility: production in the autonomous zone still depends on on-site and control-room operators, while organisational routines, training, communication and continuous adaptation become part of the assurance problem [58]. For autonomous engineering vehicles, this supports treating autonomy as an autonomous work-system issue rather than a vehicle-only control issue.</w:t>
+        <w:t xml:space="preserve">Recent work-system evidence from autonomous haulage reinforces the need to expand the assurance boundary. In an explorative case study of a Swedish open-pit copper mine, Lund shows that autonomous haulage redistributes, rather than removes, human responsibility: production in the autonomous zone still depends on on-site and control-room operators, while organisational routines, training, communication and continuous adaptation become part of the assurance problem [58]. For autonomous engineering vehicles, this supports treating autonomy as an autonomous work-system issue rather than a vehicle-only control issue.</w:t>
       </w:r>
     </w:p>
     <w:p>
@@ -2886,7 +2886,7 @@
         <w:pStyle w:val="BodyText"/>
       </w:pPr>
       <w:r>
-        <w:t xml:space="preserve">Together, these two sources strengthen the paper’s central boundary shift. The assurance object is no longer only an automated machine. It is a mobile working machine system that includes the machine, work equipment, worksite, digital context, supervision model, organisational routines and evidence loop. This is also why recent source-page evidence on remote operation and AI-assisted site inspection should be treated carefully: both topics are relevant to the same work-system boundary, but abstract-level evidence should not be written as full-text close reading.</w:t>
+        <w:t xml:space="preserve">Together, these two sources strengthen the paper’s central boundary shift. The assurance object expands from an automated machine to a mobile working machine system that includes the machine, work equipment, worksite, digital context, supervision model, organisational routines and evidence loop. This is also why recent source-page evidence on remote operation and AI-assisted site inspection should be treated carefully: both topics are relevant to the same work-system boundary, but abstract-level evidence should not be written as full-text close reading.</w:t>
       </w:r>
     </w:p>
     <w:bookmarkEnd w:id="40"/>
@@ -3026,7 +3026,7 @@
         <w:pStyle w:val="FirstParagraph"/>
       </w:pPr>
       <w:r>
-        <w:t xml:space="preserve">This sequence reduces a common failure mode: demonstrating automation first and trying to reconstruct the safety argument afterward. For mobile working machines, a demonstration without MWMS boundary, WTDC, DMWT, risk chains, test coverage and operational monitoring is not a reviewable safety claim.</w:t>
+        <w:t xml:space="preserve">This sequence reduces the engineering risk of demonstrating automation before constructing the safety argument. For mobile working machines, a demonstration without MWMS boundary, WTDC, DMWT, risk chains, test coverage and operational monitoring cannot constitute a reviewable safety claim.</w:t>
       </w:r>
     </w:p>
     <w:bookmarkEnd w:id="42"/>
@@ -3251,7 +3251,7 @@
         <w:pStyle w:val="BodyText"/>
       </w:pPr>
       <w:r>
-        <w:t xml:space="preserve">For wheel-loader loading, tests should cover more than stable autonomous driving. They should cover stockpile height, material type, moisture, dust, temporary obstacles, hopper alignment, repeated cycles, localization drift, bucket mass estimation, spillage, loading time, hydraulic response and remote stop. Recent wheel-loader studies support this DMWT perspective by making unknown material, bucket material weight, loading time, factory sensors, hydraulic delay, sequential loading, pile-state evolution, mass, time and work explicit variables [35, 36].</w:t>
+        <w:t xml:space="preserve">For wheel-loader loading, tests should cover stable autonomous driving as well as stockpile height, material type, moisture, dust, temporary obstacles, hopper alignment, repeated cycles, localization drift, bucket mass estimation, spillage, loading time, hydraulic response and remote stop. Recent wheel-loader studies support this DMWT perspective by making unknown material, bucket material weight, loading time, factory sensors, hydraulic delay, sequential loading, pile-state evolution, mass, time and work explicit variables [35, 36].</w:t>
       </w:r>
     </w:p>
     <w:p>
@@ -3508,7 +3508,7 @@
         <w:pStyle w:val="BodyText"/>
       </w:pPr>
       <w:r>
-        <w:t xml:space="preserve">This model changes how evidence is interpreted. Bucket material weight, loading time, mass, time and work are important for DMWT testing and task quality, but they are not automatically safety metrics [35, 36]. A system can be efficient but unsafe; it can also be safe enough in a restricted mode but commercially impractical. Safety acceptance should therefore separate harm prevention, task-quality assurance, production continuity and operational recoverability.</w:t>
+        <w:t xml:space="preserve">This model changes how evidence is interpreted. Bucket material weight, loading time, mass, time and work are important for DMWT testing and task quality, but they do not automatically become safety metrics [35, 36]. A system can be efficient but unsafe; it can also be safe enough in a restricted mode but commercially impractical. Safety acceptance should therefore separate harm prevention, task-quality assurance, production continuity and operational recoverability.</w:t>
       </w:r>
     </w:p>
     <w:bookmarkEnd w:id="44"/>
@@ -3526,7 +3526,7 @@
         <w:pStyle w:val="FirstParagraph"/>
       </w:pPr>
       <w:r>
-        <w:t xml:space="preserve">Engineering-vehicle WTDC changes during operation. Stockpiles evolve, trenches change shape, soil becomes wet, temporary objects appear, communication quality fluctuates, sensors become dirty, software is updated and supervision practices drift. Operational monitoring is therefore part of the safety evidence chain, not an optional operations dashboard.</w:t>
+        <w:t xml:space="preserve">Engineering-vehicle WTDC changes during operation. Stockpiles evolve, trenches change shape, soil becomes wet, temporary objects appear, communication quality fluctuates, sensors become dirty, software is updated and supervision practices drift. Operational monitoring is therefore a necessary component of the safety evidence chain.</w:t>
       </w:r>
     </w:p>
     <w:p>
@@ -3664,7 +3664,7 @@
         <w:pStyle w:val="FirstParagraph"/>
       </w:pPr>
       <w:r>
-        <w:t xml:space="preserve">An autonomous engineering-vehicle safety case should connect claims, arguments, evidence, assumptions and limitations. Its value is not only regulatory presentation. It also gives product teams, site operators, maintenance teams, testing organizations and standardization groups a common evidence language [6, 10, 32].</w:t>
+        <w:t xml:space="preserve">An autonomous engineering-vehicle safety case should connect claims, arguments, evidence, assumptions and limitations. Beyond regulatory presentation, it gives product teams, site operators, maintenance teams, testing organizations and standardization groups a common evidence language [6, 10, 32].</w:t>
       </w:r>
     </w:p>
     <w:p>
@@ -3954,13 +3954,13 @@
     </w:p>
     <w:bookmarkEnd w:id="46"/>
     <w:bookmarkEnd w:id="47"/>
-    <w:bookmarkStart w:id="54" w:name="Xbf8cfe0e2e293a119f4f2e8f7f68287f69532ca"/>
+    <w:bookmarkStart w:id="54" w:name="Xdba2427f7339ecefe7561dafa42a6478ee60727"/>
     <w:p>
       <w:pPr>
         <w:pStyle w:val="Heading2"/>
       </w:pPr>
       <w:r>
-        <w:t xml:space="preserve">7. Representative scenarios: templates, not validation samples</w:t>
+        <w:t xml:space="preserve">7. Representative scenarios and framework application templates</w:t>
       </w:r>
     </w:p>
     <w:bookmarkStart w:id="48" w:name="evidence-principle"/>
@@ -3977,15 +3977,15 @@
         <w:pStyle w:val="FirstParagraph"/>
       </w:pPr>
       <w:r>
-        <w:t xml:space="preserve">The scenarios in this section are templates for applying the framework. They are not validation samples. Public company pages, product pages and annual reports can show that a product direction, scenario or function exists. They cannot prove independent safety certification, complete safety case, field maturity, customer acceptance, operating KPI, incident rate or long-term reliability. Peer-reviewed papers can support algorithms, experiments and research findings. They cannot prove commercial deployment maturity unless that evidence is directly present. Industry guidance can support assurance topics. It cannot replace site-specific operational evidence.</w:t>
-      </w:r>
-    </w:p>
-    <w:p>
-      <w:pPr>
-        <w:pStyle w:val="BodyText"/>
-      </w:pPr>
-      <w:r>
-        <w:t xml:space="preserve">This principle is important because autonomous engineering vehicles are moving quickly and public claims are often visually persuasive. A review paper should use public cases to anchor scenarios, then state what evidence would be needed for a defensible safety claim.</w:t>
+        <w:t xml:space="preserve">The scenarios in this section illustrate framework application and are not validation samples. Public company pages, product pages and annual reports can show that a product direction, scenario or function exists. They cannot prove independent safety certification, complete safety case, field maturity, customer acceptance, operating KPI, incident rate or long-term reliability. Peer-reviewed papers can support algorithms, experiments and research findings. They cannot prove commercial deployment maturity unless that evidence is directly present. Industry guidance can support assurance topics. It cannot replace site-specific operational evidence.</w:t>
+      </w:r>
+    </w:p>
+    <w:p>
+      <w:pPr>
+        <w:pStyle w:val="BodyText"/>
+      </w:pPr>
+      <w:r>
+        <w:t xml:space="preserve">This evidence principle constrains the interpretation of public cases. A review paper can use public cases to anchor scenarios while specifying the additional evidence needed for a defensible safety claim.</w:t>
       </w:r>
     </w:p>
     <w:bookmarkEnd w:id="48"/>
@@ -4139,13 +4139,13 @@
       </w:r>
     </w:p>
     <w:bookmarkEnd w:id="51"/>
-    <w:bookmarkStart w:id="52" w:name="X7bed00867bc5a07ee40e89cb08d2cdd69105950"/>
+    <w:bookmarkStart w:id="52" w:name="Xa5b9f492c638e6189449f6f8b23ccad38a45279"/>
     <w:p>
       <w:pPr>
         <w:pStyle w:val="Heading3"/>
       </w:pPr>
       <w:r>
-        <w:t xml:space="preserve">7.5 Autonomous haulage as a mature reference, not a universal evidence source</w:t>
+        <w:t xml:space="preserve">7.5 Reference value and applicability limits of autonomous haulage</w:t>
       </w:r>
     </w:p>
     <w:p>
@@ -4169,7 +4169,7 @@
         <w:pStyle w:val="BodyText"/>
       </w:pPr>
       <w:r>
-        <w:t xml:space="preserve">Its non-transferable limit is task specificity. Haulage does not solve bucket loading, trench-depth control, pile verticality, material-state recognition or work-tool quality assurance. It can serve as an assurance reference, not a universal validation sample.</w:t>
+        <w:t xml:space="preserve">Its non-transferable limit is task specificity. Haulage does not solve bucket loading, trench-depth control, pile verticality, material-state recognition or work-tool quality assurance. Its main value is as an assurance reference rather than a universal validation sample.</w:t>
       </w:r>
     </w:p>
     <w:p>
@@ -4195,7 +4195,7 @@
         <w:pStyle w:val="FirstParagraph"/>
       </w:pPr>
       <w:r>
-        <w:t xml:space="preserve">The next evidence step is not adding more public cases. It is converting selected public scenarios into anonymized and reviewable field samples. Each field sample should record:</w:t>
+        <w:t xml:space="preserve">The next evidence step is to convert selected public scenarios into anonymized and reviewable field samples, rather than to add more public cases. Each field sample should record:</w:t>
       </w:r>
     </w:p>
     <w:p>
@@ -4289,13 +4289,13 @@
         <w:t xml:space="preserve">8. Extreme-environment extension: lunar resource operations and space mining</w:t>
       </w:r>
     </w:p>
-    <w:bookmarkStart w:id="55" w:name="X47d77a1b9142c69d233ea0466c6e12fb4ca17d1"/>
+    <w:bookmarkStart w:id="55" w:name="rationale-for-including-space-mining"/>
     <w:p>
       <w:pPr>
         <w:pStyle w:val="Heading3"/>
       </w:pPr>
       <w:r>
-        <w:t xml:space="preserve">8.1 Why space mining belongs in the discussion</w:t>
+        <w:t xml:space="preserve">8.1 Rationale for including space mining</w:t>
       </w:r>
     </w:p>
     <w:p>
@@ -4303,7 +4303,7 @@
         <w:pStyle w:val="FirstParagraph"/>
       </w:pPr>
       <w:r>
-        <w:t xml:space="preserve">Lunar resource operations and space mining are not evidence for current terrestrial engineering-vehicle standards. They belong in the discussion because they stress-test the same conceptual structure. Space-resource work requires mobile machines to move, excavate, collect, transport, deposit, construct, inspect and maintain operations in uncertain terrain with limited human presence and strong remote-supervision constraints [48, 49, 50, 51, 52, 53].</w:t>
+        <w:t xml:space="preserve">Lunar resource operations and space mining do not constitute evidence for current terrestrial engineering-vehicle standards. They are included because they stress-test the same conceptual structure. Space-resource work requires mobile machines to move, excavate, collect, transport, deposit, construct, inspect and maintain operations in uncertain terrain with limited human presence and strong remote-supervision constraints [48, 49, 50, 51, 52, 53].</w:t>
       </w:r>
     </w:p>
     <w:p>
@@ -4399,7 +4399,7 @@
         <w:t xml:space="preserve"> </w:t>
       </w:r>
       <w:r>
-        <w:t xml:space="preserve">thesis, but it should not be used to claim that current terrestrial standards already cover space mining or that space-robotics prototypes validate terrestrial product safety.</w:t>
+        <w:t xml:space="preserve">thesis, but it cannot be used to claim that current terrestrial standards already cover space mining or that space-robotics prototypes validate terrestrial product safety.</w:t>
       </w:r>
     </w:p>
     <w:bookmarkEnd w:id="57"/>
@@ -4479,23 +4479,23 @@
         <w:pStyle w:val="FirstParagraph"/>
       </w:pPr>
       <w:r>
-        <w:t xml:space="preserve">For researchers, the next step is not only to develop better navigation or manipulation algorithms. It is to build WTDC and DMWT models, scenario libraries, simulation benchmarks, task-quality metrics, trigger-condition discovery methods and operational-data feedback loops. Loader, trenching, piling and haulage tasks should be used as distinct benchmarks because their risk chains are materially different.</w:t>
-      </w:r>
-    </w:p>
-    <w:p>
-      <w:pPr>
-        <w:pStyle w:val="BodyText"/>
-      </w:pPr>
-      <w:r>
-        <w:t xml:space="preserve">Recent excavation pretraining work also shows why research benchmarks should record not only task success, but also terrain, soil, attachment, machine configuration, fallback and post-update validation boundaries [59].</w:t>
-      </w:r>
-    </w:p>
-    <w:p>
-      <w:pPr>
-        <w:pStyle w:val="BodyText"/>
-      </w:pPr>
-      <w:r>
-        <w:t xml:space="preserve">For standardization groups and testing organizations, the most productive starting point is likely not a universal autonomous engineering-vehicle standard. A more practical route is task-specific testing and evaluation guidance: unmanned loader operation in batching plants or vessel holds, autonomous trenching for pipeline construction, autonomous solar piling and autonomous mine haulage. These guides can define WTDC layers, DMWT phases, scenario parameters, trigger conditions, evidence records and safety-case expectations.</w:t>
+        <w:t xml:space="preserve">For researchers, future work should extend beyond navigation and manipulation algorithms to WTDC and DMWT models, scenario libraries, simulation benchmarks, task-quality metrics, trigger-condition discovery methods and operational-data feedback loops. Loader, trenching, piling and haulage tasks should be used as distinct benchmarks because their risk chains are materially different.</w:t>
+      </w:r>
+    </w:p>
+    <w:p>
+      <w:pPr>
+        <w:pStyle w:val="BodyText"/>
+      </w:pPr>
+      <w:r>
+        <w:t xml:space="preserve">Recent excavation pretraining work also shows that research benchmarks should record task success together with terrain, soil, attachment, machine configuration, fallback and post-update validation boundaries [59].</w:t>
+      </w:r>
+    </w:p>
+    <w:p>
+      <w:pPr>
+        <w:pStyle w:val="BodyText"/>
+      </w:pPr>
+      <w:r>
+        <w:t xml:space="preserve">For standardization groups and testing organizations, a more operational starting point is task-specific testing and evaluation guidance, such as unmanned loader operation in batching plants or vessel holds, autonomous trenching for pipeline construction, autonomous solar piling and autonomous mine haulage. These guides can define WTDC layers, DMWT phases, scenario parameters, trigger conditions, evidence records and safety-case expectations.</w:t>
       </w:r>
     </w:p>
     <w:p>
@@ -4587,7 +4587,7 @@
         <w:pStyle w:val="FirstParagraph"/>
       </w:pPr>
       <w:r>
-        <w:t xml:space="preserve">Autonomous engineering vehicles should not be understood as low-speed automated cars. They are mobile working machine systems. Their safety assurance must cover movement, work equipment, material interaction, task quality, remote supervision, site organization, operational monitoring and change management.</w:t>
+        <w:t xml:space="preserve">Autonomous engineering vehicles should be understood as mobile working machine systems rather than low-speed automated cars. Their safety assurance must cover movement, work equipment, material interaction, task quality, remote supervision, site organization, operational monitoring and change management.</w:t>
       </w:r>
     </w:p>
     <w:p>
@@ -4603,7 +4603,7 @@
         <w:pStyle w:val="BodyText"/>
       </w:pPr>
       <w:r>
-        <w:t xml:space="preserve">The proposed MWMS, WTDC and DMWT concepts provide a practical bridge from safe driving to safe working. They allow researchers to deepen the problem, standardization groups to define task-specific evaluation guidance, and companies to build deployment evidence that goes beyond demonstrations. The central safety question is not whether an engineering vehicle can drive autonomously. It is whether the system can safely complete bounded work, keep its assumptions visible and update its evidence as the worksite changes.</w:t>
+        <w:t xml:space="preserve">The proposed MWMS, WTDC and DMWT concepts provide a practical bridge from safe driving to safe working. They allow researchers to deepen the problem, standardization groups to define task-specific evaluation guidance, and companies to build deployment evidence that goes beyond demonstrations. The central safety question is whether the system can safely complete bounded work, keep its assumptions visible and update its evidence as the worksite changes.</w:t>
       </w:r>
     </w:p>
     <w:bookmarkEnd w:id="63"/>

</xml_diff>